<commit_message>
feat: add risk-matched benchmark and regression CI
</commit_message>
<xml_diff>
--- a/TX_flow_trend_report.docx
+++ b/TX_flow_trend_report.docx
@@ -1643,7 +1643,106 @@
         <w:pStyle w:val="Heading1"/>
       </w:pPr>
       <w:r>
-        <w:t>5　資金曲線與回撤深度疊圖</w:t>
+        <w:t>5　資金曲線、回撤與風險配平診斷</w:t>
+      </w:r>
+    </w:p>
+    <w:tbl>
+      <w:tblPr>
+        <w:tblW w:type="auto" w:w="0"/>
+        <w:tblLook w:firstColumn="1" w:firstRow="1" w:lastColumn="0" w:lastRow="0" w:noHBand="0" w:noVBand="1" w:val="04A0"/>
+      </w:tblPr>
+      <w:tblGrid>
+        <w:gridCol w:w="5156"/>
+        <w:gridCol w:w="5156"/>
+      </w:tblGrid>
+      <w:tr>
+        <w:tc>
+          <w:tcPr>
+            <w:tcW w:type="dxa" w:w="5156"/>
+          </w:tcPr>
+          <w:p>
+            <w:r>
+              <w:drawing>
+                <wp:inline xmlns:a="http://schemas.openxmlformats.org/drawingml/2006/main" xmlns:pic="http://schemas.openxmlformats.org/drawingml/2006/picture">
+                  <wp:extent cx="2916000" cy="1163298"/>
+                  <wp:docPr id="1" name="Picture 1"/>
+                  <wp:cNvGraphicFramePr>
+                    <a:graphicFrameLocks noChangeAspect="1"/>
+                  </wp:cNvGraphicFramePr>
+                  <a:graphic>
+                    <a:graphicData uri="http://schemas.openxmlformats.org/drawingml/2006/picture">
+                      <pic:pic>
+                        <pic:nvPicPr>
+                          <pic:cNvPr id="0" name="equity_comparison.png"/>
+                          <pic:cNvPicPr/>
+                        </pic:nvPicPr>
+                        <pic:blipFill>
+                          <a:blip r:embed="rId9"/>
+                          <a:stretch>
+                            <a:fillRect/>
+                          </a:stretch>
+                        </pic:blipFill>
+                        <pic:spPr>
+                          <a:xfrm>
+                            <a:off x="0" y="0"/>
+                            <a:ext cx="2916000" cy="1163298"/>
+                          </a:xfrm>
+                          <a:prstGeom prst="rect"/>
+                        </pic:spPr>
+                      </pic:pic>
+                    </a:graphicData>
+                  </a:graphic>
+                </wp:inline>
+              </w:drawing>
+            </w:r>
+          </w:p>
+        </w:tc>
+        <w:tc>
+          <w:tcPr>
+            <w:tcW w:type="dxa" w:w="5156"/>
+          </w:tcPr>
+          <w:p>
+            <w:r>
+              <w:drawing>
+                <wp:inline xmlns:a="http://schemas.openxmlformats.org/drawingml/2006/main" xmlns:pic="http://schemas.openxmlformats.org/drawingml/2006/picture">
+                  <wp:extent cx="2916000" cy="1163298"/>
+                  <wp:docPr id="2" name="Picture 2"/>
+                  <wp:cNvGraphicFramePr>
+                    <a:graphicFrameLocks noChangeAspect="1"/>
+                  </wp:cNvGraphicFramePr>
+                  <a:graphic>
+                    <a:graphicData uri="http://schemas.openxmlformats.org/drawingml/2006/picture">
+                      <pic:pic>
+                        <pic:nvPicPr>
+                          <pic:cNvPr id="0" name="equity_comparison_log.png"/>
+                          <pic:cNvPicPr/>
+                        </pic:nvPicPr>
+                        <pic:blipFill>
+                          <a:blip r:embed="rId10"/>
+                          <a:stretch>
+                            <a:fillRect/>
+                          </a:stretch>
+                        </pic:blipFill>
+                        <pic:spPr>
+                          <a:xfrm>
+                            <a:off x="0" y="0"/>
+                            <a:ext cx="2916000" cy="1163298"/>
+                          </a:xfrm>
+                          <a:prstGeom prst="rect"/>
+                        </pic:spPr>
+                      </pic:pic>
+                    </a:graphicData>
+                  </a:graphic>
+                </wp:inline>
+              </w:drawing>
+            </w:r>
+          </w:p>
+        </w:tc>
+      </w:tr>
+    </w:tbl>
+    <w:p>
+      <w:r>
+        <w:t>圖一：左為線性Y軸、右為對數Y軸。兩者皆自1,000萬元起始並扣除所有成交與轉倉成本；log-y版本只改變視覺尺度，不改變任何報酬或風險計算。</w:t>
       </w:r>
     </w:p>
     <w:p>
@@ -1651,7 +1750,7 @@
         <w:drawing>
           <wp:inline xmlns:a="http://schemas.openxmlformats.org/drawingml/2006/main" xmlns:pic="http://schemas.openxmlformats.org/drawingml/2006/picture">
             <wp:extent cx="6120000" cy="2441489"/>
-            <wp:docPr id="1" name="Picture 1"/>
+            <wp:docPr id="3" name="Picture 3"/>
             <wp:cNvGraphicFramePr>
               <a:graphicFrameLocks noChangeAspect="1"/>
             </wp:cNvGraphicFramePr>
@@ -1659,11 +1758,11 @@
               <a:graphicData uri="http://schemas.openxmlformats.org/drawingml/2006/picture">
                 <pic:pic>
                   <pic:nvPicPr>
-                    <pic:cNvPr id="0" name="equity_comparison.png"/>
+                    <pic:cNvPr id="0" name="underwater_comparison.png"/>
                     <pic:cNvPicPr/>
                   </pic:nvPicPr>
                   <pic:blipFill>
-                    <a:blip r:embed="rId9"/>
+                    <a:blip r:embed="rId11"/>
                     <a:stretch>
                       <a:fillRect/>
                     </a:stretch>
@@ -1684,63 +1783,258 @@
     </w:p>
     <w:p>
       <w:r>
-        <w:t>圖一：2018/08/31～2026/10/05，兩者皆自1,000萬元起始，扣除所有成交及轉倉成本。策略期末1,327.75萬元，基準1,826.84萬元；策略較平穩，但捕捉的絕對收益較少。</w:t>
+        <w:t>圖二：日末權益相對含初始本金的歷史高點回撤。策略MDD 3.93%，基準11.12%；策略回撤較淺，但固定一口比較同時含有不同市場曝險。</w:t>
       </w:r>
     </w:p>
     <w:p>
       <w:r>
-        <w:drawing>
-          <wp:inline xmlns:a="http://schemas.openxmlformats.org/drawingml/2006/main" xmlns:pic="http://schemas.openxmlformats.org/drawingml/2006/picture">
-            <wp:extent cx="6120000" cy="2441489"/>
-            <wp:docPr id="2" name="Picture 2"/>
-            <wp:cNvGraphicFramePr>
-              <a:graphicFrameLocks noChangeAspect="1"/>
-            </wp:cNvGraphicFramePr>
-            <a:graphic>
-              <a:graphicData uri="http://schemas.openxmlformats.org/drawingml/2006/picture">
-                <pic:pic>
-                  <pic:nvPicPr>
-                    <pic:cNvPr id="0" name="underwater_comparison.png"/>
-                    <pic:cNvPicPr/>
-                  </pic:nvPicPr>
-                  <pic:blipFill>
-                    <a:blip r:embed="rId10"/>
-                    <a:stretch>
-                      <a:fillRect/>
-                    </a:stretch>
-                  </pic:blipFill>
-                  <pic:spPr>
-                    <a:xfrm>
-                      <a:off x="0" y="0"/>
-                      <a:ext cx="6120000" cy="2441489"/>
-                    </a:xfrm>
-                    <a:prstGeom prst="rect"/>
-                  </pic:spPr>
-                </pic:pic>
-              </a:graphicData>
-            </a:graphic>
-          </wp:inline>
-        </w:drawing>
+        <w:t>事後波動配平診斷（不可直接交易）</w:t>
+      </w:r>
+    </w:p>
+    <w:tbl>
+      <w:tblPr>
+        <w:tblStyle w:val="TableGrid"/>
+        <w:tblW w:type="auto" w:w="0"/>
+        <w:tblLook w:firstColumn="1" w:firstRow="1" w:lastColumn="0" w:lastRow="0" w:noHBand="0" w:noVBand="1" w:val="04A0"/>
+      </w:tblPr>
+      <w:tblGrid>
+        <w:gridCol w:w="3437"/>
+        <w:gridCol w:w="3437"/>
+        <w:gridCol w:w="3437"/>
+      </w:tblGrid>
+      <w:tr>
+        <w:tc>
+          <w:tcPr>
+            <w:tcW w:type="dxa" w:w="3437"/>
+          </w:tcPr>
+          <w:p>
+            <w:r>
+              <w:t>指標</w:t>
+            </w:r>
+          </w:p>
+        </w:tc>
+        <w:tc>
+          <w:tcPr>
+            <w:tcW w:type="dxa" w:w="3437"/>
+          </w:tcPr>
+          <w:p>
+            <w:r>
+              <w:t>固定一口基準</w:t>
+            </w:r>
+          </w:p>
+        </w:tc>
+        <w:tc>
+          <w:tcPr>
+            <w:tcW w:type="dxa" w:w="3437"/>
+          </w:tcPr>
+          <w:p>
+            <w:r>
+              <w:t>波動配平診斷</w:t>
+            </w:r>
+          </w:p>
+        </w:tc>
+      </w:tr>
+      <w:tr>
+        <w:tc>
+          <w:tcPr>
+            <w:tcW w:type="dxa" w:w="3437"/>
+          </w:tcPr>
+          <w:p>
+            <w:r>
+              <w:t>TX-equivalent</w:t>
+            </w:r>
+          </w:p>
+        </w:tc>
+        <w:tc>
+          <w:tcPr>
+            <w:tcW w:type="dxa" w:w="3437"/>
+          </w:tcPr>
+          <w:p>
+            <w:r>
+              <w:t>1.000</w:t>
+            </w:r>
+          </w:p>
+        </w:tc>
+        <w:tc>
+          <w:tcPr>
+            <w:tcW w:type="dxa" w:w="3437"/>
+          </w:tcPr>
+          <w:p>
+            <w:r>
+              <w:t>0.315</w:t>
+            </w:r>
+          </w:p>
+        </w:tc>
+      </w:tr>
+      <w:tr>
+        <w:tc>
+          <w:tcPr>
+            <w:tcW w:type="dxa" w:w="3437"/>
+          </w:tcPr>
+          <w:p>
+            <w:r>
+              <w:t>年化波動</w:t>
+            </w:r>
+          </w:p>
+        </w:tc>
+        <w:tc>
+          <w:tcPr>
+            <w:tcW w:type="dxa" w:w="3437"/>
+          </w:tcPr>
+          <w:p>
+            <w:r>
+              <w:t>7.20%</w:t>
+            </w:r>
+          </w:p>
+        </w:tc>
+        <w:tc>
+          <w:tcPr>
+            <w:tcW w:type="dxa" w:w="3437"/>
+          </w:tcPr>
+          <w:p>
+            <w:r>
+              <w:t>2.82%</w:t>
+            </w:r>
+          </w:p>
+        </w:tc>
+      </w:tr>
+      <w:tr>
+        <w:tc>
+          <w:tcPr>
+            <w:tcW w:type="dxa" w:w="3437"/>
+          </w:tcPr>
+          <w:p>
+            <w:r>
+              <w:t>CAGR</w:t>
+            </w:r>
+          </w:p>
+        </w:tc>
+        <w:tc>
+          <w:tcPr>
+            <w:tcW w:type="dxa" w:w="3437"/>
+          </w:tcPr>
+          <w:p>
+            <w:r>
+              <w:t>7.72%</w:t>
+            </w:r>
+          </w:p>
+        </w:tc>
+        <w:tc>
+          <w:tcPr>
+            <w:tcW w:type="dxa" w:w="3437"/>
+          </w:tcPr>
+          <w:p>
+            <w:r>
+              <w:t>2.90%</w:t>
+            </w:r>
+          </w:p>
+        </w:tc>
+      </w:tr>
+      <w:tr>
+        <w:tc>
+          <w:tcPr>
+            <w:tcW w:type="dxa" w:w="3437"/>
+          </w:tcPr>
+          <w:p>
+            <w:r>
+              <w:t>Sharpe</w:t>
+            </w:r>
+          </w:p>
+        </w:tc>
+        <w:tc>
+          <w:tcPr>
+            <w:tcW w:type="dxa" w:w="3437"/>
+          </w:tcPr>
+          <w:p>
+            <w:r>
+              <w:t>1.108</w:t>
+            </w:r>
+          </w:p>
+        </w:tc>
+        <w:tc>
+          <w:tcPr>
+            <w:tcW w:type="dxa" w:w="3437"/>
+          </w:tcPr>
+          <w:p>
+            <w:r>
+              <w:t>1.066</w:t>
+            </w:r>
+          </w:p>
+        </w:tc>
+      </w:tr>
+      <w:tr>
+        <w:tc>
+          <w:tcPr>
+            <w:tcW w:type="dxa" w:w="3437"/>
+          </w:tcPr>
+          <w:p>
+            <w:r>
+              <w:t>MDD</w:t>
+            </w:r>
+          </w:p>
+        </w:tc>
+        <w:tc>
+          <w:tcPr>
+            <w:tcW w:type="dxa" w:w="3437"/>
+          </w:tcPr>
+          <w:p>
+            <w:r>
+              <w:t>11.12%</w:t>
+            </w:r>
+          </w:p>
+        </w:tc>
+        <w:tc>
+          <w:tcPr>
+            <w:tcW w:type="dxa" w:w="3437"/>
+          </w:tcPr>
+          <w:p>
+            <w:r>
+              <w:t>4.25%</w:t>
+            </w:r>
+          </w:p>
+        </w:tc>
+      </w:tr>
+      <w:tr>
+        <w:tc>
+          <w:tcPr>
+            <w:tcW w:type="dxa" w:w="3437"/>
+          </w:tcPr>
+          <w:p>
+            <w:r>
+              <w:t>Calmar</w:t>
+            </w:r>
+          </w:p>
+        </w:tc>
+        <w:tc>
+          <w:tcPr>
+            <w:tcW w:type="dxa" w:w="3437"/>
+          </w:tcPr>
+          <w:p>
+            <w:r>
+              <w:t>0.694</w:t>
+            </w:r>
+          </w:p>
+        </w:tc>
+        <w:tc>
+          <w:tcPr>
+            <w:tcW w:type="dxa" w:w="3437"/>
+          </w:tcPr>
+          <w:p>
+            <w:r>
+              <w:t>0.682</w:t>
+            </w:r>
+          </w:p>
+        </w:tc>
+      </w:tr>
+    </w:tbl>
+    <w:p>
+      <w:r>
+        <w:t>配平係數以完整樣本事後求得，使基準年化波動由7.20%降至策略的2.82%；結果約為0.315口TX-equivalent。基準毛損益、手續費、稅與滑價成本都按同一比例縮放，因此只是風險比較診斷，不代表可實際下單的整口TX策略。</w:t>
       </w:r>
     </w:p>
     <w:p>
       <w:r>
-        <w:t>圖二：日末權益相對含初始本金的歷史高點回撤。策略MDD 3.93%，基準11.12%；策略最長回撤482交易日／722日曆日，基準366／555。回撤較淺，但等待恢復的時間更長。</w:t>
-      </w:r>
-    </w:p>
-    <w:p>
-      <w:r>
-        <w:t>讀圖與風險口徑</w:t>
-      </w:r>
-    </w:p>
-    <w:p>
-      <w:r>
-        <w:t>策略最大比例回撤發生於2022/06/14，最大金額回撤發生於2026/07/08；兩者獨立取最大值。固定一口不隨獲利加碼，日末隔夜留倉658日，約占共同期間33.43%。退出日開盤前仍有持倉，不能把日末空手當作全天無曝險。</w:t>
-      </w:r>
-    </w:p>
-    <w:p>
-      <w:r>
-        <w:t>圖表沒有盤中及夜盤評價，無法顯示最壞的瞬時損失、完整保證金需求或精確強平風險。完整逐日、成交與契約月份轉換附在工作簿。</w:t>
+        <w:t>固定一口仍是主結果，因為它可直接對應實際合約；波動配平只用來避免把策略較低MDD完全誤解為訊號本身的優勢。圖表也沒有盤中及夜盤評價，不能代表最壞瞬時損失或精確保證金風險。</w:t>
       </w:r>
     </w:p>
     <w:p>

</xml_diff>

<commit_message>
docs: publish formal backtest report
</commit_message>
<xml_diff>
--- a/TX_flow_trend_report.docx
+++ b/TX_flow_trend_report.docx
@@ -91,7 +91,7 @@
           </w:tcPr>
           <w:p>
             <w:r>
-              <w:t>FinMind TX歷史資料＋使用者提供之TAIFEX格式原檔；2018/06/05～2026/10/05，2,030日、6,090筆三類法人資料。</w:t>
+              <w:t>FinMind TX歷史資料與TAIFEX格式原始資料；2018/06/05～2026/10/05，2,030日、6,090筆三類法人資料。</w:t>
             </w:r>
           </w:p>
         </w:tc>
@@ -143,12 +143,12 @@
     </w:tbl>
     <w:p>
       <w:r>
-        <w:t>較新期間以使用者原檔優先，避免資料供應商舊值差異；三類法人日期均與行情交易日曆一致。未刪除結算日，未混入MTX、週契約、夜盤或價差交易。原始月契約179筆OHLC缺價紀錄仍保留，但策略及基準實際使用的進出、轉倉與評價價格均完整。</w:t>
+        <w:t>較新期間以TAIFEX格式原始資料優先，以降低不同資料來源歷史值差異造成的影響；三類法人日期均與行情交易日曆一致。資料未混入MTX、週契約、夜盤或價差交易。原始月契約共有179筆OHLC缺值紀錄，但策略及基準實際使用的進出、轉倉與評價價格均完整。</w:t>
       </w:r>
     </w:p>
     <w:p>
       <w:r>
-        <w:t>本策略是先前18個簡單候選中選出的版本，主報告固定這個規則後重跑。結果屬全樣本探索，沒有獨立、未接觸的樣本外測試；全部候選及選擇紀錄隨附件保存。</w:t>
+        <w:t>本策略由18個候選規則中篩選後固定參數重新回測，因此結果屬探索性全樣本分析，尚未以完全未參與策略選擇的資料進行獨立樣本外驗證。此限制在後續結論中另行討論。</w:t>
       </w:r>
     </w:p>
     <w:p>
@@ -568,7 +568,7 @@
           </w:tcPr>
           <w:p>
             <w:r>
-              <w:t>現金利息及rf=0；Sharpe採252日；CAGR依實际起訖含首尾日／365.25。</w:t>
+              <w:t>現金利息及rf=0；Sharpe採252日；CAGR依實際起訖含首尾日／365.25。</w:t>
             </w:r>
           </w:p>
         </w:tc>
@@ -1788,7 +1788,7 @@
     </w:p>
     <w:p>
       <w:r>
-        <w:t>事後波動配平診斷（不可直接交易）</w:t>
+        <w:t>波動配平診斷（事後分析）</w:t>
       </w:r>
     </w:p>
     <w:tbl>
@@ -2029,7 +2029,7 @@
     </w:tbl>
     <w:p>
       <w:r>
-        <w:t>配平係數以完整樣本事後求得，使基準年化波動由7.20%降至策略的2.82%；結果約為0.315口TX-equivalent。基準毛損益、手續費、稅與滑價成本都按同一比例縮放，因此只是風險比較診斷，不代表可實際下單的整口TX策略。</w:t>
+        <w:t>配平係數以完整樣本事後估計，使基準年化波動由7.20%調整至策略的2.82%；所得曝險約為0.315口TX-equivalent。基準毛損益、手續費、稅與滑價成本均按相同比例縮放，因此此結果僅用於同風險尺度比較，不代表可直接執行的整口TX交易策略。</w:t>
       </w:r>
     </w:p>
     <w:p>
@@ -2498,52 +2498,52 @@
         <w:pStyle w:val="Heading1"/>
       </w:pPr>
       <w:r>
-        <w:t>7　策略心得：機制與脆弱環境</w:t>
+        <w:t>7　風險來源與策略限制</w:t>
       </w:r>
     </w:p>
     <w:p>
       <w:r>
-        <w:t>一、真正使用的是成交流量，不是法人留倉意圖</w:t>
+        <w:t>一、法人交易指標的解釋限制</w:t>
       </w:r>
     </w:p>
     <w:p>
       <w:r>
-        <w:t>這次策略的改善讓我重新區分「當日買賣活動」與「收盤後仍持有的部位」。交易強度用淨成交口數衡量買方壓力，不把契約金額的價格變動混入分子；用多空總口數作分母，也能避免直接比較不同交易熱度下的原始口數。然而三類法人交易內含方向投資、股票及選擇權避險、套利與造市，公開合計不能識別每個機構的動機。[2]</w:t>
+        <w:t>本研究的交易強度衡量三大法人的當日淨成交流量，而非收盤後仍持有的未平倉部位。以多空交易總口數作為分母，可降低不同交易活躍程度對原始淨口數的影響；然而三類法人交易同時可能包含方向投資、股票與選擇權避險、套利及造市活動，因此公開彙總資料無法識別各機構的實際交易動機。[2]</w:t>
       </w:r>
     </w:p>
     <w:p>
       <w:r>
-        <w:t>20日平均把單日波動變成較持續的狀態，再要求價格高於20日均線。此設計容易說明，也能以固定規則驗證。但回測中Sharpe較高，只證明這組條件在目前資料上的歷史表現；尤其所有策略都採多單／空手，收益也包含長期多頭及隔夜報酬，不能把成果全部歸因於法人擁有更好的資訊。</w:t>
+        <w:t>20日平均用於降低單日成交流量雜訊，再以價格高於20日均線作為趨勢確認。回測中較高的Sharpe僅代表此規則在目前樣本中的歷史風險調整績效；由於策略採多單／空手架構，績效同時受到長期多頭趨勢與隔夜報酬影響，不能將全部成果歸因於法人資訊優勢。</w:t>
       </w:r>
     </w:p>
     <w:p>
       <w:r>
-        <w:t>二、盤整反覆穿越：訊號可能慢，也可能太常變動</w:t>
+        <w:t>二、盤整與快速反轉環境</w:t>
       </w:r>
     </w:p>
     <w:p>
       <w:r>
-        <w:t>在盤整、急漲急跌或V形反轉環境，20日平均會滯後，價格則可能在MA20附近反覆穿越。條件暫時消失便要退出，再成立又進場，形成追高、較低位置退出或漏接快速反彈。2024年就是有用的反例：基準仍賺錢，本策略卻小虧。這提醒我，兩個條件一致並不等於每段上升行情都能被捕捉。</w:t>
+        <w:t>在盤整、急漲急跌或V形反轉環境中，20日平均具有滯後性，價格亦可能在MA20附近反覆穿越。當條件短暫失效後退出、再度成立後重新進場，可能造成追價、較低價格退出或錯失快速反彈。2024年基準為正報酬而策略為負，即顯示雙條件一致並不代表能捕捉所有上升行情。</w:t>
       </w:r>
     </w:p>
     <w:p>
       <w:r>
-        <w:t>對於停損，我沒有因為回測曾出現單筆大虧，就事後挑一個能避開那筆交易的點數。現在資料只有日盤OHLC，沒有完整夜盤路徑、委託排隊與極端時刻成交資料；先維持訊號消退及期末清算的明確出場，比加入無法可靠執行的停損假設更容易核對。</w:t>
+        <w:t>本回測未加入事後最佳化的固定點數停損。現有資料僅含日盤OHLC，缺乏完整夜盤價格路徑、委託排隊及極端行情成交資訊，因此若加入盤中觸價停損，將引入無法可靠驗證的成交假設。基準版本僅依訊號消退、轉倉與期末清算執行出場。</w:t>
       </w:r>
     </w:p>
     <w:p>
       <w:r>
-        <w:t>三、國際黑天鵝與跳空：跨日持有的實際代價</w:t>
+        <w:t>三、隔夜跳空與流動性風險</w:t>
       </w:r>
     </w:p>
     <w:p>
       <w:r>
-        <w:t>Gemini指引要求檢討大外盤事件跳空。本版與日內策略不同，真的持有隔夜部位。訊號公布後，海外市場、匯率與突發事件可能改變行情；即使隔日日盤開盤已排定退出，仍必須承受前一日收盤至開盤的價差。若開盤流動性差，實際退出損失可能高於2點滑價假設。</w:t>
+        <w:t>本策略實際持有隔夜部位，因此海外市場、匯率與突發事件可能在臺指期日盤重新開市前改變價格。即使隔日日盤開盤已產生退出需求，仍須承受前一日收盤至下一交易日開盤的跳空風險；若開盤流動性不足，實際成交損失亦可能高於固定2點滑價假設。</w:t>
       </w:r>
     </w:p>
     <w:p>
       <w:r>
-        <w:t>因此3.93%的日末MDD不能被解讀成單筆最大可承受損失。較保守本金與完整名目價值限制降低了槓桿問題，卻不能消除跳空風險。本次曲線未觀察夜盤及盤中瞬時低點；未來若要實際執行，需先驗證夜盤風險及開盤成交品質，而不是只看日末Sharpe。</w:t>
+        <w:t>因此3.93%的日末MDD不應解讀為單筆交易或盤中可能遭受的最大損失。完整名目價值資金限制降低了槓桿造成的風險，但無法消除跳空與流動性風險；若進一步評估實際交易可行性，仍需納入夜盤價格、盤中極端波動與開盤成交品質。</w:t>
       </w:r>
     </w:p>
     <w:p>
@@ -2556,67 +2556,65 @@
         <w:pStyle w:val="Heading1"/>
       </w:pPr>
       <w:r>
-        <w:t>8　策略心得：比較與最終判斷</w:t>
+        <w:t>8　結論與後續驗證</w:t>
       </w:r>
     </w:p>
     <w:p>
       <w:r>
-        <w:t>四、較高Sharpe與較低收益，需要放在同一張圖解讀</w:t>
+        <w:t>一、績效結論</w:t>
       </w:r>
     </w:p>
     <w:p>
       <w:r>
-        <w:t>本次策略Sharpe 1.302、Calmar 0.906，高於基準1.108、0.694，MDD也由11.12%降至3.93%；但累積收益只有32.78%，低於基準82.68%。這是風險效率的改善，不是所有績效指標都領先。較多空手時間犧牲了多頭行情收益，也減少了市場下跌時的持倉。</w:t>
+        <w:t>策略Sharpe為1.302、Calmar為0.906，高於固定一口Buy-and-Hold基準的1.108與0.694，MDD亦由11.12%降至3.93%；但策略累積報酬32.78%，低於基準82.68%。因此主要優勢體現在歷史風險效率與回撤控制，而非絕對收益。較低市場曝險同時降低下跌風險，也犧牲部分多頭行情的收益。</w:t>
       </w:r>
     </w:p>
     <w:p>
       <w:r>
-        <w:t>另一個容易被忽略的成本是等待恢復。策略最長回撤482個交易日，比基準366日更久，即使回撤不深，資金停滯仍可能使執行者懷疑規則。勝率約51.70%而PF約2.197，說明本版不靠很高的勝率，而是仰賴部分延續行情中的較大獲利；前五筆與最近兩年的貢獻，也讓我重視成果集中及持續性。</w:t>
+        <w:t>策略最長回撤期間為482個交易日，高於基準的366日，顯示較低回撤幅度不等同於較短的資金恢復時間。勝率約51.70%、Profit Factor約2.197，績效並非依賴高勝率，而較依賴部分趨勢延續期間的較大獲利；前五筆交易與近兩年績效占比較高，亦顯示成果存在集中性。</w:t>
       </w:r>
     </w:p>
     <w:p>
       <w:r>
-        <w:t>五、選擇偏誤必須揭露，後續驗證不能再挑最佳規則</w:t>
+        <w:t>二、樣本選擇偏誤與驗證要求</w:t>
       </w:r>
     </w:p>
     <w:p>
       <w:r>
-        <w:t>這個版本來自先前18個候選比較，並非完全未看資料就訂好的策略。即使滑價加倍仍有正成果、兩段時間分組也都為正，這些資料仍曾被使用或觀察，因此不能改稱獨立樣本外驗證。完整揭露所有候選，是讓讀者知道目前的高Sharpe含有挑選效果。</w:t>
+        <w:t>本版本由18個候選規則比較後選出，並非在完全未觀察資料的情況下事先固定。因此，即使滑價敏感度與時間分組結果仍為正，也不能視為獨立樣本外證據。目前的Sharpe可能包含策略挑選造成的選擇偏誤，應在解讀績效時明確納入。</w:t>
       </w:r>
     </w:p>
     <w:p>
       <w:r>
-        <w:t>後續應先凍結20日交易強度、20日價格均線、零門檻及成本，再以真正未參與設計的新資料檢驗。若要測結算日排除、均線調整或停損，應預先列出少量假說並報告全部結果。先補較早缺失籌碼、核對歷史修訂與公布時點，也比再增加一批參數更能提升可信度。</w:t>
+        <w:t>後續驗證應先凍結20日交易強度、20日價格均線、零門檻及成本假設，再以未參與策略設計的新資料進行樣本外檢驗。若進一步測試結算日排除、均線參數或停損規則，應事前限定假說與參數範圍，並完整報告所有結果，以降低多重嘗試造成的偏誤。</w:t>
       </w:r>
     </w:p>
     <w:p>
       <w:r>
-        <w:t>最終判斷：這個策略比先前日內異常籌碼版本更值得保留為研究候選，規則簡單、收益成本可追溯，也具較好的歷史風險效率。但現有結果仍不足以宣稱樣本外優勢或穩定超額收益。本作業的價值，是把籌碼直覺、真實執行、完整成本及失效環境連成可重現的檢驗。</w:t>
+        <w:t>綜合而言，法人交易強度與價格趨勢的雙條件策略具有規則簡單、交易邏輯可追溯及歷史風險效率較佳等特性，可作為後續研究候選。然而，現有證據不足以宣稱其具有穩定的樣本外超額報酬。若要提高結論可信度，應優先完成獨立樣本外驗證、夜盤與盤中風險評估，以及資料發布時點與歷史修訂的一致性檢查。</w:t>
       </w:r>
     </w:p>
     <w:p>
       <w:r>
-        <w:t>來源、附件與計算口徑</w:t>
+        <w:t>三、資料來源與計算口徑</w:t>
       </w:r>
     </w:p>
     <w:p>
       <w:r>
-        <w:t>[1] TAIFEX TX規格：https://www.taifex.com.tw/cht/2/tX</w:t>
+        <w:t>[1] 臺灣期貨交易所，臺股期貨契約規格：https://www.taifex.com.tw/cht/2/tX</w:t>
         <w:br/>
-        <w:t>[2] 三法人定義：https://www.taifex.com.tw/cht/3/futContractsDateView</w:t>
+        <w:t>[2] 臺灣期貨交易所，三大法人交易資訊：https://www.taifex.com.tw/cht/3/futContractsDateView</w:t>
         <w:br/>
-        <w:t>[3] 費率：https://www.taifex.com.tw/cht/4/feeSchedules</w:t>
+        <w:t>[3] 臺灣期貨交易所，費率表：https://www.taifex.com.tw/cht/4/feeSchedules</w:t>
         <w:br/>
-        <w:t>行情：https://www.taifex.com.tw/cht/3/dlFutDailyMarketView</w:t>
+        <w:t>歷史行情：https://www.taifex.com.tw/cht/3/dlFutDailyMarketView</w:t>
         <w:br/>
         <w:t>FinMind：https://finmind.github.io/tutor/TaiwanMarket/Derivative/</w:t>
-        <w:br/>
-        <w:t>查核日：2026/10/07（臺北）；報告結構依使用者Gemini作業指引。</w:t>
       </w:r>
     </w:p>
     <w:p>
       <w:r>
-        <w:t>Sharpe=日報酬平均／樣本標準差×√252；Calmar=CAGR／MDD比例。PDF為8頁，Word可編輯。兩支Python程式已實際執行；工作簿與CSV含全部訊號、成交、轉倉、損益、年度及診斷。README載明重現步驟、來源與限制。</w:t>
+        <w:t>Sharpe＝日報酬平均／日報酬樣本標準差×√252；Calmar＝CAGR／最大回撤比例。所有績效指標均依相同初始資金、交易期間與成本假設計算；波動配平結果僅作風險尺度診斷，不列為主要可執行基準。</w:t>
       </w:r>
     </w:p>
     <w:sectPr>

</xml_diff>

<commit_message>
Audit input provenance, roll signals, and flow attribution
</commit_message>
<xml_diff>
--- a/TX_flow_trend_report.docx
+++ b/TX_flow_trend_report.docx
@@ -69,7 +69,7 @@
           </w:tcPr>
           <w:p>
             <w:r>
-              <w:t>TAIFEX年度ZIP及2026年月檔；2016/10/05～2026/10/05，2,438日、14,202筆實際月契約、126個契約。僅保留一般交易時段、六碼月契約。</w:t>
+              <w:t>TAIFEX年度ZIP及月檔；2016/10/05～2026/10/05，2,438日、14,202筆實際月契約、126個契約。僅保留一般交易時段、六碼月契約。</w:t>
             </w:r>
           </w:p>
         </w:tc>
@@ -113,7 +113,7 @@
           </w:tcPr>
           <w:p>
             <w:r>
-              <w:t>2018/08/31～2026/10/05，共1,968日，約8.1年。沿用前版共同起點，以便比較；本策略本身需要20日暖身。</w:t>
+              <w:t>2018-08-31～2026-10-05，共1,968日。沿用前版共同起點，以便比較；本策略本身需要20日暖身。</w:t>
             </w:r>
           </w:p>
         </w:tc>
@@ -135,7 +135,7 @@
           </w:tcPr>
           <w:p>
             <w:r>
-              <w:t>2016/10/05～2018/06/04缺408日籌碼，未補造。較早官方交易金額淨額空白，但本策略只用完整的交易口數。</w:t>
+              <w:t>行情與法人資料起點不同；法人資料前的408個行情交易日未補造籌碼。較早官方交易金額淨額空白，但本策略只用完整的交易口數。</w:t>
             </w:r>
           </w:p>
         </w:tc>
@@ -153,7 +153,7 @@
     </w:p>
     <w:p>
       <w:r>
-        <w:t>主要結果：策略報酬32.78%、Sharpe 1.302、MDD 3.93%；基準報酬82.68%、Sharpe 1.108、MDD 11.12%。策略風險調整報酬較高，絕對收益較低。</w:t>
+        <w:t>主要結果：策略報酬32.78%、Sharpe 1.302、MDD 3.93%；基準報酬82.68%、Sharpe 1.108、MDD 11.12%。兩者曝險不同，須搭配風險配平結果解讀。</w:t>
       </w:r>
     </w:p>
     <w:p>
@@ -436,7 +436,7 @@
           </w:tcPr>
           <w:p>
             <w:r>
-              <w:t>本金1,000萬元；固定一口、不加碼；每點200元。</w:t>
+              <w:t>本金10,000,000元；固定一口、不加碼；每點200元。</w:t>
             </w:r>
           </w:p>
         </w:tc>
@@ -480,7 +480,7 @@
           </w:tcPr>
           <w:p>
             <w:r>
-              <w:t>每次成交2點：買進價+2、賣出價−2。初始進出、轉倉與期末平倉皆計。</w:t>
+              <w:t>每次成交2點：買進價+滑價、賣出價−滑價。初始進出、轉倉與期末平倉皆計。</w:t>
             </w:r>
           </w:p>
         </w:tc>
@@ -502,7 +502,7 @@
           </w:tcPr>
           <w:p>
             <w:r>
-              <w:t>每邊按含滑價成交價×200×0.00002。連續金額近似，未逐筆取整。[3]</w:t>
+              <w:t>每邊按含滑價成交價×200×2e-05。連續金額近似，未逐筆取整。[3]</w:t>
             </w:r>
           </w:p>
         </w:tc>
@@ -1630,7 +1630,7 @@
     </w:tbl>
     <w:p>
       <w:r>
-        <w:t>2018、2026為部分年度；年度報酬未年化，以該年首日損益前權益為分母。PF=淨正損益合計／淨負損益絕對值合計。最長回撤包含期末未恢復區間，含初始本金高點及空手日。</w:t>
+        <w:t>首尾年度可能僅涵蓋部分月份；年度報酬未年化，以該年首日損益前權益為分母。PF=淨正損益合計／淨負損益絕對值合計。最長回撤包含期末未恢復區間，含初始本金高點及空手日。</w:t>
       </w:r>
     </w:p>
     <w:p>
@@ -1742,7 +1742,7 @@
     </w:tbl>
     <w:p>
       <w:r>
-        <w:t>圖一：左為線性Y軸、右為對數Y軸。兩者皆自1,000萬元起始並扣除所有成交與轉倉成本；log-y版本只改變視覺尺度，不改變任何報酬或風險計算。</w:t>
+        <w:t>圖一：左為線性Y軸、右為對數Y軸。兩者皆自10,000,000元起始並扣除所有成交與轉倉成本；log-y版本只改變視覺尺度，不改變任何報酬或風險計算。</w:t>
       </w:r>
     </w:p>
     <w:p>
@@ -1783,7 +1783,7 @@
     </w:p>
     <w:p>
       <w:r>
-        <w:t>圖二：日末權益相對含初始本金的歷史高點回撤。策略MDD 3.93%，基準11.12%；策略回撤較淺，但固定一口比較同時含有不同市場曝險。</w:t>
+        <w:t>圖二：日末權益相對含初始本金的歷史高點回撤。策略MDD 3.93%，基準11.12%；固定一口比較同時含有不同市場曝險。</w:t>
       </w:r>
     </w:p>
     <w:p>
@@ -2279,7 +2279,7 @@
     </w:tbl>
     <w:p>
       <w:r>
-        <w:t>基準2點設定下，策略毛損益3,469,600.00元，成本192,063.42元，占毛獲利5.54%。其中手續費18,400元、期交稅26,463.42元、滑價147,200元。4點滑價時Sharpe仍為1.241，但固定滑價不能完整模擬極端行情的成交失敗與流動性惡化。</w:t>
+        <w:t>基準2點設定下，策略毛損益3,469,600.00元，成本192,063.42元，占毛獲利5.54%。其中手續費18,400.00元、期交稅26,463.42元、滑價147,200.00元。4點滑價時Sharpe為1.241；固定滑價不能完整模擬極端行情的成交失敗與流動性惡化。</w:t>
       </w:r>
     </w:p>
     <w:p>
@@ -2470,7 +2470,7 @@
     </w:tbl>
     <w:p>
       <w:r>
-        <w:t>合併條件降低了收益，也降低了日末回撤及波動。相較單獨交易強度或單獨價格均線，這個歷史樣本中的主要改善是風險效率，而不是提高總獲利。消融是在選定策略後作的描述，不能消除先前候選挑選造成的偏誤。</w:t>
+        <w:t>消融表列出雙條件、單獨法人條件及單獨價格條件在同一期間的結果；報酬、回撤與曝險可分別對照。消融是在選定策略後作的描述，不能消除先前候選挑選造成的偏誤。</w:t>
       </w:r>
     </w:p>
     <w:p>
@@ -2480,12 +2480,12 @@
     </w:p>
     <w:p>
       <w:r>
-        <w:t>147筆交易勝率51.70%、PF 2.197；持有日曆日平均6.90日、中位數3日，最長84日。前五筆獲利合計占總淨利55.46%；2025與2026合計約占61.73%，仍需注意少數交易及近期年份的影響。</w:t>
+        <w:t>147筆交易勝率51.70%、PF 2.197；持有日曆日平均6.90日、中位數3日，最長84日。前五筆獲利合計占總淨利55.46%；最近兩個曆年（2025、2026）合計占總淨利61.73%，仍需注意少數交易及近期年份的影響。</w:t>
       </w:r>
     </w:p>
     <w:p>
       <w:r>
-        <w:t>較早2018～2022淨利108.30萬元、描述性Sharpe 1.140；2023～2026淨利219.46萬元、Sharpe 1.481。兩段均為正，但2018、2022、2024年度為負。2024基準上漲而策略虧損，顯示趨勢過濾仍可能漏接行情或反覆進出。</w:t>
+        <w:t>2018–2022淨利1,082,967.22元、描述性Sharpe 1.140；2023–2026淨利2,194,569.35元、描述性Sharpe 1.481。年度虧損年份：2018、2022、2024。</w:t>
       </w:r>
     </w:p>
     <w:p>
@@ -2518,12 +2518,27 @@
     </w:p>
     <w:p>
       <w:r>
+        <w:t>逐筆比對兩份法人來源共6,090筆，其中2筆在2026/07/06不同，造成20個交易日的Q20變化，但本樣本0天訊號改變。歷史逐日初次發布快照與修訂軌跡未留存，故不能聲稱全期資料時點已獨立驗證。</w:t>
+      </w:r>
+    </w:p>
+    <w:p>
+      <w:r>
+        <w:t>近月未調整價格均線有換月價差敏感度：以前一日兩契約收盤重疊價差調整訊號後，14天訊號不同，診斷版淨利3,028,972.77元、Sharpe 1.193；原版為3,277,536.58元、1.302。此比較只變更訊號，實際成交仍按原契約，不取代正式V04。</w:t>
+      </w:r>
+    </w:p>
+    <w:p>
+      <w:r>
+        <w:t>價格單獨策略按完整樣本事後配平至相同年波動的TX-equivalent為0.450，淨利2,173,989.12元、Sharpe 0.908；V04為3,277,536.58元、1.302。這是風險尺度與曝險差異的描述，配平小數口不能直接交易，亦非樣本外證據。</w:t>
+      </w:r>
+    </w:p>
+    <w:p>
+      <w:r>
         <w:t>二、盤整與快速反轉環境</w:t>
       </w:r>
     </w:p>
     <w:p>
       <w:r>
-        <w:t>在盤整、急漲急跌或V形反轉環境中，20日平均具有滯後性，價格亦可能在MA20附近反覆穿越。當條件短暫失效後退出、再度成立後重新進場，可能造成追價、較低價格退出或錯失快速反彈。2024年基準為正報酬而策略為負，即顯示雙條件一致並不代表能捕捉所有上升行情。</w:t>
+        <w:t>在盤整、急漲急跌或V形反轉環境中，20日平均具有滯後性，價格亦可能在MA20附近反覆穿越。當條件短暫失效後退出、再度成立後重新進場，可能造成追價、較低價格退出或錯失快速反彈。雙條件一致仍可能漏接行情或反覆進出。</w:t>
       </w:r>
     </w:p>
     <w:p>
@@ -2566,12 +2581,12 @@
     </w:p>
     <w:p>
       <w:r>
-        <w:t>策略Sharpe為1.302、Calmar為0.906，高於固定一口Buy-and-Hold基準的1.108與0.694，MDD亦由11.12%降至3.93%；但策略累積報酬32.78%，低於基準82.68%。因此主要優勢體現在歷史風險效率與回撤控制，而非絕對收益。較低市場曝險同時降低下跌風險，也犧牲部分多頭行情的收益。</w:t>
+        <w:t>策略Sharpe為1.302、Calmar為0.906；固定一口Buy-and-Hold基準分別為1.108與0.694。策略MDD為3.93%、累積報酬32.78%；基準分別為11.12%與82.68%。兩者市場曝險不同，須搭配波動配平診斷解讀。</w:t>
       </w:r>
     </w:p>
     <w:p>
       <w:r>
-        <w:t>策略最長回撤期間為482個交易日，高於基準的366日，顯示較低回撤幅度不等同於較短的資金恢復時間。勝率約51.70%、Profit Factor約2.197，績效並非依賴高勝率，而較依賴部分趨勢延續期間的較大獲利；前五筆交易與近兩年績效占比較高，亦顯示成果存在集中性。</w:t>
+        <w:t>策略最長回撤期間為482個交易日，基準為366日。勝率51.70%、Profit Factor 2.197；前五筆交易合計占淨利55.46%。回撤時長與獲利集中度須與風險指標一起閱讀。</w:t>
       </w:r>
     </w:p>
     <w:p>

</xml_diff>

<commit_message>
Audit input provenance, roll signals, and flow attribution (#12)
</commit_message>
<xml_diff>
--- a/TX_flow_trend_report.docx
+++ b/TX_flow_trend_report.docx
@@ -69,7 +69,7 @@
           </w:tcPr>
           <w:p>
             <w:r>
-              <w:t>TAIFEX年度ZIP及2026年月檔；2016/10/05～2026/10/05，2,438日、14,202筆實際月契約、126個契約。僅保留一般交易時段、六碼月契約。</w:t>
+              <w:t>TAIFEX年度ZIP及月檔；2016/10/05～2026/10/05，2,438日、14,202筆實際月契約、126個契約。僅保留一般交易時段、六碼月契約。</w:t>
             </w:r>
           </w:p>
         </w:tc>
@@ -113,7 +113,7 @@
           </w:tcPr>
           <w:p>
             <w:r>
-              <w:t>2018/08/31～2026/10/05，共1,968日，約8.1年。沿用前版共同起點，以便比較；本策略本身需要20日暖身。</w:t>
+              <w:t>2018-08-31～2026-10-05，共1,968日。沿用前版共同起點，以便比較；本策略本身需要20日暖身。</w:t>
             </w:r>
           </w:p>
         </w:tc>
@@ -135,7 +135,7 @@
           </w:tcPr>
           <w:p>
             <w:r>
-              <w:t>2016/10/05～2018/06/04缺408日籌碼，未補造。較早官方交易金額淨額空白，但本策略只用完整的交易口數。</w:t>
+              <w:t>行情與法人資料起點不同；法人資料前的408個行情交易日未補造籌碼。較早官方交易金額淨額空白，但本策略只用完整的交易口數。</w:t>
             </w:r>
           </w:p>
         </w:tc>
@@ -153,7 +153,7 @@
     </w:p>
     <w:p>
       <w:r>
-        <w:t>主要結果：策略報酬32.78%、Sharpe 1.302、MDD 3.93%；基準報酬82.68%、Sharpe 1.108、MDD 11.12%。策略風險調整報酬較高，絕對收益較低。</w:t>
+        <w:t>主要結果：策略報酬32.78%、Sharpe 1.302、MDD 3.93%；基準報酬82.68%、Sharpe 1.108、MDD 11.12%。兩者曝險不同，須搭配風險配平結果解讀。</w:t>
       </w:r>
     </w:p>
     <w:p>
@@ -436,7 +436,7 @@
           </w:tcPr>
           <w:p>
             <w:r>
-              <w:t>本金1,000萬元；固定一口、不加碼；每點200元。</w:t>
+              <w:t>本金10,000,000元；固定一口、不加碼；每點200元。</w:t>
             </w:r>
           </w:p>
         </w:tc>
@@ -480,7 +480,7 @@
           </w:tcPr>
           <w:p>
             <w:r>
-              <w:t>每次成交2點：買進價+2、賣出價−2。初始進出、轉倉與期末平倉皆計。</w:t>
+              <w:t>每次成交2點：買進價+滑價、賣出價−滑價。初始進出、轉倉與期末平倉皆計。</w:t>
             </w:r>
           </w:p>
         </w:tc>
@@ -502,7 +502,7 @@
           </w:tcPr>
           <w:p>
             <w:r>
-              <w:t>每邊按含滑價成交價×200×0.00002。連續金額近似，未逐筆取整。[3]</w:t>
+              <w:t>每邊按含滑價成交價×200×2e-05。連續金額近似，未逐筆取整。[3]</w:t>
             </w:r>
           </w:p>
         </w:tc>
@@ -1630,7 +1630,7 @@
     </w:tbl>
     <w:p>
       <w:r>
-        <w:t>2018、2026為部分年度；年度報酬未年化，以該年首日損益前權益為分母。PF=淨正損益合計／淨負損益絕對值合計。最長回撤包含期末未恢復區間，含初始本金高點及空手日。</w:t>
+        <w:t>首尾年度可能僅涵蓋部分月份；年度報酬未年化，以該年首日損益前權益為分母。PF=淨正損益合計／淨負損益絕對值合計。最長回撤包含期末未恢復區間，含初始本金高點及空手日。</w:t>
       </w:r>
     </w:p>
     <w:p>
@@ -1742,7 +1742,7 @@
     </w:tbl>
     <w:p>
       <w:r>
-        <w:t>圖一：左為線性Y軸、右為對數Y軸。兩者皆自1,000萬元起始並扣除所有成交與轉倉成本；log-y版本只改變視覺尺度，不改變任何報酬或風險計算。</w:t>
+        <w:t>圖一：左為線性Y軸、右為對數Y軸。兩者皆自10,000,000元起始並扣除所有成交與轉倉成本；log-y版本只改變視覺尺度，不改變任何報酬或風險計算。</w:t>
       </w:r>
     </w:p>
     <w:p>
@@ -1783,7 +1783,7 @@
     </w:p>
     <w:p>
       <w:r>
-        <w:t>圖二：日末權益相對含初始本金的歷史高點回撤。策略MDD 3.93%，基準11.12%；策略回撤較淺，但固定一口比較同時含有不同市場曝險。</w:t>
+        <w:t>圖二：日末權益相對含初始本金的歷史高點回撤。策略MDD 3.93%，基準11.12%；固定一口比較同時含有不同市場曝險。</w:t>
       </w:r>
     </w:p>
     <w:p>
@@ -2279,7 +2279,7 @@
     </w:tbl>
     <w:p>
       <w:r>
-        <w:t>基準2點設定下，策略毛損益3,469,600.00元，成本192,063.42元，占毛獲利5.54%。其中手續費18,400元、期交稅26,463.42元、滑價147,200元。4點滑價時Sharpe仍為1.241，但固定滑價不能完整模擬極端行情的成交失敗與流動性惡化。</w:t>
+        <w:t>基準2點設定下，策略毛損益3,469,600.00元，成本192,063.42元，占毛獲利5.54%。其中手續費18,400.00元、期交稅26,463.42元、滑價147,200.00元。4點滑價時Sharpe為1.241；固定滑價不能完整模擬極端行情的成交失敗與流動性惡化。</w:t>
       </w:r>
     </w:p>
     <w:p>
@@ -2470,7 +2470,7 @@
     </w:tbl>
     <w:p>
       <w:r>
-        <w:t>合併條件降低了收益，也降低了日末回撤及波動。相較單獨交易強度或單獨價格均線，這個歷史樣本中的主要改善是風險效率，而不是提高總獲利。消融是在選定策略後作的描述，不能消除先前候選挑選造成的偏誤。</w:t>
+        <w:t>消融表列出雙條件、單獨法人條件及單獨價格條件在同一期間的結果；報酬、回撤與曝險可分別對照。消融是在選定策略後作的描述，不能消除先前候選挑選造成的偏誤。</w:t>
       </w:r>
     </w:p>
     <w:p>
@@ -2480,12 +2480,12 @@
     </w:p>
     <w:p>
       <w:r>
-        <w:t>147筆交易勝率51.70%、PF 2.197；持有日曆日平均6.90日、中位數3日，最長84日。前五筆獲利合計占總淨利55.46%；2025與2026合計約占61.73%，仍需注意少數交易及近期年份的影響。</w:t>
+        <w:t>147筆交易勝率51.70%、PF 2.197；持有日曆日平均6.90日、中位數3日，最長84日。前五筆獲利合計占總淨利55.46%；最近兩個曆年（2025、2026）合計占總淨利61.73%，仍需注意少數交易及近期年份的影響。</w:t>
       </w:r>
     </w:p>
     <w:p>
       <w:r>
-        <w:t>較早2018～2022淨利108.30萬元、描述性Sharpe 1.140；2023～2026淨利219.46萬元、Sharpe 1.481。兩段均為正，但2018、2022、2024年度為負。2024基準上漲而策略虧損，顯示趨勢過濾仍可能漏接行情或反覆進出。</w:t>
+        <w:t>2018–2022淨利1,082,967.22元、描述性Sharpe 1.140；2023–2026淨利2,194,569.35元、描述性Sharpe 1.481。年度虧損年份：2018、2022、2024。</w:t>
       </w:r>
     </w:p>
     <w:p>
@@ -2518,12 +2518,27 @@
     </w:p>
     <w:p>
       <w:r>
+        <w:t>逐筆比對兩份法人來源共6,090筆，其中2筆在2026/07/06不同，造成20個交易日的Q20變化，但本樣本0天訊號改變。歷史逐日初次發布快照與修訂軌跡未留存，故不能聲稱全期資料時點已獨立驗證。</w:t>
+      </w:r>
+    </w:p>
+    <w:p>
+      <w:r>
+        <w:t>近月未調整價格均線有換月價差敏感度：以前一日兩契約收盤重疊價差調整訊號後，14天訊號不同，診斷版淨利3,028,972.77元、Sharpe 1.193；原版為3,277,536.58元、1.302。此比較只變更訊號，實際成交仍按原契約，不取代正式V04。</w:t>
+      </w:r>
+    </w:p>
+    <w:p>
+      <w:r>
+        <w:t>價格單獨策略按完整樣本事後配平至相同年波動的TX-equivalent為0.450，淨利2,173,989.12元、Sharpe 0.908；V04為3,277,536.58元、1.302。這是風險尺度與曝險差異的描述，配平小數口不能直接交易，亦非樣本外證據。</w:t>
+      </w:r>
+    </w:p>
+    <w:p>
+      <w:r>
         <w:t>二、盤整與快速反轉環境</w:t>
       </w:r>
     </w:p>
     <w:p>
       <w:r>
-        <w:t>在盤整、急漲急跌或V形反轉環境中，20日平均具有滯後性，價格亦可能在MA20附近反覆穿越。當條件短暫失效後退出、再度成立後重新進場，可能造成追價、較低價格退出或錯失快速反彈。2024年基準為正報酬而策略為負，即顯示雙條件一致並不代表能捕捉所有上升行情。</w:t>
+        <w:t>在盤整、急漲急跌或V形反轉環境中，20日平均具有滯後性，價格亦可能在MA20附近反覆穿越。當條件短暫失效後退出、再度成立後重新進場，可能造成追價、較低價格退出或錯失快速反彈。雙條件一致仍可能漏接行情或反覆進出。</w:t>
       </w:r>
     </w:p>
     <w:p>
@@ -2566,12 +2581,12 @@
     </w:p>
     <w:p>
       <w:r>
-        <w:t>策略Sharpe為1.302、Calmar為0.906，高於固定一口Buy-and-Hold基準的1.108與0.694，MDD亦由11.12%降至3.93%；但策略累積報酬32.78%，低於基準82.68%。因此主要優勢體現在歷史風險效率與回撤控制，而非絕對收益。較低市場曝險同時降低下跌風險，也犧牲部分多頭行情的收益。</w:t>
+        <w:t>策略Sharpe為1.302、Calmar為0.906；固定一口Buy-and-Hold基準分別為1.108與0.694。策略MDD為3.93%、累積報酬32.78%；基準分別為11.12%與82.68%。兩者市場曝險不同，須搭配波動配平診斷解讀。</w:t>
       </w:r>
     </w:p>
     <w:p>
       <w:r>
-        <w:t>策略最長回撤期間為482個交易日，高於基準的366日，顯示較低回撤幅度不等同於較短的資金恢復時間。勝率約51.70%、Profit Factor約2.197，績效並非依賴高勝率，而較依賴部分趨勢延續期間的較大獲利；前五筆交易與近兩年績效占比較高，亦顯示成果存在集中性。</w:t>
+        <w:t>策略最長回撤期間為482個交易日，基準為366日。勝率51.70%、Profit Factor 2.197；前五筆交易合計占淨利55.46%。回撤時長與獲利集中度須與風險指標一起閱讀。</w:t>
       </w:r>
     </w:p>
     <w:p>

</xml_diff>

<commit_message>
Compare strategy risk with market at equal initial notional
</commit_message>
<xml_diff>
--- a/TX_flow_trend_report.docx
+++ b/TX_flow_trend_report.docx
@@ -17,7 +17,7 @@
     </w:p>
     <w:p>
       <w:r>
-        <w:t>研究假說：三大法人持續的淨買進活動，若同時伴隨價格上升趨勢，可能比單日部位異常更能辨識可持續的多頭環境。本研究以20日法人交易強度與20日價格均線建立一口多單／空手規則，並以計入轉倉成本的台指期近月Buy-and-Hold比較。</w:t>
+        <w:t>研究假說：三大法人持續的淨買進活動，若同時伴隨價格上升趨勢，可能比單日部位異常更能辨識可持續的多頭環境。本研究以20日法人交易強度與20日價格均線建立一口多單／空手規則，以加權股價指數作大盤價格參考，另與計入轉倉成本的台指期近月Buy-and-Hold比較。</w:t>
       </w:r>
     </w:p>
     <w:tbl>
@@ -153,7 +153,7 @@
     </w:p>
     <w:p>
       <w:r>
-        <w:t>主要結果：策略報酬32.78%、Sharpe 1.302、MDD 3.93%；基準報酬82.68%、Sharpe 1.108、MDD 11.12%。兩者曝險不同，須搭配風險配平結果解讀。</w:t>
+        <w:t>以首日一口TX名目價值2,195,000.00元作共同比較基數，V04成本後累積報酬149.32%、MDD 12.72%；同期加權指數價格報酬350.40%、MDD 31.63%。固定一口TX買進持有為可交易期貨對照。原一千萬元帳戶口徑保留於附表，不能用來代表滿額大盤曝險的風險。</w:t>
       </w:r>
     </w:p>
     <w:p>
@@ -426,7 +426,7 @@
           </w:tcPr>
           <w:p>
             <w:r>
-              <w:t>本金／口數／乘數</w:t>
+              <w:t>帳戶／口數／乘數</w:t>
             </w:r>
           </w:p>
         </w:tc>
@@ -436,7 +436,7 @@
           </w:tcPr>
           <w:p>
             <w:r>
-              <w:t>本金10,000,000元；固定一口、不加碼；每點200元。</w:t>
+              <w:t>帳務本金10,000,000元；一口TX、每點200元。績效主表另以起始名目價值為分母。</w:t>
             </w:r>
           </w:p>
         </w:tc>
@@ -546,7 +546,7 @@
           </w:tcPr>
           <w:p>
             <w:r>
-              <w:t>用收盤價評價總權益，非以每日結算價重建現金流。日損益／前日權益，含空手日。</w:t>
+              <w:t>原帳戶以收盤評價；主比較將相同一口逐日損益置於起始TX名目價值上，不改成交與損益。</w:t>
             </w:r>
           </w:p>
         </w:tc>
@@ -594,7 +594,7 @@
         <w:pStyle w:val="Heading1"/>
       </w:pPr>
       <w:r>
-        <w:t>4　績效指標與年度比較</w:t>
+        <w:t>4　同起始曝險的大盤績效比較</w:t>
       </w:r>
     </w:p>
     <w:tbl>
@@ -604,38 +604,49 @@
         <w:tblLook w:firstColumn="1" w:firstRow="1" w:lastColumn="0" w:lastRow="0" w:noHBand="0" w:noVBand="1" w:val="04A0"/>
       </w:tblPr>
       <w:tblGrid>
-        <w:gridCol w:w="3437"/>
-        <w:gridCol w:w="3437"/>
-        <w:gridCol w:w="3437"/>
+        <w:gridCol w:w="2578"/>
+        <w:gridCol w:w="2578"/>
+        <w:gridCol w:w="2578"/>
+        <w:gridCol w:w="2578"/>
       </w:tblGrid>
       <w:tr>
         <w:tc>
           <w:tcPr>
-            <w:tcW w:type="dxa" w:w="3437"/>
+            <w:tcW w:type="dxa" w:w="2578"/>
           </w:tcPr>
           <w:p>
             <w:r>
-              <w:t>成本後指標</w:t>
+              <w:t>指標</w:t>
             </w:r>
           </w:p>
         </w:tc>
         <w:tc>
           <w:tcPr>
-            <w:tcW w:type="dxa" w:w="3437"/>
+            <w:tcW w:type="dxa" w:w="2578"/>
           </w:tcPr>
           <w:p>
             <w:r>
-              <w:t>法人交易強度＋趨勢</w:t>
+              <w:t>V04一口</w:t>
             </w:r>
           </w:p>
         </w:tc>
         <w:tc>
           <w:tcPr>
-            <w:tcW w:type="dxa" w:w="3437"/>
+            <w:tcW w:type="dxa" w:w="2578"/>
           </w:tcPr>
           <w:p>
             <w:r>
-              <w:t>Buy-and-Hold基準</w:t>
+              <w:t>TX買進持有一口</w:t>
+            </w:r>
+          </w:p>
+        </w:tc>
+        <w:tc>
+          <w:tcPr>
+            <w:tcW w:type="dxa" w:w="2578"/>
+          </w:tcPr>
+          <w:p>
+            <w:r>
+              <w:t>加權指數</w:t>
             </w:r>
           </w:p>
         </w:tc>
@@ -643,31 +654,41 @@
       <w:tr>
         <w:tc>
           <w:tcPr>
-            <w:tcW w:type="dxa" w:w="3437"/>
+            <w:tcW w:type="dxa" w:w="2578"/>
           </w:tcPr>
           <w:p>
             <w:r>
-              <w:t>累積總報酬</w:t>
+              <w:t>累積報酬</w:t>
             </w:r>
           </w:p>
         </w:tc>
         <w:tc>
           <w:tcPr>
-            <w:tcW w:type="dxa" w:w="3437"/>
+            <w:tcW w:type="dxa" w:w="2578"/>
           </w:tcPr>
           <w:p>
             <w:r>
-              <w:t>32.78%</w:t>
+              <w:t>149.32%</w:t>
             </w:r>
           </w:p>
         </w:tc>
         <w:tc>
           <w:tcPr>
-            <w:tcW w:type="dxa" w:w="3437"/>
+            <w:tcW w:type="dxa" w:w="2578"/>
           </w:tcPr>
           <w:p>
             <w:r>
-              <w:t>82.68%</w:t>
+              <w:t>376.69%</w:t>
+            </w:r>
+          </w:p>
+        </w:tc>
+        <w:tc>
+          <w:tcPr>
+            <w:tcW w:type="dxa" w:w="2578"/>
+          </w:tcPr>
+          <w:p>
+            <w:r>
+              <w:t>350.40%</w:t>
             </w:r>
           </w:p>
         </w:tc>
@@ -675,7 +696,7 @@
       <w:tr>
         <w:tc>
           <w:tcPr>
-            <w:tcW w:type="dxa" w:w="3437"/>
+            <w:tcW w:type="dxa" w:w="2578"/>
           </w:tcPr>
           <w:p>
             <w:r>
@@ -685,21 +706,31 @@
         </w:tc>
         <w:tc>
           <w:tcPr>
-            <w:tcW w:type="dxa" w:w="3437"/>
+            <w:tcW w:type="dxa" w:w="2578"/>
           </w:tcPr>
           <w:p>
             <w:r>
-              <w:t>3.56%</w:t>
+              <w:t>11.94%</w:t>
             </w:r>
           </w:p>
         </w:tc>
         <w:tc>
           <w:tcPr>
-            <w:tcW w:type="dxa" w:w="3437"/>
+            <w:tcW w:type="dxa" w:w="2578"/>
           </w:tcPr>
           <w:p>
             <w:r>
-              <w:t>7.72%</w:t>
+              <w:t>21.27%</w:t>
+            </w:r>
+          </w:p>
+        </w:tc>
+        <w:tc>
+          <w:tcPr>
+            <w:tcW w:type="dxa" w:w="2578"/>
+          </w:tcPr>
+          <w:p>
+            <w:r>
+              <w:t>20.42%</w:t>
             </w:r>
           </w:p>
         </w:tc>
@@ -707,263 +738,7 @@
       <w:tr>
         <w:tc>
           <w:tcPr>
-            <w:tcW w:type="dxa" w:w="3437"/>
-          </w:tcPr>
-          <w:p>
-            <w:r>
-              <w:t>期末資金（元）</w:t>
-            </w:r>
-          </w:p>
-        </w:tc>
-        <w:tc>
-          <w:tcPr>
-            <w:tcW w:type="dxa" w:w="3437"/>
-          </w:tcPr>
-          <w:p>
-            <w:r>
-              <w:t>13,277,536.58</w:t>
-            </w:r>
-          </w:p>
-        </w:tc>
-        <w:tc>
-          <w:tcPr>
-            <w:tcW w:type="dxa" w:w="3437"/>
-          </w:tcPr>
-          <w:p>
-            <w:r>
-              <w:t>18,268,352.66</w:t>
-            </w:r>
-          </w:p>
-        </w:tc>
-      </w:tr>
-      <w:tr>
-        <w:tc>
-          <w:tcPr>
-            <w:tcW w:type="dxa" w:w="3437"/>
-          </w:tcPr>
-          <w:p>
-            <w:r>
-              <w:t>交易次數／段數</w:t>
-            </w:r>
-          </w:p>
-        </w:tc>
-        <w:tc>
-          <w:tcPr>
-            <w:tcW w:type="dxa" w:w="3437"/>
-          </w:tcPr>
-          <w:p>
-            <w:r>
-              <w:t>147</w:t>
-            </w:r>
-          </w:p>
-        </w:tc>
-        <w:tc>
-          <w:tcPr>
-            <w:tcW w:type="dxa" w:w="3437"/>
-          </w:tcPr>
-          <w:p>
-            <w:r>
-              <w:t>98</w:t>
-            </w:r>
-          </w:p>
-        </w:tc>
-      </w:tr>
-      <w:tr>
-        <w:tc>
-          <w:tcPr>
-            <w:tcW w:type="dxa" w:w="3437"/>
-          </w:tcPr>
-          <w:p>
-            <w:r>
-              <w:t>勝率</w:t>
-            </w:r>
-          </w:p>
-        </w:tc>
-        <w:tc>
-          <w:tcPr>
-            <w:tcW w:type="dxa" w:w="3437"/>
-          </w:tcPr>
-          <w:p>
-            <w:r>
-              <w:t>51.70%</w:t>
-            </w:r>
-          </w:p>
-        </w:tc>
-        <w:tc>
-          <w:tcPr>
-            <w:tcW w:type="dxa" w:w="3437"/>
-          </w:tcPr>
-          <w:p>
-            <w:r>
-              <w:t>67.35%</w:t>
-            </w:r>
-          </w:p>
-        </w:tc>
-      </w:tr>
-      <w:tr>
-        <w:tc>
-          <w:tcPr>
-            <w:tcW w:type="dxa" w:w="3437"/>
-          </w:tcPr>
-          <w:p>
-            <w:r>
-              <w:t>Profit Factor</w:t>
-            </w:r>
-          </w:p>
-        </w:tc>
-        <w:tc>
-          <w:tcPr>
-            <w:tcW w:type="dxa" w:w="3437"/>
-          </w:tcPr>
-          <w:p>
-            <w:r>
-              <w:t>2.197</w:t>
-            </w:r>
-          </w:p>
-        </w:tc>
-        <w:tc>
-          <w:tcPr>
-            <w:tcW w:type="dxa" w:w="3437"/>
-          </w:tcPr>
-          <w:p>
-            <w:r>
-              <w:t>2.846</w:t>
-            </w:r>
-          </w:p>
-        </w:tc>
-      </w:tr>
-      <w:tr>
-        <w:tc>
-          <w:tcPr>
-            <w:tcW w:type="dxa" w:w="3437"/>
-          </w:tcPr>
-          <w:p>
-            <w:r>
-              <w:t>最大回撤（元）</w:t>
-            </w:r>
-          </w:p>
-        </w:tc>
-        <w:tc>
-          <w:tcPr>
-            <w:tcW w:type="dxa" w:w="3437"/>
-          </w:tcPr>
-          <w:p>
-            <w:r>
-              <w:t>487,118.76</w:t>
-            </w:r>
-          </w:p>
-        </w:tc>
-        <w:tc>
-          <w:tcPr>
-            <w:tcW w:type="dxa" w:w="3437"/>
-          </w:tcPr>
-          <w:p>
-            <w:r>
-              <w:t>1,693,859.80</w:t>
-            </w:r>
-          </w:p>
-        </w:tc>
-      </w:tr>
-      <w:tr>
-        <w:tc>
-          <w:tcPr>
-            <w:tcW w:type="dxa" w:w="3437"/>
-          </w:tcPr>
-          <w:p>
-            <w:r>
-              <w:t>最大回撤（%）</w:t>
-            </w:r>
-          </w:p>
-        </w:tc>
-        <w:tc>
-          <w:tcPr>
-            <w:tcW w:type="dxa" w:w="3437"/>
-          </w:tcPr>
-          <w:p>
-            <w:r>
-              <w:t>3.93%</w:t>
-            </w:r>
-          </w:p>
-        </w:tc>
-        <w:tc>
-          <w:tcPr>
-            <w:tcW w:type="dxa" w:w="3437"/>
-          </w:tcPr>
-          <w:p>
-            <w:r>
-              <w:t>11.12%</w:t>
-            </w:r>
-          </w:p>
-        </w:tc>
-      </w:tr>
-      <w:tr>
-        <w:tc>
-          <w:tcPr>
-            <w:tcW w:type="dxa" w:w="3437"/>
-          </w:tcPr>
-          <w:p>
-            <w:r>
-              <w:t>最長回撤：交易日</w:t>
-            </w:r>
-          </w:p>
-        </w:tc>
-        <w:tc>
-          <w:tcPr>
-            <w:tcW w:type="dxa" w:w="3437"/>
-          </w:tcPr>
-          <w:p>
-            <w:r>
-              <w:t>482</w:t>
-            </w:r>
-          </w:p>
-        </w:tc>
-        <w:tc>
-          <w:tcPr>
-            <w:tcW w:type="dxa" w:w="3437"/>
-          </w:tcPr>
-          <w:p>
-            <w:r>
-              <w:t>366</w:t>
-            </w:r>
-          </w:p>
-        </w:tc>
-      </w:tr>
-      <w:tr>
-        <w:tc>
-          <w:tcPr>
-            <w:tcW w:type="dxa" w:w="3437"/>
-          </w:tcPr>
-          <w:p>
-            <w:r>
-              <w:t>最長回撤：日曆日</w:t>
-            </w:r>
-          </w:p>
-        </w:tc>
-        <w:tc>
-          <w:tcPr>
-            <w:tcW w:type="dxa" w:w="3437"/>
-          </w:tcPr>
-          <w:p>
-            <w:r>
-              <w:t>722</w:t>
-            </w:r>
-          </w:p>
-        </w:tc>
-        <w:tc>
-          <w:tcPr>
-            <w:tcW w:type="dxa" w:w="3437"/>
-          </w:tcPr>
-          <w:p>
-            <w:r>
-              <w:t>555</w:t>
-            </w:r>
-          </w:p>
-        </w:tc>
-      </w:tr>
-      <w:tr>
-        <w:tc>
-          <w:tcPr>
-            <w:tcW w:type="dxa" w:w="3437"/>
+            <w:tcW w:type="dxa" w:w="2578"/>
           </w:tcPr>
           <w:p>
             <w:r>
@@ -973,21 +748,31 @@
         </w:tc>
         <w:tc>
           <w:tcPr>
-            <w:tcW w:type="dxa" w:w="3437"/>
+            <w:tcW w:type="dxa" w:w="2578"/>
           </w:tcPr>
           <w:p>
             <w:r>
-              <w:t>1.302</w:t>
+              <w:t>1.367</w:t>
             </w:r>
           </w:p>
         </w:tc>
         <w:tc>
           <w:tcPr>
-            <w:tcW w:type="dxa" w:w="3437"/>
+            <w:tcW w:type="dxa" w:w="2578"/>
           </w:tcPr>
           <w:p>
             <w:r>
-              <w:t>1.108</w:t>
+              <w:t>1.147</w:t>
+            </w:r>
+          </w:p>
+        </w:tc>
+        <w:tc>
+          <w:tcPr>
+            <w:tcW w:type="dxa" w:w="2578"/>
+          </w:tcPr>
+          <w:p>
+            <w:r>
+              <w:t>1.064</w:t>
             </w:r>
           </w:p>
         </w:tc>
@@ -995,31 +780,41 @@
       <w:tr>
         <w:tc>
           <w:tcPr>
-            <w:tcW w:type="dxa" w:w="3437"/>
+            <w:tcW w:type="dxa" w:w="2578"/>
           </w:tcPr>
           <w:p>
             <w:r>
-              <w:t>Calmar</w:t>
+              <w:t>最大回撤</w:t>
             </w:r>
           </w:p>
         </w:tc>
         <w:tc>
           <w:tcPr>
-            <w:tcW w:type="dxa" w:w="3437"/>
+            <w:tcW w:type="dxa" w:w="2578"/>
           </w:tcPr>
           <w:p>
             <w:r>
-              <w:t>0.906</w:t>
+              <w:t>12.72%</w:t>
             </w:r>
           </w:p>
         </w:tc>
         <w:tc>
           <w:tcPr>
-            <w:tcW w:type="dxa" w:w="3437"/>
+            <w:tcW w:type="dxa" w:w="2578"/>
           </w:tcPr>
           <w:p>
             <w:r>
-              <w:t>0.694</w:t>
+              <w:t>28.64%</w:t>
+            </w:r>
+          </w:p>
+        </w:tc>
+        <w:tc>
+          <w:tcPr>
+            <w:tcW w:type="dxa" w:w="2578"/>
+          </w:tcPr>
+          <w:p>
+            <w:r>
+              <w:t>31.63%</w:t>
             </w:r>
           </w:p>
         </w:tc>
@@ -1027,7 +822,7 @@
       <w:tr>
         <w:tc>
           <w:tcPr>
-            <w:tcW w:type="dxa" w:w="3437"/>
+            <w:tcW w:type="dxa" w:w="2578"/>
           </w:tcPr>
           <w:p>
             <w:r>
@@ -1037,53 +832,31 @@
         </w:tc>
         <w:tc>
           <w:tcPr>
-            <w:tcW w:type="dxa" w:w="3437"/>
+            <w:tcW w:type="dxa" w:w="2578"/>
           </w:tcPr>
           <w:p>
             <w:r>
-              <w:t>2.82%</w:t>
+              <w:t>8.84%</w:t>
             </w:r>
           </w:p>
         </w:tc>
         <w:tc>
           <w:tcPr>
-            <w:tcW w:type="dxa" w:w="3437"/>
+            <w:tcW w:type="dxa" w:w="2578"/>
           </w:tcPr>
           <w:p>
             <w:r>
-              <w:t>7.20%</w:t>
-            </w:r>
-          </w:p>
-        </w:tc>
-      </w:tr>
-      <w:tr>
-        <w:tc>
-          <w:tcPr>
-            <w:tcW w:type="dxa" w:w="3437"/>
-          </w:tcPr>
-          <w:p>
-            <w:r>
-              <w:t>全部成本（元）</w:t>
+              <w:t>19.03%</w:t>
             </w:r>
           </w:p>
         </w:tc>
         <w:tc>
           <w:tcPr>
-            <w:tcW w:type="dxa" w:w="3437"/>
+            <w:tcW w:type="dxa" w:w="2578"/>
           </w:tcPr>
           <w:p>
             <w:r>
-              <w:t>192,063.42</w:t>
-            </w:r>
-          </w:p>
-        </w:tc>
-        <w:tc>
-          <w:tcPr>
-            <w:tcW w:type="dxa" w:w="3437"/>
-          </w:tcPr>
-          <w:p>
-            <w:r>
-              <w:t>102,847.34</w:t>
+              <w:t>20.00%</w:t>
             </w:r>
           </w:p>
         </w:tc>
@@ -1091,7 +864,17 @@
     </w:tbl>
     <w:p>
       <w:r>
-        <w:t>同期間、同本金、同一口。策略按一次進場至訊號退出計交易，合併轉倉成本；基準在每次換月結束一段交易。因此勝率／PF的持有頻率不同。MDD金額及比例各自取全期最大值，可能發生於不同日期。</w:t>
+        <w:t>三條曲線從同一參考基數2,195,000.00元開始：首日TX開盤10,975點×200元。V04與TX比較沿用原始一口逐日淨損益及全部交易成本，僅改變報酬與回撤分母；加權指數以首日開盤11,037.26點至逐日收盤計價格報酬，未含股息，屬市場參考而非可直接成交的期貨帳本。</w:t>
+      </w:r>
+    </w:p>
+    <w:p>
+      <w:r>
+        <w:t>原一千萬元、固定一口帳戶的策略報酬32.78%、MDD 3.93%；TX基準報酬82.68%、MDD 11.12%。其餘資金未投入市場，因此該口徑主要用於核對原帳務，不能單憑較小回撤宣稱策略優於大盤。</w:t>
+      </w:r>
+    </w:p>
+    <w:p>
+      <w:r>
+        <w:t>年度報酬：共同比較基數</w:t>
       </w:r>
     </w:p>
     <w:tbl>
@@ -1101,16 +884,15 @@
         <w:tblLook w:firstColumn="1" w:firstRow="1" w:lastColumn="0" w:lastRow="0" w:noHBand="0" w:noVBand="1" w:val="04A0"/>
       </w:tblPr>
       <w:tblGrid>
-        <w:gridCol w:w="2062"/>
-        <w:gridCol w:w="2062"/>
-        <w:gridCol w:w="2062"/>
-        <w:gridCol w:w="2062"/>
-        <w:gridCol w:w="2062"/>
+        <w:gridCol w:w="2578"/>
+        <w:gridCol w:w="2578"/>
+        <w:gridCol w:w="2578"/>
+        <w:gridCol w:w="2578"/>
       </w:tblGrid>
       <w:tr>
         <w:tc>
           <w:tcPr>
-            <w:tcW w:type="dxa" w:w="2062"/>
+            <w:tcW w:type="dxa" w:w="2578"/>
           </w:tcPr>
           <w:p>
             <w:r>
@@ -1120,41 +902,31 @@
         </w:tc>
         <w:tc>
           <w:tcPr>
-            <w:tcW w:type="dxa" w:w="2062"/>
+            <w:tcW w:type="dxa" w:w="2578"/>
           </w:tcPr>
           <w:p>
             <w:r>
-              <w:t>策略損益（元）</w:t>
+              <w:t>V04</w:t>
             </w:r>
           </w:p>
         </w:tc>
         <w:tc>
           <w:tcPr>
-            <w:tcW w:type="dxa" w:w="2062"/>
+            <w:tcW w:type="dxa" w:w="2578"/>
           </w:tcPr>
           <w:p>
             <w:r>
-              <w:t>策略報酬</w:t>
+              <w:t>TX一口</w:t>
             </w:r>
           </w:p>
         </w:tc>
         <w:tc>
           <w:tcPr>
-            <w:tcW w:type="dxa" w:w="2062"/>
+            <w:tcW w:type="dxa" w:w="2578"/>
           </w:tcPr>
           <w:p>
             <w:r>
-              <w:t>基準損益（元）</w:t>
-            </w:r>
-          </w:p>
-        </w:tc>
-        <w:tc>
-          <w:tcPr>
-            <w:tcW w:type="dxa" w:w="2062"/>
-          </w:tcPr>
-          <w:p>
-            <w:r>
-              <w:t>基準報酬</w:t>
+              <w:t>加權指數</w:t>
             </w:r>
           </w:p>
         </w:tc>
@@ -1162,7 +934,7 @@
       <w:tr>
         <w:tc>
           <w:tcPr>
-            <w:tcW w:type="dxa" w:w="2062"/>
+            <w:tcW w:type="dxa" w:w="2578"/>
           </w:tcPr>
           <w:p>
             <w:r>
@@ -1172,41 +944,31 @@
         </w:tc>
         <w:tc>
           <w:tcPr>
-            <w:tcW w:type="dxa" w:w="2062"/>
+            <w:tcW w:type="dxa" w:w="2578"/>
           </w:tcPr>
           <w:p>
             <w:r>
-              <w:t>-144,387</w:t>
+              <w:t>-6.58%</w:t>
             </w:r>
           </w:p>
         </w:tc>
         <w:tc>
           <w:tcPr>
-            <w:tcW w:type="dxa" w:w="2062"/>
+            <w:tcW w:type="dxa" w:w="2578"/>
           </w:tcPr>
           <w:p>
             <w:r>
-              <w:t>-1.44%</w:t>
+              <w:t>-11.25%</w:t>
             </w:r>
           </w:p>
         </w:tc>
         <w:tc>
           <w:tcPr>
-            <w:tcW w:type="dxa" w:w="2062"/>
+            <w:tcW w:type="dxa" w:w="2578"/>
           </w:tcPr>
           <w:p>
             <w:r>
-              <w:t>-247,015</w:t>
-            </w:r>
-          </w:p>
-        </w:tc>
-        <w:tc>
-          <w:tcPr>
-            <w:tcW w:type="dxa" w:w="2062"/>
-          </w:tcPr>
-          <w:p>
-            <w:r>
-              <w:t>-2.47%</w:t>
+              <w:t>-11.87%</w:t>
             </w:r>
           </w:p>
         </w:tc>
@@ -1214,7 +976,7 @@
       <w:tr>
         <w:tc>
           <w:tcPr>
-            <w:tcW w:type="dxa" w:w="2062"/>
+            <w:tcW w:type="dxa" w:w="2578"/>
           </w:tcPr>
           <w:p>
             <w:r>
@@ -1224,41 +986,31 @@
         </w:tc>
         <w:tc>
           <w:tcPr>
-            <w:tcW w:type="dxa" w:w="2062"/>
+            <w:tcW w:type="dxa" w:w="2578"/>
           </w:tcPr>
           <w:p>
             <w:r>
-              <w:t>439,590</w:t>
+              <w:t>21.44%</w:t>
             </w:r>
           </w:p>
         </w:tc>
         <w:tc>
           <w:tcPr>
-            <w:tcW w:type="dxa" w:w="2062"/>
+            <w:tcW w:type="dxa" w:w="2578"/>
           </w:tcPr>
           <w:p>
             <w:r>
-              <w:t>4.46%</w:t>
+              <w:t>28.18%</w:t>
             </w:r>
           </w:p>
         </w:tc>
         <w:tc>
           <w:tcPr>
-            <w:tcW w:type="dxa" w:w="2062"/>
+            <w:tcW w:type="dxa" w:w="2578"/>
           </w:tcPr>
           <w:p>
             <w:r>
-              <w:t>548,965</w:t>
-            </w:r>
-          </w:p>
-        </w:tc>
-        <w:tc>
-          <w:tcPr>
-            <w:tcW w:type="dxa" w:w="2062"/>
-          </w:tcPr>
-          <w:p>
-            <w:r>
-              <w:t>5.63%</w:t>
+              <w:t>23.33%</w:t>
             </w:r>
           </w:p>
         </w:tc>
@@ -1266,7 +1018,7 @@
       <w:tr>
         <w:tc>
           <w:tcPr>
-            <w:tcW w:type="dxa" w:w="2062"/>
+            <w:tcW w:type="dxa" w:w="2578"/>
           </w:tcPr>
           <w:p>
             <w:r>
@@ -1276,17 +1028,49 @@
         </w:tc>
         <w:tc>
           <w:tcPr>
-            <w:tcW w:type="dxa" w:w="2062"/>
+            <w:tcW w:type="dxa" w:w="2578"/>
           </w:tcPr>
           <w:p>
             <w:r>
-              <w:t>639,655</w:t>
+              <w:t>25.69%</w:t>
             </w:r>
           </w:p>
         </w:tc>
         <w:tc>
           <w:tcPr>
-            <w:tcW w:type="dxa" w:w="2062"/>
+            <w:tcW w:type="dxa" w:w="2578"/>
+          </w:tcPr>
+          <w:p>
+            <w:r>
+              <w:t>29.38%</w:t>
+            </w:r>
+          </w:p>
+        </w:tc>
+        <w:tc>
+          <w:tcPr>
+            <w:tcW w:type="dxa" w:w="2578"/>
+          </w:tcPr>
+          <w:p>
+            <w:r>
+              <w:t>22.80%</w:t>
+            </w:r>
+          </w:p>
+        </w:tc>
+      </w:tr>
+      <w:tr>
+        <w:tc>
+          <w:tcPr>
+            <w:tcW w:type="dxa" w:w="2578"/>
+          </w:tcPr>
+          <w:p>
+            <w:r>
+              <w:t>2021</w:t>
+            </w:r>
+          </w:p>
+        </w:tc>
+        <w:tc>
+          <w:tcPr>
+            <w:tcW w:type="dxa" w:w="2578"/>
           </w:tcPr>
           <w:p>
             <w:r>
@@ -1296,21 +1080,21 @@
         </w:tc>
         <w:tc>
           <w:tcPr>
-            <w:tcW w:type="dxa" w:w="2062"/>
+            <w:tcW w:type="dxa" w:w="2578"/>
           </w:tcPr>
           <w:p>
             <w:r>
-              <w:t>733,649</w:t>
+              <w:t>27.37%</w:t>
             </w:r>
           </w:p>
         </w:tc>
         <w:tc>
           <w:tcPr>
-            <w:tcW w:type="dxa" w:w="2062"/>
+            <w:tcW w:type="dxa" w:w="2578"/>
           </w:tcPr>
           <w:p>
             <w:r>
-              <w:t>7.12%</w:t>
+              <w:t>23.66%</w:t>
             </w:r>
           </w:p>
         </w:tc>
@@ -1318,59 +1102,7 @@
       <w:tr>
         <w:tc>
           <w:tcPr>
-            <w:tcW w:type="dxa" w:w="2062"/>
-          </w:tcPr>
-          <w:p>
-            <w:r>
-              <w:t>2021</w:t>
-            </w:r>
-          </w:p>
-        </w:tc>
-        <w:tc>
-          <w:tcPr>
-            <w:tcW w:type="dxa" w:w="2062"/>
-          </w:tcPr>
-          <w:p>
-            <w:r>
-              <w:t>194,363</w:t>
-            </w:r>
-          </w:p>
-        </w:tc>
-        <w:tc>
-          <w:tcPr>
-            <w:tcW w:type="dxa" w:w="2062"/>
-          </w:tcPr>
-          <w:p>
-            <w:r>
-              <w:t>1.78%</w:t>
-            </w:r>
-          </w:p>
-        </w:tc>
-        <w:tc>
-          <w:tcPr>
-            <w:tcW w:type="dxa" w:w="2062"/>
-          </w:tcPr>
-          <w:p>
-            <w:r>
-              <w:t>884,182</w:t>
-            </w:r>
-          </w:p>
-        </w:tc>
-        <w:tc>
-          <w:tcPr>
-            <w:tcW w:type="dxa" w:w="2062"/>
-          </w:tcPr>
-          <w:p>
-            <w:r>
-              <w:t>8.01%</w:t>
-            </w:r>
-          </w:p>
-        </w:tc>
-      </w:tr>
-      <w:tr>
-        <w:tc>
-          <w:tcPr>
-            <w:tcW w:type="dxa" w:w="2062"/>
+            <w:tcW w:type="dxa" w:w="2578"/>
           </w:tcPr>
           <w:p>
             <w:r>
@@ -1380,41 +1112,31 @@
         </w:tc>
         <w:tc>
           <w:tcPr>
-            <w:tcW w:type="dxa" w:w="2062"/>
+            <w:tcW w:type="dxa" w:w="2578"/>
           </w:tcPr>
           <w:p>
             <w:r>
-              <w:t>-46,253</w:t>
+              <w:t>-1.39%</w:t>
             </w:r>
           </w:p>
         </w:tc>
         <w:tc>
           <w:tcPr>
-            <w:tcW w:type="dxa" w:w="2062"/>
+            <w:tcW w:type="dxa" w:w="2578"/>
           </w:tcPr>
           <w:p>
             <w:r>
-              <w:t>-0.42%</w:t>
+              <w:t>-15.17%</w:t>
             </w:r>
           </w:p>
         </w:tc>
         <w:tc>
           <w:tcPr>
-            <w:tcW w:type="dxa" w:w="2062"/>
+            <w:tcW w:type="dxa" w:w="2578"/>
           </w:tcPr>
           <w:p>
             <w:r>
-              <w:t>-624,106</w:t>
-            </w:r>
-          </w:p>
-        </w:tc>
-        <w:tc>
-          <w:tcPr>
-            <w:tcW w:type="dxa" w:w="2062"/>
-          </w:tcPr>
-          <w:p>
-            <w:r>
-              <w:t>-5.24%</w:t>
+              <w:t>-22.40%</w:t>
             </w:r>
           </w:p>
         </w:tc>
@@ -1422,7 +1144,7 @@
       <w:tr>
         <w:tc>
           <w:tcPr>
-            <w:tcW w:type="dxa" w:w="2062"/>
+            <w:tcW w:type="dxa" w:w="2578"/>
           </w:tcPr>
           <w:p>
             <w:r>
@@ -1432,41 +1154,31 @@
         </w:tc>
         <w:tc>
           <w:tcPr>
-            <w:tcW w:type="dxa" w:w="2062"/>
+            <w:tcW w:type="dxa" w:w="2578"/>
           </w:tcPr>
           <w:p>
             <w:r>
-              <w:t>192,431</w:t>
+              <w:t>5.87%</w:t>
             </w:r>
           </w:p>
         </w:tc>
         <w:tc>
           <w:tcPr>
-            <w:tcW w:type="dxa" w:w="2062"/>
+            <w:tcW w:type="dxa" w:w="2578"/>
           </w:tcPr>
           <w:p>
             <w:r>
-              <w:t>1.74%</w:t>
+              <w:t>23.25%</w:t>
             </w:r>
           </w:p>
         </w:tc>
         <w:tc>
           <w:tcPr>
-            <w:tcW w:type="dxa" w:w="2062"/>
+            <w:tcW w:type="dxa" w:w="2578"/>
           </w:tcPr>
           <w:p>
             <w:r>
-              <w:t>811,432</w:t>
-            </w:r>
-          </w:p>
-        </w:tc>
-        <w:tc>
-          <w:tcPr>
-            <w:tcW w:type="dxa" w:w="2062"/>
-          </w:tcPr>
-          <w:p>
-            <w:r>
-              <w:t>7.18%</w:t>
+              <w:t>26.83%</w:t>
             </w:r>
           </w:p>
         </w:tc>
@@ -1474,7 +1186,7 @@
       <w:tr>
         <w:tc>
           <w:tcPr>
-            <w:tcW w:type="dxa" w:w="2062"/>
+            <w:tcW w:type="dxa" w:w="2578"/>
           </w:tcPr>
           <w:p>
             <w:r>
@@ -1484,41 +1196,31 @@
         </w:tc>
         <w:tc>
           <w:tcPr>
-            <w:tcW w:type="dxa" w:w="2062"/>
+            <w:tcW w:type="dxa" w:w="2578"/>
           </w:tcPr>
           <w:p>
             <w:r>
-              <w:t>-21,064</w:t>
+              <w:t>-0.61%</w:t>
             </w:r>
           </w:p>
         </w:tc>
         <w:tc>
           <w:tcPr>
-            <w:tcW w:type="dxa" w:w="2062"/>
+            <w:tcW w:type="dxa" w:w="2578"/>
           </w:tcPr>
           <w:p>
             <w:r>
-              <w:t>-0.19%</w:t>
+              <w:t>23.22%</w:t>
             </w:r>
           </w:p>
         </w:tc>
         <w:tc>
           <w:tcPr>
-            <w:tcW w:type="dxa" w:w="2062"/>
+            <w:tcW w:type="dxa" w:w="2578"/>
           </w:tcPr>
           <w:p>
             <w:r>
-              <w:t>999,143</w:t>
-            </w:r>
-          </w:p>
-        </w:tc>
-        <w:tc>
-          <w:tcPr>
-            <w:tcW w:type="dxa" w:w="2062"/>
-          </w:tcPr>
-          <w:p>
-            <w:r>
-              <w:t>8.25%</w:t>
+              <w:t>28.47%</w:t>
             </w:r>
           </w:p>
         </w:tc>
@@ -1526,7 +1228,7 @@
       <w:tr>
         <w:tc>
           <w:tcPr>
-            <w:tcW w:type="dxa" w:w="2062"/>
+            <w:tcW w:type="dxa" w:w="2578"/>
           </w:tcPr>
           <w:p>
             <w:r>
@@ -1536,41 +1238,31 @@
         </w:tc>
         <w:tc>
           <w:tcPr>
-            <w:tcW w:type="dxa" w:w="2062"/>
+            <w:tcW w:type="dxa" w:w="2578"/>
           </w:tcPr>
           <w:p>
             <w:r>
-              <w:t>771,097</w:t>
+              <w:t>22.35%</w:t>
             </w:r>
           </w:p>
         </w:tc>
         <w:tc>
           <w:tcPr>
-            <w:tcW w:type="dxa" w:w="2062"/>
+            <w:tcW w:type="dxa" w:w="2578"/>
           </w:tcPr>
           <w:p>
             <w:r>
-              <w:t>6.85%</w:t>
+              <w:t>23.92%</w:t>
             </w:r>
           </w:p>
         </w:tc>
         <w:tc>
           <w:tcPr>
-            <w:tcW w:type="dxa" w:w="2062"/>
+            <w:tcW w:type="dxa" w:w="2578"/>
           </w:tcPr>
           <w:p>
             <w:r>
-              <w:t>1,268,113</w:t>
-            </w:r>
-          </w:p>
-        </w:tc>
-        <w:tc>
-          <w:tcPr>
-            <w:tcW w:type="dxa" w:w="2062"/>
-          </w:tcPr>
-          <w:p>
-            <w:r>
-              <w:t>9.68%</w:t>
+              <w:t>25.74%</w:t>
             </w:r>
           </w:p>
         </w:tc>
@@ -1578,7 +1270,7 @@
       <w:tr>
         <w:tc>
           <w:tcPr>
-            <w:tcW w:type="dxa" w:w="2062"/>
+            <w:tcW w:type="dxa" w:w="2578"/>
           </w:tcPr>
           <w:p>
             <w:r>
@@ -1588,41 +1280,31 @@
         </w:tc>
         <w:tc>
           <w:tcPr>
-            <w:tcW w:type="dxa" w:w="2062"/>
+            <w:tcW w:type="dxa" w:w="2578"/>
           </w:tcPr>
           <w:p>
             <w:r>
-              <w:t>1,252,106</w:t>
+              <w:t>29.67%</w:t>
             </w:r>
           </w:p>
         </w:tc>
         <w:tc>
           <w:tcPr>
-            <w:tcW w:type="dxa" w:w="2062"/>
+            <w:tcW w:type="dxa" w:w="2578"/>
           </w:tcPr>
           <w:p>
             <w:r>
-              <w:t>10.41%</w:t>
+              <w:t>59.27%</w:t>
             </w:r>
           </w:p>
         </w:tc>
         <w:tc>
           <w:tcPr>
-            <w:tcW w:type="dxa" w:w="2062"/>
+            <w:tcW w:type="dxa" w:w="2578"/>
           </w:tcPr>
           <w:p>
             <w:r>
-              <w:t>3,893,988</w:t>
-            </w:r>
-          </w:p>
-        </w:tc>
-        <w:tc>
-          <w:tcPr>
-            <w:tcW w:type="dxa" w:w="2062"/>
-          </w:tcPr>
-          <w:p>
-            <w:r>
-              <w:t>27.09%</w:t>
+              <w:t>71.64%</w:t>
             </w:r>
           </w:p>
         </w:tc>
@@ -1630,7 +1312,7 @@
     </w:tbl>
     <w:p>
       <w:r>
-        <w:t>首尾年度可能僅涵蓋部分月份；年度報酬未年化，以該年首日損益前權益為分母。PF=淨正損益合計／淨負損益絕對值合計。最長回撤包含期末未恢復區間，含初始本金高點及空手日。</w:t>
+        <w:t>年度報酬以各年第一交易日前的權益為分母，首尾年度是不完整年份。Sharpe與回撤都依此共同基數重新計算；固定一口TX與加權指數的報酬不等同，包含基差、換月與期貨成交成本等差異。</w:t>
       </w:r>
     </w:p>
     <w:p>
@@ -1742,7 +1424,7 @@
     </w:tbl>
     <w:p>
       <w:r>
-        <w:t>圖一：左為線性Y軸、右為對數Y軸。兩者皆自10,000,000元起始並扣除所有成交與轉倉成本；log-y版本只改變視覺尺度，不改變任何報酬或風險計算。</w:t>
+        <w:t>圖一：左為線性Y軸、右為對數Y軸。三序列皆自共同起始名目價值2,195,000.00元（圖上為1倍）計算；V04與TX皆扣交易成本，加權指數為未含股息的價格指數。</w:t>
       </w:r>
     </w:p>
     <w:p>
@@ -1783,12 +1465,12 @@
     </w:p>
     <w:p>
       <w:r>
-        <w:t>圖二：日末權益相對含初始本金的歷史高點回撤。策略MDD 3.93%，基準11.12%；固定一口比較同時含有不同市場曝險。</w:t>
+        <w:t>圖二：相同起始曝險基數的權益回撤。V04 12.72%、TX 28.64%、加權指數 31.63%；V04空手期間仍保有現金，其市場持倉天數較少。</w:t>
       </w:r>
     </w:p>
     <w:p>
       <w:r>
-        <w:t>波動配平診斷（事後分析）</w:t>
+        <w:t>原一千萬元帳戶的波動配平診斷（事後分析）</w:t>
       </w:r>
     </w:p>
     <w:tbl>
@@ -2034,7 +1716,7 @@
     </w:p>
     <w:p>
       <w:r>
-        <w:t>固定一口仍是主結果，因為它可直接對應實際合約；波動配平只用來避免把策略較低MDD完全誤解為訊號本身的優勢。圖表也沒有盤中及夜盤評價，不能代表最壞瞬時損失或精確保證金風險。</w:t>
+        <w:t>同起始名目價值的三序列是主要市場比較；原一千萬元帳戶的波動配平另作診斷。圖表沒有盤中及夜盤評價，不能代表最壞瞬時損失或精確保證金風險。</w:t>
       </w:r>
     </w:p>
     <w:p>
@@ -2558,7 +2240,7 @@
     </w:p>
     <w:p>
       <w:r>
-        <w:t>因此3.93%的日末MDD不應解讀為單筆交易或盤中可能遭受的最大損失。完整名目價值資金限制降低了槓桿造成的風險，但無法消除跳空與流動性風險；若進一步評估實際交易可行性，仍需納入夜盤價格、盤中極端波動與開盤成交品質。</w:t>
+        <w:t>以一口TX起始名目價值計算，日末MDD為12.72%；一千萬元帳戶口徑為3.93%，因部分資金閒置而較低。兩者均非盤中可能遭受的最大損失；進一步評估仍需夜盤、盤中極端波動與開盤成交品質。</w:t>
       </w:r>
     </w:p>
     <w:p>
@@ -2581,7 +2263,7 @@
     </w:p>
     <w:p>
       <w:r>
-        <w:t>策略Sharpe為1.302、Calmar為0.906；固定一口Buy-and-Hold基準分別為1.108與0.694。策略MDD為3.93%、累積報酬32.78%；基準分別為11.12%與82.68%。兩者市場曝險不同，須搭配波動配平診斷解讀。</w:t>
+        <w:t>按首日一口TX名目價值比較，V04報酬149.32%、Sharpe 1.367、MDD 12.72%；同口TX買進持有為376.69%、1.147、28.64%；加權指數價格報酬為350.40%、1.064、31.63%。V04較低的市場持倉與回撤不能單獨證明超額報酬，其相對加權指數的歷史Information Ratio為-0.493。</w:t>
       </w:r>
     </w:p>
     <w:p>
@@ -2606,7 +2288,7 @@
     </w:p>
     <w:p>
       <w:r>
-        <w:t>綜合而言，法人交易強度與價格趨勢的雙條件策略具有規則簡單、交易邏輯可追溯及歷史風險效率較佳等特性，可作為後續研究候選。然而，現有證據不足以宣稱其具有穩定的樣本外超額報酬。若要提高結論可信度，應優先完成獨立樣本外驗證、夜盤與盤中風險評估，以及資料發布時點與歷史修訂的一致性檢查。</w:t>
+        <w:t>綜合而言，策略規則可追溯且歷史成本後報酬為正，但同期大盤與TX買進持有累積報酬均較高；V04主要呈現較少持倉及較低回撤，未能據此認定法人訊號創造穩定超額報酬。仍須完成獨立樣本外驗證、夜盤與盤中風險及資料發布時點檢查。</w:t>
       </w:r>
     </w:p>
     <w:p>
@@ -2625,11 +2307,13 @@
         <w:t>歷史行情：https://www.taifex.com.tw/cht/3/dlFutDailyMarketView</w:t>
         <w:br/>
         <w:t>FinMind：https://finmind.github.io/tutor/TaiwanMarket/Derivative/</w:t>
+        <w:br/>
+        <w:t>加權指數：臺灣證券交易所每日市場成交資訊與發行量加權股價指數歷史資料，來源與雜湊見source_audits/taiex_sources.json。</w:t>
       </w:r>
     </w:p>
     <w:p>
       <w:r>
-        <w:t>Sharpe＝日報酬平均／日報酬樣本標準差×√252；Calmar＝CAGR／最大回撤比例。所有績效指標均依相同初始資金、交易期間與成本假設計算；波動配平結果僅作風險尺度診斷，不列為主要可執行基準。</w:t>
+        <w:t>Sharpe＝日報酬平均／日報酬樣本標準差×√252；Calmar＝CAGR／最大回撤比例。主要比較將兩套實際一口TX損益置於相同起始名目價值，加權指數按首日開盤買入等值指數單位；指數未含股息及追蹤費用。原一千萬元帳戶與事後波動配平僅作補充。</w:t>
       </w:r>
     </w:p>
     <w:sectPr>

</xml_diff>

<commit_message>
Compare strategy risk with market at equal initial notional (#13)
</commit_message>
<xml_diff>
--- a/TX_flow_trend_report.docx
+++ b/TX_flow_trend_report.docx
@@ -17,7 +17,7 @@
     </w:p>
     <w:p>
       <w:r>
-        <w:t>研究假說：三大法人持續的淨買進活動，若同時伴隨價格上升趨勢，可能比單日部位異常更能辨識可持續的多頭環境。本研究以20日法人交易強度與20日價格均線建立一口多單／空手規則，並以計入轉倉成本的台指期近月Buy-and-Hold比較。</w:t>
+        <w:t>研究假說：三大法人持續的淨買進活動，若同時伴隨價格上升趨勢，可能比單日部位異常更能辨識可持續的多頭環境。本研究以20日法人交易強度與20日價格均線建立一口多單／空手規則，以加權股價指數作大盤價格參考，另與計入轉倉成本的台指期近月Buy-and-Hold比較。</w:t>
       </w:r>
     </w:p>
     <w:tbl>
@@ -153,7 +153,7 @@
     </w:p>
     <w:p>
       <w:r>
-        <w:t>主要結果：策略報酬32.78%、Sharpe 1.302、MDD 3.93%；基準報酬82.68%、Sharpe 1.108、MDD 11.12%。兩者曝險不同，須搭配風險配平結果解讀。</w:t>
+        <w:t>以首日一口TX名目價值2,195,000.00元作共同比較基數，V04成本後累積報酬149.32%、MDD 12.72%；同期加權指數價格報酬350.40%、MDD 31.63%。固定一口TX買進持有為可交易期貨對照。原一千萬元帳戶口徑保留於附表，不能用來代表滿額大盤曝險的風險。</w:t>
       </w:r>
     </w:p>
     <w:p>
@@ -426,7 +426,7 @@
           </w:tcPr>
           <w:p>
             <w:r>
-              <w:t>本金／口數／乘數</w:t>
+              <w:t>帳戶／口數／乘數</w:t>
             </w:r>
           </w:p>
         </w:tc>
@@ -436,7 +436,7 @@
           </w:tcPr>
           <w:p>
             <w:r>
-              <w:t>本金10,000,000元；固定一口、不加碼；每點200元。</w:t>
+              <w:t>帳務本金10,000,000元；一口TX、每點200元。績效主表另以起始名目價值為分母。</w:t>
             </w:r>
           </w:p>
         </w:tc>
@@ -546,7 +546,7 @@
           </w:tcPr>
           <w:p>
             <w:r>
-              <w:t>用收盤價評價總權益，非以每日結算價重建現金流。日損益／前日權益，含空手日。</w:t>
+              <w:t>原帳戶以收盤評價；主比較將相同一口逐日損益置於起始TX名目價值上，不改成交與損益。</w:t>
             </w:r>
           </w:p>
         </w:tc>
@@ -594,7 +594,7 @@
         <w:pStyle w:val="Heading1"/>
       </w:pPr>
       <w:r>
-        <w:t>4　績效指標與年度比較</w:t>
+        <w:t>4　同起始曝險的大盤績效比較</w:t>
       </w:r>
     </w:p>
     <w:tbl>
@@ -604,38 +604,49 @@
         <w:tblLook w:firstColumn="1" w:firstRow="1" w:lastColumn="0" w:lastRow="0" w:noHBand="0" w:noVBand="1" w:val="04A0"/>
       </w:tblPr>
       <w:tblGrid>
-        <w:gridCol w:w="3437"/>
-        <w:gridCol w:w="3437"/>
-        <w:gridCol w:w="3437"/>
+        <w:gridCol w:w="2578"/>
+        <w:gridCol w:w="2578"/>
+        <w:gridCol w:w="2578"/>
+        <w:gridCol w:w="2578"/>
       </w:tblGrid>
       <w:tr>
         <w:tc>
           <w:tcPr>
-            <w:tcW w:type="dxa" w:w="3437"/>
+            <w:tcW w:type="dxa" w:w="2578"/>
           </w:tcPr>
           <w:p>
             <w:r>
-              <w:t>成本後指標</w:t>
+              <w:t>指標</w:t>
             </w:r>
           </w:p>
         </w:tc>
         <w:tc>
           <w:tcPr>
-            <w:tcW w:type="dxa" w:w="3437"/>
+            <w:tcW w:type="dxa" w:w="2578"/>
           </w:tcPr>
           <w:p>
             <w:r>
-              <w:t>法人交易強度＋趨勢</w:t>
+              <w:t>V04一口</w:t>
             </w:r>
           </w:p>
         </w:tc>
         <w:tc>
           <w:tcPr>
-            <w:tcW w:type="dxa" w:w="3437"/>
+            <w:tcW w:type="dxa" w:w="2578"/>
           </w:tcPr>
           <w:p>
             <w:r>
-              <w:t>Buy-and-Hold基準</w:t>
+              <w:t>TX買進持有一口</w:t>
+            </w:r>
+          </w:p>
+        </w:tc>
+        <w:tc>
+          <w:tcPr>
+            <w:tcW w:type="dxa" w:w="2578"/>
+          </w:tcPr>
+          <w:p>
+            <w:r>
+              <w:t>加權指數</w:t>
             </w:r>
           </w:p>
         </w:tc>
@@ -643,31 +654,41 @@
       <w:tr>
         <w:tc>
           <w:tcPr>
-            <w:tcW w:type="dxa" w:w="3437"/>
+            <w:tcW w:type="dxa" w:w="2578"/>
           </w:tcPr>
           <w:p>
             <w:r>
-              <w:t>累積總報酬</w:t>
+              <w:t>累積報酬</w:t>
             </w:r>
           </w:p>
         </w:tc>
         <w:tc>
           <w:tcPr>
-            <w:tcW w:type="dxa" w:w="3437"/>
+            <w:tcW w:type="dxa" w:w="2578"/>
           </w:tcPr>
           <w:p>
             <w:r>
-              <w:t>32.78%</w:t>
+              <w:t>149.32%</w:t>
             </w:r>
           </w:p>
         </w:tc>
         <w:tc>
           <w:tcPr>
-            <w:tcW w:type="dxa" w:w="3437"/>
+            <w:tcW w:type="dxa" w:w="2578"/>
           </w:tcPr>
           <w:p>
             <w:r>
-              <w:t>82.68%</w:t>
+              <w:t>376.69%</w:t>
+            </w:r>
+          </w:p>
+        </w:tc>
+        <w:tc>
+          <w:tcPr>
+            <w:tcW w:type="dxa" w:w="2578"/>
+          </w:tcPr>
+          <w:p>
+            <w:r>
+              <w:t>350.40%</w:t>
             </w:r>
           </w:p>
         </w:tc>
@@ -675,7 +696,7 @@
       <w:tr>
         <w:tc>
           <w:tcPr>
-            <w:tcW w:type="dxa" w:w="3437"/>
+            <w:tcW w:type="dxa" w:w="2578"/>
           </w:tcPr>
           <w:p>
             <w:r>
@@ -685,21 +706,31 @@
         </w:tc>
         <w:tc>
           <w:tcPr>
-            <w:tcW w:type="dxa" w:w="3437"/>
+            <w:tcW w:type="dxa" w:w="2578"/>
           </w:tcPr>
           <w:p>
             <w:r>
-              <w:t>3.56%</w:t>
+              <w:t>11.94%</w:t>
             </w:r>
           </w:p>
         </w:tc>
         <w:tc>
           <w:tcPr>
-            <w:tcW w:type="dxa" w:w="3437"/>
+            <w:tcW w:type="dxa" w:w="2578"/>
           </w:tcPr>
           <w:p>
             <w:r>
-              <w:t>7.72%</w:t>
+              <w:t>21.27%</w:t>
+            </w:r>
+          </w:p>
+        </w:tc>
+        <w:tc>
+          <w:tcPr>
+            <w:tcW w:type="dxa" w:w="2578"/>
+          </w:tcPr>
+          <w:p>
+            <w:r>
+              <w:t>20.42%</w:t>
             </w:r>
           </w:p>
         </w:tc>
@@ -707,263 +738,7 @@
       <w:tr>
         <w:tc>
           <w:tcPr>
-            <w:tcW w:type="dxa" w:w="3437"/>
-          </w:tcPr>
-          <w:p>
-            <w:r>
-              <w:t>期末資金（元）</w:t>
-            </w:r>
-          </w:p>
-        </w:tc>
-        <w:tc>
-          <w:tcPr>
-            <w:tcW w:type="dxa" w:w="3437"/>
-          </w:tcPr>
-          <w:p>
-            <w:r>
-              <w:t>13,277,536.58</w:t>
-            </w:r>
-          </w:p>
-        </w:tc>
-        <w:tc>
-          <w:tcPr>
-            <w:tcW w:type="dxa" w:w="3437"/>
-          </w:tcPr>
-          <w:p>
-            <w:r>
-              <w:t>18,268,352.66</w:t>
-            </w:r>
-          </w:p>
-        </w:tc>
-      </w:tr>
-      <w:tr>
-        <w:tc>
-          <w:tcPr>
-            <w:tcW w:type="dxa" w:w="3437"/>
-          </w:tcPr>
-          <w:p>
-            <w:r>
-              <w:t>交易次數／段數</w:t>
-            </w:r>
-          </w:p>
-        </w:tc>
-        <w:tc>
-          <w:tcPr>
-            <w:tcW w:type="dxa" w:w="3437"/>
-          </w:tcPr>
-          <w:p>
-            <w:r>
-              <w:t>147</w:t>
-            </w:r>
-          </w:p>
-        </w:tc>
-        <w:tc>
-          <w:tcPr>
-            <w:tcW w:type="dxa" w:w="3437"/>
-          </w:tcPr>
-          <w:p>
-            <w:r>
-              <w:t>98</w:t>
-            </w:r>
-          </w:p>
-        </w:tc>
-      </w:tr>
-      <w:tr>
-        <w:tc>
-          <w:tcPr>
-            <w:tcW w:type="dxa" w:w="3437"/>
-          </w:tcPr>
-          <w:p>
-            <w:r>
-              <w:t>勝率</w:t>
-            </w:r>
-          </w:p>
-        </w:tc>
-        <w:tc>
-          <w:tcPr>
-            <w:tcW w:type="dxa" w:w="3437"/>
-          </w:tcPr>
-          <w:p>
-            <w:r>
-              <w:t>51.70%</w:t>
-            </w:r>
-          </w:p>
-        </w:tc>
-        <w:tc>
-          <w:tcPr>
-            <w:tcW w:type="dxa" w:w="3437"/>
-          </w:tcPr>
-          <w:p>
-            <w:r>
-              <w:t>67.35%</w:t>
-            </w:r>
-          </w:p>
-        </w:tc>
-      </w:tr>
-      <w:tr>
-        <w:tc>
-          <w:tcPr>
-            <w:tcW w:type="dxa" w:w="3437"/>
-          </w:tcPr>
-          <w:p>
-            <w:r>
-              <w:t>Profit Factor</w:t>
-            </w:r>
-          </w:p>
-        </w:tc>
-        <w:tc>
-          <w:tcPr>
-            <w:tcW w:type="dxa" w:w="3437"/>
-          </w:tcPr>
-          <w:p>
-            <w:r>
-              <w:t>2.197</w:t>
-            </w:r>
-          </w:p>
-        </w:tc>
-        <w:tc>
-          <w:tcPr>
-            <w:tcW w:type="dxa" w:w="3437"/>
-          </w:tcPr>
-          <w:p>
-            <w:r>
-              <w:t>2.846</w:t>
-            </w:r>
-          </w:p>
-        </w:tc>
-      </w:tr>
-      <w:tr>
-        <w:tc>
-          <w:tcPr>
-            <w:tcW w:type="dxa" w:w="3437"/>
-          </w:tcPr>
-          <w:p>
-            <w:r>
-              <w:t>最大回撤（元）</w:t>
-            </w:r>
-          </w:p>
-        </w:tc>
-        <w:tc>
-          <w:tcPr>
-            <w:tcW w:type="dxa" w:w="3437"/>
-          </w:tcPr>
-          <w:p>
-            <w:r>
-              <w:t>487,118.76</w:t>
-            </w:r>
-          </w:p>
-        </w:tc>
-        <w:tc>
-          <w:tcPr>
-            <w:tcW w:type="dxa" w:w="3437"/>
-          </w:tcPr>
-          <w:p>
-            <w:r>
-              <w:t>1,693,859.80</w:t>
-            </w:r>
-          </w:p>
-        </w:tc>
-      </w:tr>
-      <w:tr>
-        <w:tc>
-          <w:tcPr>
-            <w:tcW w:type="dxa" w:w="3437"/>
-          </w:tcPr>
-          <w:p>
-            <w:r>
-              <w:t>最大回撤（%）</w:t>
-            </w:r>
-          </w:p>
-        </w:tc>
-        <w:tc>
-          <w:tcPr>
-            <w:tcW w:type="dxa" w:w="3437"/>
-          </w:tcPr>
-          <w:p>
-            <w:r>
-              <w:t>3.93%</w:t>
-            </w:r>
-          </w:p>
-        </w:tc>
-        <w:tc>
-          <w:tcPr>
-            <w:tcW w:type="dxa" w:w="3437"/>
-          </w:tcPr>
-          <w:p>
-            <w:r>
-              <w:t>11.12%</w:t>
-            </w:r>
-          </w:p>
-        </w:tc>
-      </w:tr>
-      <w:tr>
-        <w:tc>
-          <w:tcPr>
-            <w:tcW w:type="dxa" w:w="3437"/>
-          </w:tcPr>
-          <w:p>
-            <w:r>
-              <w:t>最長回撤：交易日</w:t>
-            </w:r>
-          </w:p>
-        </w:tc>
-        <w:tc>
-          <w:tcPr>
-            <w:tcW w:type="dxa" w:w="3437"/>
-          </w:tcPr>
-          <w:p>
-            <w:r>
-              <w:t>482</w:t>
-            </w:r>
-          </w:p>
-        </w:tc>
-        <w:tc>
-          <w:tcPr>
-            <w:tcW w:type="dxa" w:w="3437"/>
-          </w:tcPr>
-          <w:p>
-            <w:r>
-              <w:t>366</w:t>
-            </w:r>
-          </w:p>
-        </w:tc>
-      </w:tr>
-      <w:tr>
-        <w:tc>
-          <w:tcPr>
-            <w:tcW w:type="dxa" w:w="3437"/>
-          </w:tcPr>
-          <w:p>
-            <w:r>
-              <w:t>最長回撤：日曆日</w:t>
-            </w:r>
-          </w:p>
-        </w:tc>
-        <w:tc>
-          <w:tcPr>
-            <w:tcW w:type="dxa" w:w="3437"/>
-          </w:tcPr>
-          <w:p>
-            <w:r>
-              <w:t>722</w:t>
-            </w:r>
-          </w:p>
-        </w:tc>
-        <w:tc>
-          <w:tcPr>
-            <w:tcW w:type="dxa" w:w="3437"/>
-          </w:tcPr>
-          <w:p>
-            <w:r>
-              <w:t>555</w:t>
-            </w:r>
-          </w:p>
-        </w:tc>
-      </w:tr>
-      <w:tr>
-        <w:tc>
-          <w:tcPr>
-            <w:tcW w:type="dxa" w:w="3437"/>
+            <w:tcW w:type="dxa" w:w="2578"/>
           </w:tcPr>
           <w:p>
             <w:r>
@@ -973,21 +748,31 @@
         </w:tc>
         <w:tc>
           <w:tcPr>
-            <w:tcW w:type="dxa" w:w="3437"/>
+            <w:tcW w:type="dxa" w:w="2578"/>
           </w:tcPr>
           <w:p>
             <w:r>
-              <w:t>1.302</w:t>
+              <w:t>1.367</w:t>
             </w:r>
           </w:p>
         </w:tc>
         <w:tc>
           <w:tcPr>
-            <w:tcW w:type="dxa" w:w="3437"/>
+            <w:tcW w:type="dxa" w:w="2578"/>
           </w:tcPr>
           <w:p>
             <w:r>
-              <w:t>1.108</w:t>
+              <w:t>1.147</w:t>
+            </w:r>
+          </w:p>
+        </w:tc>
+        <w:tc>
+          <w:tcPr>
+            <w:tcW w:type="dxa" w:w="2578"/>
+          </w:tcPr>
+          <w:p>
+            <w:r>
+              <w:t>1.064</w:t>
             </w:r>
           </w:p>
         </w:tc>
@@ -995,31 +780,41 @@
       <w:tr>
         <w:tc>
           <w:tcPr>
-            <w:tcW w:type="dxa" w:w="3437"/>
+            <w:tcW w:type="dxa" w:w="2578"/>
           </w:tcPr>
           <w:p>
             <w:r>
-              <w:t>Calmar</w:t>
+              <w:t>最大回撤</w:t>
             </w:r>
           </w:p>
         </w:tc>
         <w:tc>
           <w:tcPr>
-            <w:tcW w:type="dxa" w:w="3437"/>
+            <w:tcW w:type="dxa" w:w="2578"/>
           </w:tcPr>
           <w:p>
             <w:r>
-              <w:t>0.906</w:t>
+              <w:t>12.72%</w:t>
             </w:r>
           </w:p>
         </w:tc>
         <w:tc>
           <w:tcPr>
-            <w:tcW w:type="dxa" w:w="3437"/>
+            <w:tcW w:type="dxa" w:w="2578"/>
           </w:tcPr>
           <w:p>
             <w:r>
-              <w:t>0.694</w:t>
+              <w:t>28.64%</w:t>
+            </w:r>
+          </w:p>
+        </w:tc>
+        <w:tc>
+          <w:tcPr>
+            <w:tcW w:type="dxa" w:w="2578"/>
+          </w:tcPr>
+          <w:p>
+            <w:r>
+              <w:t>31.63%</w:t>
             </w:r>
           </w:p>
         </w:tc>
@@ -1027,7 +822,7 @@
       <w:tr>
         <w:tc>
           <w:tcPr>
-            <w:tcW w:type="dxa" w:w="3437"/>
+            <w:tcW w:type="dxa" w:w="2578"/>
           </w:tcPr>
           <w:p>
             <w:r>
@@ -1037,53 +832,31 @@
         </w:tc>
         <w:tc>
           <w:tcPr>
-            <w:tcW w:type="dxa" w:w="3437"/>
+            <w:tcW w:type="dxa" w:w="2578"/>
           </w:tcPr>
           <w:p>
             <w:r>
-              <w:t>2.82%</w:t>
+              <w:t>8.84%</w:t>
             </w:r>
           </w:p>
         </w:tc>
         <w:tc>
           <w:tcPr>
-            <w:tcW w:type="dxa" w:w="3437"/>
+            <w:tcW w:type="dxa" w:w="2578"/>
           </w:tcPr>
           <w:p>
             <w:r>
-              <w:t>7.20%</w:t>
-            </w:r>
-          </w:p>
-        </w:tc>
-      </w:tr>
-      <w:tr>
-        <w:tc>
-          <w:tcPr>
-            <w:tcW w:type="dxa" w:w="3437"/>
-          </w:tcPr>
-          <w:p>
-            <w:r>
-              <w:t>全部成本（元）</w:t>
+              <w:t>19.03%</w:t>
             </w:r>
           </w:p>
         </w:tc>
         <w:tc>
           <w:tcPr>
-            <w:tcW w:type="dxa" w:w="3437"/>
+            <w:tcW w:type="dxa" w:w="2578"/>
           </w:tcPr>
           <w:p>
             <w:r>
-              <w:t>192,063.42</w:t>
-            </w:r>
-          </w:p>
-        </w:tc>
-        <w:tc>
-          <w:tcPr>
-            <w:tcW w:type="dxa" w:w="3437"/>
-          </w:tcPr>
-          <w:p>
-            <w:r>
-              <w:t>102,847.34</w:t>
+              <w:t>20.00%</w:t>
             </w:r>
           </w:p>
         </w:tc>
@@ -1091,7 +864,17 @@
     </w:tbl>
     <w:p>
       <w:r>
-        <w:t>同期間、同本金、同一口。策略按一次進場至訊號退出計交易，合併轉倉成本；基準在每次換月結束一段交易。因此勝率／PF的持有頻率不同。MDD金額及比例各自取全期最大值，可能發生於不同日期。</w:t>
+        <w:t>三條曲線從同一參考基數2,195,000.00元開始：首日TX開盤10,975點×200元。V04與TX比較沿用原始一口逐日淨損益及全部交易成本，僅改變報酬與回撤分母；加權指數以首日開盤11,037.26點至逐日收盤計價格報酬，未含股息，屬市場參考而非可直接成交的期貨帳本。</w:t>
+      </w:r>
+    </w:p>
+    <w:p>
+      <w:r>
+        <w:t>原一千萬元、固定一口帳戶的策略報酬32.78%、MDD 3.93%；TX基準報酬82.68%、MDD 11.12%。其餘資金未投入市場，因此該口徑主要用於核對原帳務，不能單憑較小回撤宣稱策略優於大盤。</w:t>
+      </w:r>
+    </w:p>
+    <w:p>
+      <w:r>
+        <w:t>年度報酬：共同比較基數</w:t>
       </w:r>
     </w:p>
     <w:tbl>
@@ -1101,16 +884,15 @@
         <w:tblLook w:firstColumn="1" w:firstRow="1" w:lastColumn="0" w:lastRow="0" w:noHBand="0" w:noVBand="1" w:val="04A0"/>
       </w:tblPr>
       <w:tblGrid>
-        <w:gridCol w:w="2062"/>
-        <w:gridCol w:w="2062"/>
-        <w:gridCol w:w="2062"/>
-        <w:gridCol w:w="2062"/>
-        <w:gridCol w:w="2062"/>
+        <w:gridCol w:w="2578"/>
+        <w:gridCol w:w="2578"/>
+        <w:gridCol w:w="2578"/>
+        <w:gridCol w:w="2578"/>
       </w:tblGrid>
       <w:tr>
         <w:tc>
           <w:tcPr>
-            <w:tcW w:type="dxa" w:w="2062"/>
+            <w:tcW w:type="dxa" w:w="2578"/>
           </w:tcPr>
           <w:p>
             <w:r>
@@ -1120,41 +902,31 @@
         </w:tc>
         <w:tc>
           <w:tcPr>
-            <w:tcW w:type="dxa" w:w="2062"/>
+            <w:tcW w:type="dxa" w:w="2578"/>
           </w:tcPr>
           <w:p>
             <w:r>
-              <w:t>策略損益（元）</w:t>
+              <w:t>V04</w:t>
             </w:r>
           </w:p>
         </w:tc>
         <w:tc>
           <w:tcPr>
-            <w:tcW w:type="dxa" w:w="2062"/>
+            <w:tcW w:type="dxa" w:w="2578"/>
           </w:tcPr>
           <w:p>
             <w:r>
-              <w:t>策略報酬</w:t>
+              <w:t>TX一口</w:t>
             </w:r>
           </w:p>
         </w:tc>
         <w:tc>
           <w:tcPr>
-            <w:tcW w:type="dxa" w:w="2062"/>
+            <w:tcW w:type="dxa" w:w="2578"/>
           </w:tcPr>
           <w:p>
             <w:r>
-              <w:t>基準損益（元）</w:t>
-            </w:r>
-          </w:p>
-        </w:tc>
-        <w:tc>
-          <w:tcPr>
-            <w:tcW w:type="dxa" w:w="2062"/>
-          </w:tcPr>
-          <w:p>
-            <w:r>
-              <w:t>基準報酬</w:t>
+              <w:t>加權指數</w:t>
             </w:r>
           </w:p>
         </w:tc>
@@ -1162,7 +934,7 @@
       <w:tr>
         <w:tc>
           <w:tcPr>
-            <w:tcW w:type="dxa" w:w="2062"/>
+            <w:tcW w:type="dxa" w:w="2578"/>
           </w:tcPr>
           <w:p>
             <w:r>
@@ -1172,41 +944,31 @@
         </w:tc>
         <w:tc>
           <w:tcPr>
-            <w:tcW w:type="dxa" w:w="2062"/>
+            <w:tcW w:type="dxa" w:w="2578"/>
           </w:tcPr>
           <w:p>
             <w:r>
-              <w:t>-144,387</w:t>
+              <w:t>-6.58%</w:t>
             </w:r>
           </w:p>
         </w:tc>
         <w:tc>
           <w:tcPr>
-            <w:tcW w:type="dxa" w:w="2062"/>
+            <w:tcW w:type="dxa" w:w="2578"/>
           </w:tcPr>
           <w:p>
             <w:r>
-              <w:t>-1.44%</w:t>
+              <w:t>-11.25%</w:t>
             </w:r>
           </w:p>
         </w:tc>
         <w:tc>
           <w:tcPr>
-            <w:tcW w:type="dxa" w:w="2062"/>
+            <w:tcW w:type="dxa" w:w="2578"/>
           </w:tcPr>
           <w:p>
             <w:r>
-              <w:t>-247,015</w:t>
-            </w:r>
-          </w:p>
-        </w:tc>
-        <w:tc>
-          <w:tcPr>
-            <w:tcW w:type="dxa" w:w="2062"/>
-          </w:tcPr>
-          <w:p>
-            <w:r>
-              <w:t>-2.47%</w:t>
+              <w:t>-11.87%</w:t>
             </w:r>
           </w:p>
         </w:tc>
@@ -1214,7 +976,7 @@
       <w:tr>
         <w:tc>
           <w:tcPr>
-            <w:tcW w:type="dxa" w:w="2062"/>
+            <w:tcW w:type="dxa" w:w="2578"/>
           </w:tcPr>
           <w:p>
             <w:r>
@@ -1224,41 +986,31 @@
         </w:tc>
         <w:tc>
           <w:tcPr>
-            <w:tcW w:type="dxa" w:w="2062"/>
+            <w:tcW w:type="dxa" w:w="2578"/>
           </w:tcPr>
           <w:p>
             <w:r>
-              <w:t>439,590</w:t>
+              <w:t>21.44%</w:t>
             </w:r>
           </w:p>
         </w:tc>
         <w:tc>
           <w:tcPr>
-            <w:tcW w:type="dxa" w:w="2062"/>
+            <w:tcW w:type="dxa" w:w="2578"/>
           </w:tcPr>
           <w:p>
             <w:r>
-              <w:t>4.46%</w:t>
+              <w:t>28.18%</w:t>
             </w:r>
           </w:p>
         </w:tc>
         <w:tc>
           <w:tcPr>
-            <w:tcW w:type="dxa" w:w="2062"/>
+            <w:tcW w:type="dxa" w:w="2578"/>
           </w:tcPr>
           <w:p>
             <w:r>
-              <w:t>548,965</w:t>
-            </w:r>
-          </w:p>
-        </w:tc>
-        <w:tc>
-          <w:tcPr>
-            <w:tcW w:type="dxa" w:w="2062"/>
-          </w:tcPr>
-          <w:p>
-            <w:r>
-              <w:t>5.63%</w:t>
+              <w:t>23.33%</w:t>
             </w:r>
           </w:p>
         </w:tc>
@@ -1266,7 +1018,7 @@
       <w:tr>
         <w:tc>
           <w:tcPr>
-            <w:tcW w:type="dxa" w:w="2062"/>
+            <w:tcW w:type="dxa" w:w="2578"/>
           </w:tcPr>
           <w:p>
             <w:r>
@@ -1276,17 +1028,49 @@
         </w:tc>
         <w:tc>
           <w:tcPr>
-            <w:tcW w:type="dxa" w:w="2062"/>
+            <w:tcW w:type="dxa" w:w="2578"/>
           </w:tcPr>
           <w:p>
             <w:r>
-              <w:t>639,655</w:t>
+              <w:t>25.69%</w:t>
             </w:r>
           </w:p>
         </w:tc>
         <w:tc>
           <w:tcPr>
-            <w:tcW w:type="dxa" w:w="2062"/>
+            <w:tcW w:type="dxa" w:w="2578"/>
+          </w:tcPr>
+          <w:p>
+            <w:r>
+              <w:t>29.38%</w:t>
+            </w:r>
+          </w:p>
+        </w:tc>
+        <w:tc>
+          <w:tcPr>
+            <w:tcW w:type="dxa" w:w="2578"/>
+          </w:tcPr>
+          <w:p>
+            <w:r>
+              <w:t>22.80%</w:t>
+            </w:r>
+          </w:p>
+        </w:tc>
+      </w:tr>
+      <w:tr>
+        <w:tc>
+          <w:tcPr>
+            <w:tcW w:type="dxa" w:w="2578"/>
+          </w:tcPr>
+          <w:p>
+            <w:r>
+              <w:t>2021</w:t>
+            </w:r>
+          </w:p>
+        </w:tc>
+        <w:tc>
+          <w:tcPr>
+            <w:tcW w:type="dxa" w:w="2578"/>
           </w:tcPr>
           <w:p>
             <w:r>
@@ -1296,21 +1080,21 @@
         </w:tc>
         <w:tc>
           <w:tcPr>
-            <w:tcW w:type="dxa" w:w="2062"/>
+            <w:tcW w:type="dxa" w:w="2578"/>
           </w:tcPr>
           <w:p>
             <w:r>
-              <w:t>733,649</w:t>
+              <w:t>27.37%</w:t>
             </w:r>
           </w:p>
         </w:tc>
         <w:tc>
           <w:tcPr>
-            <w:tcW w:type="dxa" w:w="2062"/>
+            <w:tcW w:type="dxa" w:w="2578"/>
           </w:tcPr>
           <w:p>
             <w:r>
-              <w:t>7.12%</w:t>
+              <w:t>23.66%</w:t>
             </w:r>
           </w:p>
         </w:tc>
@@ -1318,59 +1102,7 @@
       <w:tr>
         <w:tc>
           <w:tcPr>
-            <w:tcW w:type="dxa" w:w="2062"/>
-          </w:tcPr>
-          <w:p>
-            <w:r>
-              <w:t>2021</w:t>
-            </w:r>
-          </w:p>
-        </w:tc>
-        <w:tc>
-          <w:tcPr>
-            <w:tcW w:type="dxa" w:w="2062"/>
-          </w:tcPr>
-          <w:p>
-            <w:r>
-              <w:t>194,363</w:t>
-            </w:r>
-          </w:p>
-        </w:tc>
-        <w:tc>
-          <w:tcPr>
-            <w:tcW w:type="dxa" w:w="2062"/>
-          </w:tcPr>
-          <w:p>
-            <w:r>
-              <w:t>1.78%</w:t>
-            </w:r>
-          </w:p>
-        </w:tc>
-        <w:tc>
-          <w:tcPr>
-            <w:tcW w:type="dxa" w:w="2062"/>
-          </w:tcPr>
-          <w:p>
-            <w:r>
-              <w:t>884,182</w:t>
-            </w:r>
-          </w:p>
-        </w:tc>
-        <w:tc>
-          <w:tcPr>
-            <w:tcW w:type="dxa" w:w="2062"/>
-          </w:tcPr>
-          <w:p>
-            <w:r>
-              <w:t>8.01%</w:t>
-            </w:r>
-          </w:p>
-        </w:tc>
-      </w:tr>
-      <w:tr>
-        <w:tc>
-          <w:tcPr>
-            <w:tcW w:type="dxa" w:w="2062"/>
+            <w:tcW w:type="dxa" w:w="2578"/>
           </w:tcPr>
           <w:p>
             <w:r>
@@ -1380,41 +1112,31 @@
         </w:tc>
         <w:tc>
           <w:tcPr>
-            <w:tcW w:type="dxa" w:w="2062"/>
+            <w:tcW w:type="dxa" w:w="2578"/>
           </w:tcPr>
           <w:p>
             <w:r>
-              <w:t>-46,253</w:t>
+              <w:t>-1.39%</w:t>
             </w:r>
           </w:p>
         </w:tc>
         <w:tc>
           <w:tcPr>
-            <w:tcW w:type="dxa" w:w="2062"/>
+            <w:tcW w:type="dxa" w:w="2578"/>
           </w:tcPr>
           <w:p>
             <w:r>
-              <w:t>-0.42%</w:t>
+              <w:t>-15.17%</w:t>
             </w:r>
           </w:p>
         </w:tc>
         <w:tc>
           <w:tcPr>
-            <w:tcW w:type="dxa" w:w="2062"/>
+            <w:tcW w:type="dxa" w:w="2578"/>
           </w:tcPr>
           <w:p>
             <w:r>
-              <w:t>-624,106</w:t>
-            </w:r>
-          </w:p>
-        </w:tc>
-        <w:tc>
-          <w:tcPr>
-            <w:tcW w:type="dxa" w:w="2062"/>
-          </w:tcPr>
-          <w:p>
-            <w:r>
-              <w:t>-5.24%</w:t>
+              <w:t>-22.40%</w:t>
             </w:r>
           </w:p>
         </w:tc>
@@ -1422,7 +1144,7 @@
       <w:tr>
         <w:tc>
           <w:tcPr>
-            <w:tcW w:type="dxa" w:w="2062"/>
+            <w:tcW w:type="dxa" w:w="2578"/>
           </w:tcPr>
           <w:p>
             <w:r>
@@ -1432,41 +1154,31 @@
         </w:tc>
         <w:tc>
           <w:tcPr>
-            <w:tcW w:type="dxa" w:w="2062"/>
+            <w:tcW w:type="dxa" w:w="2578"/>
           </w:tcPr>
           <w:p>
             <w:r>
-              <w:t>192,431</w:t>
+              <w:t>5.87%</w:t>
             </w:r>
           </w:p>
         </w:tc>
         <w:tc>
           <w:tcPr>
-            <w:tcW w:type="dxa" w:w="2062"/>
+            <w:tcW w:type="dxa" w:w="2578"/>
           </w:tcPr>
           <w:p>
             <w:r>
-              <w:t>1.74%</w:t>
+              <w:t>23.25%</w:t>
             </w:r>
           </w:p>
         </w:tc>
         <w:tc>
           <w:tcPr>
-            <w:tcW w:type="dxa" w:w="2062"/>
+            <w:tcW w:type="dxa" w:w="2578"/>
           </w:tcPr>
           <w:p>
             <w:r>
-              <w:t>811,432</w:t>
-            </w:r>
-          </w:p>
-        </w:tc>
-        <w:tc>
-          <w:tcPr>
-            <w:tcW w:type="dxa" w:w="2062"/>
-          </w:tcPr>
-          <w:p>
-            <w:r>
-              <w:t>7.18%</w:t>
+              <w:t>26.83%</w:t>
             </w:r>
           </w:p>
         </w:tc>
@@ -1474,7 +1186,7 @@
       <w:tr>
         <w:tc>
           <w:tcPr>
-            <w:tcW w:type="dxa" w:w="2062"/>
+            <w:tcW w:type="dxa" w:w="2578"/>
           </w:tcPr>
           <w:p>
             <w:r>
@@ -1484,41 +1196,31 @@
         </w:tc>
         <w:tc>
           <w:tcPr>
-            <w:tcW w:type="dxa" w:w="2062"/>
+            <w:tcW w:type="dxa" w:w="2578"/>
           </w:tcPr>
           <w:p>
             <w:r>
-              <w:t>-21,064</w:t>
+              <w:t>-0.61%</w:t>
             </w:r>
           </w:p>
         </w:tc>
         <w:tc>
           <w:tcPr>
-            <w:tcW w:type="dxa" w:w="2062"/>
+            <w:tcW w:type="dxa" w:w="2578"/>
           </w:tcPr>
           <w:p>
             <w:r>
-              <w:t>-0.19%</w:t>
+              <w:t>23.22%</w:t>
             </w:r>
           </w:p>
         </w:tc>
         <w:tc>
           <w:tcPr>
-            <w:tcW w:type="dxa" w:w="2062"/>
+            <w:tcW w:type="dxa" w:w="2578"/>
           </w:tcPr>
           <w:p>
             <w:r>
-              <w:t>999,143</w:t>
-            </w:r>
-          </w:p>
-        </w:tc>
-        <w:tc>
-          <w:tcPr>
-            <w:tcW w:type="dxa" w:w="2062"/>
-          </w:tcPr>
-          <w:p>
-            <w:r>
-              <w:t>8.25%</w:t>
+              <w:t>28.47%</w:t>
             </w:r>
           </w:p>
         </w:tc>
@@ -1526,7 +1228,7 @@
       <w:tr>
         <w:tc>
           <w:tcPr>
-            <w:tcW w:type="dxa" w:w="2062"/>
+            <w:tcW w:type="dxa" w:w="2578"/>
           </w:tcPr>
           <w:p>
             <w:r>
@@ -1536,41 +1238,31 @@
         </w:tc>
         <w:tc>
           <w:tcPr>
-            <w:tcW w:type="dxa" w:w="2062"/>
+            <w:tcW w:type="dxa" w:w="2578"/>
           </w:tcPr>
           <w:p>
             <w:r>
-              <w:t>771,097</w:t>
+              <w:t>22.35%</w:t>
             </w:r>
           </w:p>
         </w:tc>
         <w:tc>
           <w:tcPr>
-            <w:tcW w:type="dxa" w:w="2062"/>
+            <w:tcW w:type="dxa" w:w="2578"/>
           </w:tcPr>
           <w:p>
             <w:r>
-              <w:t>6.85%</w:t>
+              <w:t>23.92%</w:t>
             </w:r>
           </w:p>
         </w:tc>
         <w:tc>
           <w:tcPr>
-            <w:tcW w:type="dxa" w:w="2062"/>
+            <w:tcW w:type="dxa" w:w="2578"/>
           </w:tcPr>
           <w:p>
             <w:r>
-              <w:t>1,268,113</w:t>
-            </w:r>
-          </w:p>
-        </w:tc>
-        <w:tc>
-          <w:tcPr>
-            <w:tcW w:type="dxa" w:w="2062"/>
-          </w:tcPr>
-          <w:p>
-            <w:r>
-              <w:t>9.68%</w:t>
+              <w:t>25.74%</w:t>
             </w:r>
           </w:p>
         </w:tc>
@@ -1578,7 +1270,7 @@
       <w:tr>
         <w:tc>
           <w:tcPr>
-            <w:tcW w:type="dxa" w:w="2062"/>
+            <w:tcW w:type="dxa" w:w="2578"/>
           </w:tcPr>
           <w:p>
             <w:r>
@@ -1588,41 +1280,31 @@
         </w:tc>
         <w:tc>
           <w:tcPr>
-            <w:tcW w:type="dxa" w:w="2062"/>
+            <w:tcW w:type="dxa" w:w="2578"/>
           </w:tcPr>
           <w:p>
             <w:r>
-              <w:t>1,252,106</w:t>
+              <w:t>29.67%</w:t>
             </w:r>
           </w:p>
         </w:tc>
         <w:tc>
           <w:tcPr>
-            <w:tcW w:type="dxa" w:w="2062"/>
+            <w:tcW w:type="dxa" w:w="2578"/>
           </w:tcPr>
           <w:p>
             <w:r>
-              <w:t>10.41%</w:t>
+              <w:t>59.27%</w:t>
             </w:r>
           </w:p>
         </w:tc>
         <w:tc>
           <w:tcPr>
-            <w:tcW w:type="dxa" w:w="2062"/>
+            <w:tcW w:type="dxa" w:w="2578"/>
           </w:tcPr>
           <w:p>
             <w:r>
-              <w:t>3,893,988</w:t>
-            </w:r>
-          </w:p>
-        </w:tc>
-        <w:tc>
-          <w:tcPr>
-            <w:tcW w:type="dxa" w:w="2062"/>
-          </w:tcPr>
-          <w:p>
-            <w:r>
-              <w:t>27.09%</w:t>
+              <w:t>71.64%</w:t>
             </w:r>
           </w:p>
         </w:tc>
@@ -1630,7 +1312,7 @@
     </w:tbl>
     <w:p>
       <w:r>
-        <w:t>首尾年度可能僅涵蓋部分月份；年度報酬未年化，以該年首日損益前權益為分母。PF=淨正損益合計／淨負損益絕對值合計。最長回撤包含期末未恢復區間，含初始本金高點及空手日。</w:t>
+        <w:t>年度報酬以各年第一交易日前的權益為分母，首尾年度是不完整年份。Sharpe與回撤都依此共同基數重新計算；固定一口TX與加權指數的報酬不等同，包含基差、換月與期貨成交成本等差異。</w:t>
       </w:r>
     </w:p>
     <w:p>
@@ -1742,7 +1424,7 @@
     </w:tbl>
     <w:p>
       <w:r>
-        <w:t>圖一：左為線性Y軸、右為對數Y軸。兩者皆自10,000,000元起始並扣除所有成交與轉倉成本；log-y版本只改變視覺尺度，不改變任何報酬或風險計算。</w:t>
+        <w:t>圖一：左為線性Y軸、右為對數Y軸。三序列皆自共同起始名目價值2,195,000.00元（圖上為1倍）計算；V04與TX皆扣交易成本，加權指數為未含股息的價格指數。</w:t>
       </w:r>
     </w:p>
     <w:p>
@@ -1783,12 +1465,12 @@
     </w:p>
     <w:p>
       <w:r>
-        <w:t>圖二：日末權益相對含初始本金的歷史高點回撤。策略MDD 3.93%，基準11.12%；固定一口比較同時含有不同市場曝險。</w:t>
+        <w:t>圖二：相同起始曝險基數的權益回撤。V04 12.72%、TX 28.64%、加權指數 31.63%；V04空手期間仍保有現金，其市場持倉天數較少。</w:t>
       </w:r>
     </w:p>
     <w:p>
       <w:r>
-        <w:t>波動配平診斷（事後分析）</w:t>
+        <w:t>原一千萬元帳戶的波動配平診斷（事後分析）</w:t>
       </w:r>
     </w:p>
     <w:tbl>
@@ -2034,7 +1716,7 @@
     </w:p>
     <w:p>
       <w:r>
-        <w:t>固定一口仍是主結果，因為它可直接對應實際合約；波動配平只用來避免把策略較低MDD完全誤解為訊號本身的優勢。圖表也沒有盤中及夜盤評價，不能代表最壞瞬時損失或精確保證金風險。</w:t>
+        <w:t>同起始名目價值的三序列是主要市場比較；原一千萬元帳戶的波動配平另作診斷。圖表沒有盤中及夜盤評價，不能代表最壞瞬時損失或精確保證金風險。</w:t>
       </w:r>
     </w:p>
     <w:p>
@@ -2558,7 +2240,7 @@
     </w:p>
     <w:p>
       <w:r>
-        <w:t>因此3.93%的日末MDD不應解讀為單筆交易或盤中可能遭受的最大損失。完整名目價值資金限制降低了槓桿造成的風險，但無法消除跳空與流動性風險；若進一步評估實際交易可行性，仍需納入夜盤價格、盤中極端波動與開盤成交品質。</w:t>
+        <w:t>以一口TX起始名目價值計算，日末MDD為12.72%；一千萬元帳戶口徑為3.93%，因部分資金閒置而較低。兩者均非盤中可能遭受的最大損失；進一步評估仍需夜盤、盤中極端波動與開盤成交品質。</w:t>
       </w:r>
     </w:p>
     <w:p>
@@ -2581,7 +2263,7 @@
     </w:p>
     <w:p>
       <w:r>
-        <w:t>策略Sharpe為1.302、Calmar為0.906；固定一口Buy-and-Hold基準分別為1.108與0.694。策略MDD為3.93%、累積報酬32.78%；基準分別為11.12%與82.68%。兩者市場曝險不同，須搭配波動配平診斷解讀。</w:t>
+        <w:t>按首日一口TX名目價值比較，V04報酬149.32%、Sharpe 1.367、MDD 12.72%；同口TX買進持有為376.69%、1.147、28.64%；加權指數價格報酬為350.40%、1.064、31.63%。V04較低的市場持倉與回撤不能單獨證明超額報酬，其相對加權指數的歷史Information Ratio為-0.493。</w:t>
       </w:r>
     </w:p>
     <w:p>
@@ -2606,7 +2288,7 @@
     </w:p>
     <w:p>
       <w:r>
-        <w:t>綜合而言，法人交易強度與價格趨勢的雙條件策略具有規則簡單、交易邏輯可追溯及歷史風險效率較佳等特性，可作為後續研究候選。然而，現有證據不足以宣稱其具有穩定的樣本外超額報酬。若要提高結論可信度，應優先完成獨立樣本外驗證、夜盤與盤中風險評估，以及資料發布時點與歷史修訂的一致性檢查。</w:t>
+        <w:t>綜合而言，策略規則可追溯且歷史成本後報酬為正，但同期大盤與TX買進持有累積報酬均較高；V04主要呈現較少持倉及較低回撤，未能據此認定法人訊號創造穩定超額報酬。仍須完成獨立樣本外驗證、夜盤與盤中風險及資料發布時點檢查。</w:t>
       </w:r>
     </w:p>
     <w:p>
@@ -2625,11 +2307,13 @@
         <w:t>歷史行情：https://www.taifex.com.tw/cht/3/dlFutDailyMarketView</w:t>
         <w:br/>
         <w:t>FinMind：https://finmind.github.io/tutor/TaiwanMarket/Derivative/</w:t>
+        <w:br/>
+        <w:t>加權指數：臺灣證券交易所每日市場成交資訊與發行量加權股價指數歷史資料，來源與雜湊見source_audits/taiex_sources.json。</w:t>
       </w:r>
     </w:p>
     <w:p>
       <w:r>
-        <w:t>Sharpe＝日報酬平均／日報酬樣本標準差×√252；Calmar＝CAGR／最大回撤比例。所有績效指標均依相同初始資金、交易期間與成本假設計算；波動配平結果僅作風險尺度診斷，不列為主要可執行基準。</w:t>
+        <w:t>Sharpe＝日報酬平均／日報酬樣本標準差×√252；Calmar＝CAGR／最大回撤比例。主要比較將兩套實際一口TX損益置於相同起始名目價值，加權指數按首日開盤買入等值指數單位；指數未含股息及追蹤費用。原一千萬元帳戶與事後波動配平僅作補充。</w:t>
       </w:r>
     </w:p>
     <w:sectPr>

</xml_diff>

<commit_message>
Clarify one-contract risk comparison and equity drawdown
</commit_message>
<xml_diff>
--- a/TX_flow_trend_report.docx
+++ b/TX_flow_trend_report.docx
@@ -27,13 +27,13 @@
         <w:tblLook w:firstColumn="1" w:firstRow="1" w:lastColumn="0" w:lastRow="0" w:noHBand="0" w:noVBand="1" w:val="04A0"/>
       </w:tblPr>
       <w:tblGrid>
-        <w:gridCol w:w="5156"/>
-        <w:gridCol w:w="5156"/>
+        <w:gridCol w:w="5159"/>
+        <w:gridCol w:w="5159"/>
       </w:tblGrid>
       <w:tr>
         <w:tc>
           <w:tcPr>
-            <w:tcW w:type="dxa" w:w="5156"/>
+            <w:tcW w:type="dxa" w:w="5159"/>
           </w:tcPr>
           <w:p>
             <w:r>
@@ -43,7 +43,7 @@
         </w:tc>
         <w:tc>
           <w:tcPr>
-            <w:tcW w:type="dxa" w:w="5156"/>
+            <w:tcW w:type="dxa" w:w="5159"/>
           </w:tcPr>
           <w:p>
             <w:r>
@@ -55,7 +55,7 @@
       <w:tr>
         <w:tc>
           <w:tcPr>
-            <w:tcW w:type="dxa" w:w="5156"/>
+            <w:tcW w:type="dxa" w:w="5159"/>
           </w:tcPr>
           <w:p>
             <w:r>
@@ -65,7 +65,7 @@
         </w:tc>
         <w:tc>
           <w:tcPr>
-            <w:tcW w:type="dxa" w:w="5156"/>
+            <w:tcW w:type="dxa" w:w="5159"/>
           </w:tcPr>
           <w:p>
             <w:r>
@@ -77,7 +77,7 @@
       <w:tr>
         <w:tc>
           <w:tcPr>
-            <w:tcW w:type="dxa" w:w="5156"/>
+            <w:tcW w:type="dxa" w:w="5159"/>
           </w:tcPr>
           <w:p>
             <w:r>
@@ -87,7 +87,7 @@
         </w:tc>
         <w:tc>
           <w:tcPr>
-            <w:tcW w:type="dxa" w:w="5156"/>
+            <w:tcW w:type="dxa" w:w="5159"/>
           </w:tcPr>
           <w:p>
             <w:r>
@@ -99,7 +99,7 @@
       <w:tr>
         <w:tc>
           <w:tcPr>
-            <w:tcW w:type="dxa" w:w="5156"/>
+            <w:tcW w:type="dxa" w:w="5159"/>
           </w:tcPr>
           <w:p>
             <w:r>
@@ -109,7 +109,7 @@
         </w:tc>
         <w:tc>
           <w:tcPr>
-            <w:tcW w:type="dxa" w:w="5156"/>
+            <w:tcW w:type="dxa" w:w="5159"/>
           </w:tcPr>
           <w:p>
             <w:r>
@@ -121,7 +121,7 @@
       <w:tr>
         <w:tc>
           <w:tcPr>
-            <w:tcW w:type="dxa" w:w="5156"/>
+            <w:tcW w:type="dxa" w:w="5159"/>
           </w:tcPr>
           <w:p>
             <w:r>
@@ -131,7 +131,7 @@
         </w:tc>
         <w:tc>
           <w:tcPr>
-            <w:tcW w:type="dxa" w:w="5156"/>
+            <w:tcW w:type="dxa" w:w="5159"/>
           </w:tcPr>
           <w:p>
             <w:r>
@@ -153,17 +153,13 @@
     </w:p>
     <w:p>
       <w:r>
-        <w:t>主要結果：策略報酬32.78%、Sharpe 1.302、MDD 3.93%；基準報酬82.68%、Sharpe 1.108、MDD 11.12%。策略風險調整報酬較高，絕對收益較低。</w:t>
-      </w:r>
-    </w:p>
-    <w:p>
-      <w:r>
-        <w:br w:type="page"/>
+        <w:t>主要結果：策略報酬149.32%、Sharpe 1.367、MDD 12.72%；基準報酬376.69%、Sharpe 1.147、MDD 28.64%。策略風險調整報酬較高，絕對收益較低。</w:t>
       </w:r>
     </w:p>
     <w:p>
       <w:pPr>
         <w:pStyle w:val="Heading1"/>
+        <w:pageBreakBefore/>
       </w:pPr>
       <w:r>
         <w:t>2　指標定義、經濟意涵與訊號</w:t>
@@ -176,13 +172,13 @@
         <w:tblLook w:firstColumn="1" w:firstRow="1" w:lastColumn="0" w:lastRow="0" w:noHBand="0" w:noVBand="1" w:val="04A0"/>
       </w:tblPr>
       <w:tblGrid>
-        <w:gridCol w:w="5156"/>
-        <w:gridCol w:w="5156"/>
+        <w:gridCol w:w="5159"/>
+        <w:gridCol w:w="5159"/>
       </w:tblGrid>
       <w:tr>
         <w:tc>
           <w:tcPr>
-            <w:tcW w:type="dxa" w:w="5156"/>
+            <w:tcW w:type="dxa" w:w="5159"/>
           </w:tcPr>
           <w:p>
             <w:r>
@@ -192,7 +188,7 @@
         </w:tc>
         <w:tc>
           <w:tcPr>
-            <w:tcW w:type="dxa" w:w="5156"/>
+            <w:tcW w:type="dxa" w:w="5159"/>
           </w:tcPr>
           <w:p>
             <w:r>
@@ -204,7 +200,7 @@
       <w:tr>
         <w:tc>
           <w:tcPr>
-            <w:tcW w:type="dxa" w:w="5156"/>
+            <w:tcW w:type="dxa" w:w="5159"/>
           </w:tcPr>
           <w:p>
             <w:r>
@@ -214,7 +210,7 @@
         </w:tc>
         <w:tc>
           <w:tcPr>
-            <w:tcW w:type="dxa" w:w="5156"/>
+            <w:tcW w:type="dxa" w:w="5159"/>
           </w:tcPr>
           <w:p>
             <w:r>
@@ -226,7 +222,7 @@
       <w:tr>
         <w:tc>
           <w:tcPr>
-            <w:tcW w:type="dxa" w:w="5156"/>
+            <w:tcW w:type="dxa" w:w="5159"/>
           </w:tcPr>
           <w:p>
             <w:r>
@@ -236,7 +232,7 @@
         </w:tc>
         <w:tc>
           <w:tcPr>
-            <w:tcW w:type="dxa" w:w="5156"/>
+            <w:tcW w:type="dxa" w:w="5159"/>
           </w:tcPr>
           <w:p>
             <w:r>
@@ -248,7 +244,7 @@
       <w:tr>
         <w:tc>
           <w:tcPr>
-            <w:tcW w:type="dxa" w:w="5156"/>
+            <w:tcW w:type="dxa" w:w="5159"/>
           </w:tcPr>
           <w:p>
             <w:r>
@@ -258,7 +254,7 @@
         </w:tc>
         <w:tc>
           <w:tcPr>
-            <w:tcW w:type="dxa" w:w="5156"/>
+            <w:tcW w:type="dxa" w:w="5159"/>
           </w:tcPr>
           <w:p>
             <w:r>
@@ -270,7 +266,7 @@
       <w:tr>
         <w:tc>
           <w:tcPr>
-            <w:tcW w:type="dxa" w:w="5156"/>
+            <w:tcW w:type="dxa" w:w="5159"/>
           </w:tcPr>
           <w:p>
             <w:r>
@@ -280,7 +276,7 @@
         </w:tc>
         <w:tc>
           <w:tcPr>
-            <w:tcW w:type="dxa" w:w="5156"/>
+            <w:tcW w:type="dxa" w:w="5159"/>
           </w:tcPr>
           <w:p>
             <w:r>
@@ -292,7 +288,7 @@
       <w:tr>
         <w:tc>
           <w:tcPr>
-            <w:tcW w:type="dxa" w:w="5156"/>
+            <w:tcW w:type="dxa" w:w="5159"/>
           </w:tcPr>
           <w:p>
             <w:r>
@@ -302,7 +298,7 @@
         </w:tc>
         <w:tc>
           <w:tcPr>
-            <w:tcW w:type="dxa" w:w="5156"/>
+            <w:tcW w:type="dxa" w:w="5159"/>
           </w:tcPr>
           <w:p>
             <w:r>
@@ -314,7 +310,7 @@
       <w:tr>
         <w:tc>
           <w:tcPr>
-            <w:tcW w:type="dxa" w:w="5156"/>
+            <w:tcW w:type="dxa" w:w="5159"/>
           </w:tcPr>
           <w:p>
             <w:r>
@@ -324,7 +320,7 @@
         </w:tc>
         <w:tc>
           <w:tcPr>
-            <w:tcW w:type="dxa" w:w="5156"/>
+            <w:tcW w:type="dxa" w:w="5159"/>
           </w:tcPr>
           <w:p>
             <w:r>
@@ -365,13 +361,9 @@
       </w:r>
     </w:p>
     <w:p>
-      <w:r>
-        <w:br w:type="page"/>
-      </w:r>
-    </w:p>
-    <w:p>
       <w:pPr>
         <w:pStyle w:val="Heading1"/>
+        <w:pageBreakBefore/>
       </w:pPr>
       <w:r>
         <w:t>3　交易執行、轉倉與完整成本</w:t>
@@ -394,13 +386,13 @@
         <w:tblLook w:firstColumn="1" w:firstRow="1" w:lastColumn="0" w:lastRow="0" w:noHBand="0" w:noVBand="1" w:val="04A0"/>
       </w:tblPr>
       <w:tblGrid>
-        <w:gridCol w:w="5156"/>
-        <w:gridCol w:w="5156"/>
+        <w:gridCol w:w="5159"/>
+        <w:gridCol w:w="5159"/>
       </w:tblGrid>
       <w:tr>
         <w:tc>
           <w:tcPr>
-            <w:tcW w:type="dxa" w:w="5156"/>
+            <w:tcW w:type="dxa" w:w="5159"/>
           </w:tcPr>
           <w:p>
             <w:r>
@@ -410,7 +402,7 @@
         </w:tc>
         <w:tc>
           <w:tcPr>
-            <w:tcW w:type="dxa" w:w="5156"/>
+            <w:tcW w:type="dxa" w:w="5159"/>
           </w:tcPr>
           <w:p>
             <w:r>
@@ -422,21 +414,21 @@
       <w:tr>
         <w:tc>
           <w:tcPr>
-            <w:tcW w:type="dxa" w:w="5156"/>
+            <w:tcW w:type="dxa" w:w="5159"/>
           </w:tcPr>
           <w:p>
             <w:r>
-              <w:t>本金／口數／乘數</w:t>
+              <w:t>起始資金／口數／乘數</w:t>
             </w:r>
           </w:p>
         </w:tc>
         <w:tc>
           <w:tcPr>
-            <w:tcW w:type="dxa" w:w="5156"/>
+            <w:tcW w:type="dxa" w:w="5159"/>
           </w:tcPr>
           <w:p>
             <w:r>
-              <w:t>本金1,000萬元；固定一口、不加碼；每點200元。</w:t>
+              <w:t>共同起始資金2,195,000.00元，等於首日TX開盤價乘以每點200元；持倉時固定一口，不加碼。</w:t>
             </w:r>
           </w:p>
         </w:tc>
@@ -444,7 +436,7 @@
       <w:tr>
         <w:tc>
           <w:tcPr>
-            <w:tcW w:type="dxa" w:w="5156"/>
+            <w:tcW w:type="dxa" w:w="5159"/>
           </w:tcPr>
           <w:p>
             <w:r>
@@ -454,7 +446,7 @@
         </w:tc>
         <w:tc>
           <w:tcPr>
-            <w:tcW w:type="dxa" w:w="5156"/>
+            <w:tcW w:type="dxa" w:w="5159"/>
           </w:tcPr>
           <w:p>
             <w:r>
@@ -466,7 +458,7 @@
       <w:tr>
         <w:tc>
           <w:tcPr>
-            <w:tcW w:type="dxa" w:w="5156"/>
+            <w:tcW w:type="dxa" w:w="5159"/>
           </w:tcPr>
           <w:p>
             <w:r>
@@ -476,7 +468,7 @@
         </w:tc>
         <w:tc>
           <w:tcPr>
-            <w:tcW w:type="dxa" w:w="5156"/>
+            <w:tcW w:type="dxa" w:w="5159"/>
           </w:tcPr>
           <w:p>
             <w:r>
@@ -488,7 +480,7 @@
       <w:tr>
         <w:tc>
           <w:tcPr>
-            <w:tcW w:type="dxa" w:w="5156"/>
+            <w:tcW w:type="dxa" w:w="5159"/>
           </w:tcPr>
           <w:p>
             <w:r>
@@ -498,7 +490,7 @@
         </w:tc>
         <w:tc>
           <w:tcPr>
-            <w:tcW w:type="dxa" w:w="5156"/>
+            <w:tcW w:type="dxa" w:w="5159"/>
           </w:tcPr>
           <w:p>
             <w:r>
@@ -510,7 +502,7 @@
       <w:tr>
         <w:tc>
           <w:tcPr>
-            <w:tcW w:type="dxa" w:w="5156"/>
+            <w:tcW w:type="dxa" w:w="5159"/>
           </w:tcPr>
           <w:p>
             <w:r>
@@ -520,11 +512,11 @@
         </w:tc>
         <w:tc>
           <w:tcPr>
-            <w:tcW w:type="dxa" w:w="5156"/>
+            <w:tcW w:type="dxa" w:w="5159"/>
           </w:tcPr>
           <w:p>
             <w:r>
-              <w:t>資金足以覆蓋完整契約名目價值及估計成本；全期通過。未使用保證金槓桿或重建歷史追繳。</w:t>
+              <w:t>共同起始資金不代表歷史保證金要求；未重建逐日保證金與追繳。全期策略與固定一口基準權益均維持正值。</w:t>
             </w:r>
           </w:p>
         </w:tc>
@@ -532,7 +524,7 @@
       <w:tr>
         <w:tc>
           <w:tcPr>
-            <w:tcW w:type="dxa" w:w="5156"/>
+            <w:tcW w:type="dxa" w:w="5159"/>
           </w:tcPr>
           <w:p>
             <w:r>
@@ -542,11 +534,11 @@
         </w:tc>
         <w:tc>
           <w:tcPr>
-            <w:tcW w:type="dxa" w:w="5156"/>
+            <w:tcW w:type="dxa" w:w="5159"/>
           </w:tcPr>
           <w:p>
             <w:r>
-              <w:t>用收盤價評價總權益，非以每日結算價重建現金流。日損益／前日權益，含空手日。</w:t>
+              <w:t>以共同起始資金逐日累加扣除全部成本後的淨損益，得到日末權益曲線；回撤取權益相對歷史高點的最大跌幅。日報酬為當日淨損益／前日權益，含空手日。</w:t>
             </w:r>
           </w:p>
         </w:tc>
@@ -554,7 +546,7 @@
       <w:tr>
         <w:tc>
           <w:tcPr>
-            <w:tcW w:type="dxa" w:w="5156"/>
+            <w:tcW w:type="dxa" w:w="5159"/>
           </w:tcPr>
           <w:p>
             <w:r>
@@ -564,7 +556,7 @@
         </w:tc>
         <w:tc>
           <w:tcPr>
-            <w:tcW w:type="dxa" w:w="5156"/>
+            <w:tcW w:type="dxa" w:w="5159"/>
           </w:tcPr>
           <w:p>
             <w:r>
@@ -585,13 +577,9 @@
       </w:r>
     </w:p>
     <w:p>
-      <w:r>
-        <w:br w:type="page"/>
-      </w:r>
-    </w:p>
-    <w:p>
       <w:pPr>
         <w:pStyle w:val="Heading1"/>
+        <w:pageBreakBefore/>
       </w:pPr>
       <w:r>
         <w:t>4　績效指標與年度比較</w:t>
@@ -604,14 +592,14 @@
         <w:tblLook w:firstColumn="1" w:firstRow="1" w:lastColumn="0" w:lastRow="0" w:noHBand="0" w:noVBand="1" w:val="04A0"/>
       </w:tblPr>
       <w:tblGrid>
-        <w:gridCol w:w="3437"/>
-        <w:gridCol w:w="3437"/>
-        <w:gridCol w:w="3437"/>
+        <w:gridCol w:w="3439"/>
+        <w:gridCol w:w="3439"/>
+        <w:gridCol w:w="3439"/>
       </w:tblGrid>
       <w:tr>
         <w:tc>
           <w:tcPr>
-            <w:tcW w:type="dxa" w:w="3437"/>
+            <w:tcW w:type="dxa" w:w="3439"/>
           </w:tcPr>
           <w:p>
             <w:r>
@@ -621,7 +609,7 @@
         </w:tc>
         <w:tc>
           <w:tcPr>
-            <w:tcW w:type="dxa" w:w="3437"/>
+            <w:tcW w:type="dxa" w:w="3439"/>
           </w:tcPr>
           <w:p>
             <w:r>
@@ -631,7 +619,7 @@
         </w:tc>
         <w:tc>
           <w:tcPr>
-            <w:tcW w:type="dxa" w:w="3437"/>
+            <w:tcW w:type="dxa" w:w="3439"/>
           </w:tcPr>
           <w:p>
             <w:r>
@@ -643,7 +631,7 @@
       <w:tr>
         <w:tc>
           <w:tcPr>
-            <w:tcW w:type="dxa" w:w="3437"/>
+            <w:tcW w:type="dxa" w:w="3439"/>
           </w:tcPr>
           <w:p>
             <w:r>
@@ -653,21 +641,21 @@
         </w:tc>
         <w:tc>
           <w:tcPr>
-            <w:tcW w:type="dxa" w:w="3437"/>
+            <w:tcW w:type="dxa" w:w="3439"/>
           </w:tcPr>
           <w:p>
             <w:r>
-              <w:t>32.78%</w:t>
+              <w:t>149.32%</w:t>
             </w:r>
           </w:p>
         </w:tc>
         <w:tc>
           <w:tcPr>
-            <w:tcW w:type="dxa" w:w="3437"/>
+            <w:tcW w:type="dxa" w:w="3439"/>
           </w:tcPr>
           <w:p>
             <w:r>
-              <w:t>82.68%</w:t>
+              <w:t>376.69%</w:t>
             </w:r>
           </w:p>
         </w:tc>
@@ -675,7 +663,7 @@
       <w:tr>
         <w:tc>
           <w:tcPr>
-            <w:tcW w:type="dxa" w:w="3437"/>
+            <w:tcW w:type="dxa" w:w="3439"/>
           </w:tcPr>
           <w:p>
             <w:r>
@@ -685,21 +673,21 @@
         </w:tc>
         <w:tc>
           <w:tcPr>
-            <w:tcW w:type="dxa" w:w="3437"/>
+            <w:tcW w:type="dxa" w:w="3439"/>
           </w:tcPr>
           <w:p>
             <w:r>
-              <w:t>3.56%</w:t>
+              <w:t>11.94%</w:t>
             </w:r>
           </w:p>
         </w:tc>
         <w:tc>
           <w:tcPr>
-            <w:tcW w:type="dxa" w:w="3437"/>
+            <w:tcW w:type="dxa" w:w="3439"/>
           </w:tcPr>
           <w:p>
             <w:r>
-              <w:t>7.72%</w:t>
+              <w:t>21.27%</w:t>
             </w:r>
           </w:p>
         </w:tc>
@@ -707,7 +695,7 @@
       <w:tr>
         <w:tc>
           <w:tcPr>
-            <w:tcW w:type="dxa" w:w="3437"/>
+            <w:tcW w:type="dxa" w:w="3439"/>
           </w:tcPr>
           <w:p>
             <w:r>
@@ -717,21 +705,21 @@
         </w:tc>
         <w:tc>
           <w:tcPr>
-            <w:tcW w:type="dxa" w:w="3437"/>
+            <w:tcW w:type="dxa" w:w="3439"/>
           </w:tcPr>
           <w:p>
             <w:r>
-              <w:t>13,277,536.58</w:t>
+              <w:t>5,472,536.58</w:t>
             </w:r>
           </w:p>
         </w:tc>
         <w:tc>
           <w:tcPr>
-            <w:tcW w:type="dxa" w:w="3437"/>
+            <w:tcW w:type="dxa" w:w="3439"/>
           </w:tcPr>
           <w:p>
             <w:r>
-              <w:t>18,268,352.66</w:t>
+              <w:t>10,463,352.66</w:t>
             </w:r>
           </w:p>
         </w:tc>
@@ -739,7 +727,7 @@
       <w:tr>
         <w:tc>
           <w:tcPr>
-            <w:tcW w:type="dxa" w:w="3437"/>
+            <w:tcW w:type="dxa" w:w="3439"/>
           </w:tcPr>
           <w:p>
             <w:r>
@@ -749,7 +737,7 @@
         </w:tc>
         <w:tc>
           <w:tcPr>
-            <w:tcW w:type="dxa" w:w="3437"/>
+            <w:tcW w:type="dxa" w:w="3439"/>
           </w:tcPr>
           <w:p>
             <w:r>
@@ -759,7 +747,7 @@
         </w:tc>
         <w:tc>
           <w:tcPr>
-            <w:tcW w:type="dxa" w:w="3437"/>
+            <w:tcW w:type="dxa" w:w="3439"/>
           </w:tcPr>
           <w:p>
             <w:r>
@@ -771,7 +759,7 @@
       <w:tr>
         <w:tc>
           <w:tcPr>
-            <w:tcW w:type="dxa" w:w="3437"/>
+            <w:tcW w:type="dxa" w:w="3439"/>
           </w:tcPr>
           <w:p>
             <w:r>
@@ -781,7 +769,7 @@
         </w:tc>
         <w:tc>
           <w:tcPr>
-            <w:tcW w:type="dxa" w:w="3437"/>
+            <w:tcW w:type="dxa" w:w="3439"/>
           </w:tcPr>
           <w:p>
             <w:r>
@@ -791,7 +779,7 @@
         </w:tc>
         <w:tc>
           <w:tcPr>
-            <w:tcW w:type="dxa" w:w="3437"/>
+            <w:tcW w:type="dxa" w:w="3439"/>
           </w:tcPr>
           <w:p>
             <w:r>
@@ -803,7 +791,7 @@
       <w:tr>
         <w:tc>
           <w:tcPr>
-            <w:tcW w:type="dxa" w:w="3437"/>
+            <w:tcW w:type="dxa" w:w="3439"/>
           </w:tcPr>
           <w:p>
             <w:r>
@@ -813,7 +801,7 @@
         </w:tc>
         <w:tc>
           <w:tcPr>
-            <w:tcW w:type="dxa" w:w="3437"/>
+            <w:tcW w:type="dxa" w:w="3439"/>
           </w:tcPr>
           <w:p>
             <w:r>
@@ -823,7 +811,7 @@
         </w:tc>
         <w:tc>
           <w:tcPr>
-            <w:tcW w:type="dxa" w:w="3437"/>
+            <w:tcW w:type="dxa" w:w="3439"/>
           </w:tcPr>
           <w:p>
             <w:r>
@@ -835,7 +823,7 @@
       <w:tr>
         <w:tc>
           <w:tcPr>
-            <w:tcW w:type="dxa" w:w="3437"/>
+            <w:tcW w:type="dxa" w:w="3439"/>
           </w:tcPr>
           <w:p>
             <w:r>
@@ -845,7 +833,7 @@
         </w:tc>
         <w:tc>
           <w:tcPr>
-            <w:tcW w:type="dxa" w:w="3437"/>
+            <w:tcW w:type="dxa" w:w="3439"/>
           </w:tcPr>
           <w:p>
             <w:r>
@@ -855,7 +843,7 @@
         </w:tc>
         <w:tc>
           <w:tcPr>
-            <w:tcW w:type="dxa" w:w="3437"/>
+            <w:tcW w:type="dxa" w:w="3439"/>
           </w:tcPr>
           <w:p>
             <w:r>
@@ -867,7 +855,7 @@
       <w:tr>
         <w:tc>
           <w:tcPr>
-            <w:tcW w:type="dxa" w:w="3437"/>
+            <w:tcW w:type="dxa" w:w="3439"/>
           </w:tcPr>
           <w:p>
             <w:r>
@@ -877,21 +865,21 @@
         </w:tc>
         <w:tc>
           <w:tcPr>
-            <w:tcW w:type="dxa" w:w="3437"/>
+            <w:tcW w:type="dxa" w:w="3439"/>
           </w:tcPr>
           <w:p>
             <w:r>
-              <w:t>3.93%</w:t>
+              <w:t>12.72%</w:t>
             </w:r>
           </w:p>
         </w:tc>
         <w:tc>
           <w:tcPr>
-            <w:tcW w:type="dxa" w:w="3437"/>
+            <w:tcW w:type="dxa" w:w="3439"/>
           </w:tcPr>
           <w:p>
             <w:r>
-              <w:t>11.12%</w:t>
+              <w:t>28.64%</w:t>
             </w:r>
           </w:p>
         </w:tc>
@@ -899,7 +887,7 @@
       <w:tr>
         <w:tc>
           <w:tcPr>
-            <w:tcW w:type="dxa" w:w="3437"/>
+            <w:tcW w:type="dxa" w:w="3439"/>
           </w:tcPr>
           <w:p>
             <w:r>
@@ -909,7 +897,7 @@
         </w:tc>
         <w:tc>
           <w:tcPr>
-            <w:tcW w:type="dxa" w:w="3437"/>
+            <w:tcW w:type="dxa" w:w="3439"/>
           </w:tcPr>
           <w:p>
             <w:r>
@@ -919,7 +907,7 @@
         </w:tc>
         <w:tc>
           <w:tcPr>
-            <w:tcW w:type="dxa" w:w="3437"/>
+            <w:tcW w:type="dxa" w:w="3439"/>
           </w:tcPr>
           <w:p>
             <w:r>
@@ -931,7 +919,7 @@
       <w:tr>
         <w:tc>
           <w:tcPr>
-            <w:tcW w:type="dxa" w:w="3437"/>
+            <w:tcW w:type="dxa" w:w="3439"/>
           </w:tcPr>
           <w:p>
             <w:r>
@@ -941,7 +929,7 @@
         </w:tc>
         <w:tc>
           <w:tcPr>
-            <w:tcW w:type="dxa" w:w="3437"/>
+            <w:tcW w:type="dxa" w:w="3439"/>
           </w:tcPr>
           <w:p>
             <w:r>
@@ -951,7 +939,7 @@
         </w:tc>
         <w:tc>
           <w:tcPr>
-            <w:tcW w:type="dxa" w:w="3437"/>
+            <w:tcW w:type="dxa" w:w="3439"/>
           </w:tcPr>
           <w:p>
             <w:r>
@@ -963,7 +951,7 @@
       <w:tr>
         <w:tc>
           <w:tcPr>
-            <w:tcW w:type="dxa" w:w="3437"/>
+            <w:tcW w:type="dxa" w:w="3439"/>
           </w:tcPr>
           <w:p>
             <w:r>
@@ -973,21 +961,21 @@
         </w:tc>
         <w:tc>
           <w:tcPr>
-            <w:tcW w:type="dxa" w:w="3437"/>
+            <w:tcW w:type="dxa" w:w="3439"/>
           </w:tcPr>
           <w:p>
             <w:r>
-              <w:t>1.302</w:t>
+              <w:t>1.367</w:t>
             </w:r>
           </w:p>
         </w:tc>
         <w:tc>
           <w:tcPr>
-            <w:tcW w:type="dxa" w:w="3437"/>
+            <w:tcW w:type="dxa" w:w="3439"/>
           </w:tcPr>
           <w:p>
             <w:r>
-              <w:t>1.108</w:t>
+              <w:t>1.147</w:t>
             </w:r>
           </w:p>
         </w:tc>
@@ -995,7 +983,7 @@
       <w:tr>
         <w:tc>
           <w:tcPr>
-            <w:tcW w:type="dxa" w:w="3437"/>
+            <w:tcW w:type="dxa" w:w="3439"/>
           </w:tcPr>
           <w:p>
             <w:r>
@@ -1005,21 +993,21 @@
         </w:tc>
         <w:tc>
           <w:tcPr>
-            <w:tcW w:type="dxa" w:w="3437"/>
+            <w:tcW w:type="dxa" w:w="3439"/>
           </w:tcPr>
           <w:p>
             <w:r>
-              <w:t>0.906</w:t>
+              <w:t>0.939</w:t>
             </w:r>
           </w:p>
         </w:tc>
         <w:tc>
           <w:tcPr>
-            <w:tcW w:type="dxa" w:w="3437"/>
+            <w:tcW w:type="dxa" w:w="3439"/>
           </w:tcPr>
           <w:p>
             <w:r>
-              <w:t>0.694</w:t>
+              <w:t>0.743</w:t>
             </w:r>
           </w:p>
         </w:tc>
@@ -1027,7 +1015,7 @@
       <w:tr>
         <w:tc>
           <w:tcPr>
-            <w:tcW w:type="dxa" w:w="3437"/>
+            <w:tcW w:type="dxa" w:w="3439"/>
           </w:tcPr>
           <w:p>
             <w:r>
@@ -1037,21 +1025,21 @@
         </w:tc>
         <w:tc>
           <w:tcPr>
-            <w:tcW w:type="dxa" w:w="3437"/>
+            <w:tcW w:type="dxa" w:w="3439"/>
           </w:tcPr>
           <w:p>
             <w:r>
-              <w:t>2.82%</w:t>
+              <w:t>8.84%</w:t>
             </w:r>
           </w:p>
         </w:tc>
         <w:tc>
           <w:tcPr>
-            <w:tcW w:type="dxa" w:w="3437"/>
+            <w:tcW w:type="dxa" w:w="3439"/>
           </w:tcPr>
           <w:p>
             <w:r>
-              <w:t>7.20%</w:t>
+              <w:t>19.03%</w:t>
             </w:r>
           </w:p>
         </w:tc>
@@ -1059,7 +1047,7 @@
       <w:tr>
         <w:tc>
           <w:tcPr>
-            <w:tcW w:type="dxa" w:w="3437"/>
+            <w:tcW w:type="dxa" w:w="3439"/>
           </w:tcPr>
           <w:p>
             <w:r>
@@ -1069,7 +1057,7 @@
         </w:tc>
         <w:tc>
           <w:tcPr>
-            <w:tcW w:type="dxa" w:w="3437"/>
+            <w:tcW w:type="dxa" w:w="3439"/>
           </w:tcPr>
           <w:p>
             <w:r>
@@ -1079,7 +1067,7 @@
         </w:tc>
         <w:tc>
           <w:tcPr>
-            <w:tcW w:type="dxa" w:w="3437"/>
+            <w:tcW w:type="dxa" w:w="3439"/>
           </w:tcPr>
           <w:p>
             <w:r>
@@ -1091,7 +1079,7 @@
     </w:tbl>
     <w:p>
       <w:r>
-        <w:t>同期間、同本金、同一口。策略按一次進場至訊號退出計交易，合併轉倉成本；基準在每次換月結束一段交易。因此勝率／PF的持有頻率不同。MDD金額及比例各自取全期最大值，可能發生於不同日期。</w:t>
+        <w:t>同期間、同一口、同起始資金。固定一口Buy-and-Hold是可直接執行的曝險比較；策略有658個日末持倉日，基準幾乎全期持有，兩者承擔市場風險的時間不同。MDD金額及比例各自取全期最大值，可能發生於不同日期。</w:t>
       </w:r>
     </w:p>
     <w:tbl>
@@ -1101,16 +1089,16 @@
         <w:tblLook w:firstColumn="1" w:firstRow="1" w:lastColumn="0" w:lastRow="0" w:noHBand="0" w:noVBand="1" w:val="04A0"/>
       </w:tblPr>
       <w:tblGrid>
-        <w:gridCol w:w="2062"/>
-        <w:gridCol w:w="2062"/>
-        <w:gridCol w:w="2062"/>
-        <w:gridCol w:w="2062"/>
-        <w:gridCol w:w="2062"/>
+        <w:gridCol w:w="2064"/>
+        <w:gridCol w:w="2064"/>
+        <w:gridCol w:w="2064"/>
+        <w:gridCol w:w="2064"/>
+        <w:gridCol w:w="2064"/>
       </w:tblGrid>
       <w:tr>
         <w:tc>
           <w:tcPr>
-            <w:tcW w:type="dxa" w:w="2062"/>
+            <w:tcW w:type="dxa" w:w="2064"/>
           </w:tcPr>
           <w:p>
             <w:r>
@@ -1120,7 +1108,7 @@
         </w:tc>
         <w:tc>
           <w:tcPr>
-            <w:tcW w:type="dxa" w:w="2062"/>
+            <w:tcW w:type="dxa" w:w="2064"/>
           </w:tcPr>
           <w:p>
             <w:r>
@@ -1130,7 +1118,7 @@
         </w:tc>
         <w:tc>
           <w:tcPr>
-            <w:tcW w:type="dxa" w:w="2062"/>
+            <w:tcW w:type="dxa" w:w="2064"/>
           </w:tcPr>
           <w:p>
             <w:r>
@@ -1140,7 +1128,7 @@
         </w:tc>
         <w:tc>
           <w:tcPr>
-            <w:tcW w:type="dxa" w:w="2062"/>
+            <w:tcW w:type="dxa" w:w="2064"/>
           </w:tcPr>
           <w:p>
             <w:r>
@@ -1150,7 +1138,7 @@
         </w:tc>
         <w:tc>
           <w:tcPr>
-            <w:tcW w:type="dxa" w:w="2062"/>
+            <w:tcW w:type="dxa" w:w="2064"/>
           </w:tcPr>
           <w:p>
             <w:r>
@@ -1162,7 +1150,7 @@
       <w:tr>
         <w:tc>
           <w:tcPr>
-            <w:tcW w:type="dxa" w:w="2062"/>
+            <w:tcW w:type="dxa" w:w="2064"/>
           </w:tcPr>
           <w:p>
             <w:r>
@@ -1172,7 +1160,7 @@
         </w:tc>
         <w:tc>
           <w:tcPr>
-            <w:tcW w:type="dxa" w:w="2062"/>
+            <w:tcW w:type="dxa" w:w="2064"/>
           </w:tcPr>
           <w:p>
             <w:r>
@@ -1182,17 +1170,17 @@
         </w:tc>
         <w:tc>
           <w:tcPr>
-            <w:tcW w:type="dxa" w:w="2062"/>
+            <w:tcW w:type="dxa" w:w="2064"/>
           </w:tcPr>
           <w:p>
             <w:r>
-              <w:t>-1.44%</w:t>
+              <w:t>-6.58%</w:t>
             </w:r>
           </w:p>
         </w:tc>
         <w:tc>
           <w:tcPr>
-            <w:tcW w:type="dxa" w:w="2062"/>
+            <w:tcW w:type="dxa" w:w="2064"/>
           </w:tcPr>
           <w:p>
             <w:r>
@@ -1202,11 +1190,11 @@
         </w:tc>
         <w:tc>
           <w:tcPr>
-            <w:tcW w:type="dxa" w:w="2062"/>
+            <w:tcW w:type="dxa" w:w="2064"/>
           </w:tcPr>
           <w:p>
             <w:r>
-              <w:t>-2.47%</w:t>
+              <w:t>-11.25%</w:t>
             </w:r>
           </w:p>
         </w:tc>
@@ -1214,7 +1202,7 @@
       <w:tr>
         <w:tc>
           <w:tcPr>
-            <w:tcW w:type="dxa" w:w="2062"/>
+            <w:tcW w:type="dxa" w:w="2064"/>
           </w:tcPr>
           <w:p>
             <w:r>
@@ -1224,7 +1212,7 @@
         </w:tc>
         <w:tc>
           <w:tcPr>
-            <w:tcW w:type="dxa" w:w="2062"/>
+            <w:tcW w:type="dxa" w:w="2064"/>
           </w:tcPr>
           <w:p>
             <w:r>
@@ -1234,17 +1222,17 @@
         </w:tc>
         <w:tc>
           <w:tcPr>
-            <w:tcW w:type="dxa" w:w="2062"/>
+            <w:tcW w:type="dxa" w:w="2064"/>
           </w:tcPr>
           <w:p>
             <w:r>
-              <w:t>4.46%</w:t>
+              <w:t>21.44%</w:t>
             </w:r>
           </w:p>
         </w:tc>
         <w:tc>
           <w:tcPr>
-            <w:tcW w:type="dxa" w:w="2062"/>
+            <w:tcW w:type="dxa" w:w="2064"/>
           </w:tcPr>
           <w:p>
             <w:r>
@@ -1254,11 +1242,11 @@
         </w:tc>
         <w:tc>
           <w:tcPr>
-            <w:tcW w:type="dxa" w:w="2062"/>
+            <w:tcW w:type="dxa" w:w="2064"/>
           </w:tcPr>
           <w:p>
             <w:r>
-              <w:t>5.63%</w:t>
+              <w:t>28.18%</w:t>
             </w:r>
           </w:p>
         </w:tc>
@@ -1266,7 +1254,7 @@
       <w:tr>
         <w:tc>
           <w:tcPr>
-            <w:tcW w:type="dxa" w:w="2062"/>
+            <w:tcW w:type="dxa" w:w="2064"/>
           </w:tcPr>
           <w:p>
             <w:r>
@@ -1276,7 +1264,7 @@
         </w:tc>
         <w:tc>
           <w:tcPr>
-            <w:tcW w:type="dxa" w:w="2062"/>
+            <w:tcW w:type="dxa" w:w="2064"/>
           </w:tcPr>
           <w:p>
             <w:r>
@@ -1286,7 +1274,59 @@
         </w:tc>
         <w:tc>
           <w:tcPr>
-            <w:tcW w:type="dxa" w:w="2062"/>
+            <w:tcW w:type="dxa" w:w="2064"/>
+          </w:tcPr>
+          <w:p>
+            <w:r>
+              <w:t>25.69%</w:t>
+            </w:r>
+          </w:p>
+        </w:tc>
+        <w:tc>
+          <w:tcPr>
+            <w:tcW w:type="dxa" w:w="2064"/>
+          </w:tcPr>
+          <w:p>
+            <w:r>
+              <w:t>733,649</w:t>
+            </w:r>
+          </w:p>
+        </w:tc>
+        <w:tc>
+          <w:tcPr>
+            <w:tcW w:type="dxa" w:w="2064"/>
+          </w:tcPr>
+          <w:p>
+            <w:r>
+              <w:t>29.38%</w:t>
+            </w:r>
+          </w:p>
+        </w:tc>
+      </w:tr>
+      <w:tr>
+        <w:tc>
+          <w:tcPr>
+            <w:tcW w:type="dxa" w:w="2064"/>
+          </w:tcPr>
+          <w:p>
+            <w:r>
+              <w:t>2021</w:t>
+            </w:r>
+          </w:p>
+        </w:tc>
+        <w:tc>
+          <w:tcPr>
+            <w:tcW w:type="dxa" w:w="2064"/>
+          </w:tcPr>
+          <w:p>
+            <w:r>
+              <w:t>194,363</w:t>
+            </w:r>
+          </w:p>
+        </w:tc>
+        <w:tc>
+          <w:tcPr>
+            <w:tcW w:type="dxa" w:w="2064"/>
           </w:tcPr>
           <w:p>
             <w:r>
@@ -1296,59 +1336,7 @@
         </w:tc>
         <w:tc>
           <w:tcPr>
-            <w:tcW w:type="dxa" w:w="2062"/>
-          </w:tcPr>
-          <w:p>
-            <w:r>
-              <w:t>733,649</w:t>
-            </w:r>
-          </w:p>
-        </w:tc>
-        <w:tc>
-          <w:tcPr>
-            <w:tcW w:type="dxa" w:w="2062"/>
-          </w:tcPr>
-          <w:p>
-            <w:r>
-              <w:t>7.12%</w:t>
-            </w:r>
-          </w:p>
-        </w:tc>
-      </w:tr>
-      <w:tr>
-        <w:tc>
-          <w:tcPr>
-            <w:tcW w:type="dxa" w:w="2062"/>
-          </w:tcPr>
-          <w:p>
-            <w:r>
-              <w:t>2021</w:t>
-            </w:r>
-          </w:p>
-        </w:tc>
-        <w:tc>
-          <w:tcPr>
-            <w:tcW w:type="dxa" w:w="2062"/>
-          </w:tcPr>
-          <w:p>
-            <w:r>
-              <w:t>194,363</w:t>
-            </w:r>
-          </w:p>
-        </w:tc>
-        <w:tc>
-          <w:tcPr>
-            <w:tcW w:type="dxa" w:w="2062"/>
-          </w:tcPr>
-          <w:p>
-            <w:r>
-              <w:t>1.78%</w:t>
-            </w:r>
-          </w:p>
-        </w:tc>
-        <w:tc>
-          <w:tcPr>
-            <w:tcW w:type="dxa" w:w="2062"/>
+            <w:tcW w:type="dxa" w:w="2064"/>
           </w:tcPr>
           <w:p>
             <w:r>
@@ -1358,11 +1346,11 @@
         </w:tc>
         <w:tc>
           <w:tcPr>
-            <w:tcW w:type="dxa" w:w="2062"/>
+            <w:tcW w:type="dxa" w:w="2064"/>
           </w:tcPr>
           <w:p>
             <w:r>
-              <w:t>8.01%</w:t>
+              <w:t>27.37%</w:t>
             </w:r>
           </w:p>
         </w:tc>
@@ -1370,7 +1358,7 @@
       <w:tr>
         <w:tc>
           <w:tcPr>
-            <w:tcW w:type="dxa" w:w="2062"/>
+            <w:tcW w:type="dxa" w:w="2064"/>
           </w:tcPr>
           <w:p>
             <w:r>
@@ -1380,7 +1368,7 @@
         </w:tc>
         <w:tc>
           <w:tcPr>
-            <w:tcW w:type="dxa" w:w="2062"/>
+            <w:tcW w:type="dxa" w:w="2064"/>
           </w:tcPr>
           <w:p>
             <w:r>
@@ -1390,17 +1378,17 @@
         </w:tc>
         <w:tc>
           <w:tcPr>
-            <w:tcW w:type="dxa" w:w="2062"/>
+            <w:tcW w:type="dxa" w:w="2064"/>
           </w:tcPr>
           <w:p>
             <w:r>
-              <w:t>-0.42%</w:t>
+              <w:t>-1.39%</w:t>
             </w:r>
           </w:p>
         </w:tc>
         <w:tc>
           <w:tcPr>
-            <w:tcW w:type="dxa" w:w="2062"/>
+            <w:tcW w:type="dxa" w:w="2064"/>
           </w:tcPr>
           <w:p>
             <w:r>
@@ -1410,11 +1398,11 @@
         </w:tc>
         <w:tc>
           <w:tcPr>
-            <w:tcW w:type="dxa" w:w="2062"/>
+            <w:tcW w:type="dxa" w:w="2064"/>
           </w:tcPr>
           <w:p>
             <w:r>
-              <w:t>-5.24%</w:t>
+              <w:t>-15.17%</w:t>
             </w:r>
           </w:p>
         </w:tc>
@@ -1422,7 +1410,7 @@
       <w:tr>
         <w:tc>
           <w:tcPr>
-            <w:tcW w:type="dxa" w:w="2062"/>
+            <w:tcW w:type="dxa" w:w="2064"/>
           </w:tcPr>
           <w:p>
             <w:r>
@@ -1432,7 +1420,7 @@
         </w:tc>
         <w:tc>
           <w:tcPr>
-            <w:tcW w:type="dxa" w:w="2062"/>
+            <w:tcW w:type="dxa" w:w="2064"/>
           </w:tcPr>
           <w:p>
             <w:r>
@@ -1442,17 +1430,17 @@
         </w:tc>
         <w:tc>
           <w:tcPr>
-            <w:tcW w:type="dxa" w:w="2062"/>
+            <w:tcW w:type="dxa" w:w="2064"/>
           </w:tcPr>
           <w:p>
             <w:r>
-              <w:t>1.74%</w:t>
+              <w:t>5.87%</w:t>
             </w:r>
           </w:p>
         </w:tc>
         <w:tc>
           <w:tcPr>
-            <w:tcW w:type="dxa" w:w="2062"/>
+            <w:tcW w:type="dxa" w:w="2064"/>
           </w:tcPr>
           <w:p>
             <w:r>
@@ -1462,11 +1450,11 @@
         </w:tc>
         <w:tc>
           <w:tcPr>
-            <w:tcW w:type="dxa" w:w="2062"/>
+            <w:tcW w:type="dxa" w:w="2064"/>
           </w:tcPr>
           <w:p>
             <w:r>
-              <w:t>7.18%</w:t>
+              <w:t>23.25%</w:t>
             </w:r>
           </w:p>
         </w:tc>
@@ -1474,7 +1462,7 @@
       <w:tr>
         <w:tc>
           <w:tcPr>
-            <w:tcW w:type="dxa" w:w="2062"/>
+            <w:tcW w:type="dxa" w:w="2064"/>
           </w:tcPr>
           <w:p>
             <w:r>
@@ -1484,7 +1472,7 @@
         </w:tc>
         <w:tc>
           <w:tcPr>
-            <w:tcW w:type="dxa" w:w="2062"/>
+            <w:tcW w:type="dxa" w:w="2064"/>
           </w:tcPr>
           <w:p>
             <w:r>
@@ -1494,17 +1482,17 @@
         </w:tc>
         <w:tc>
           <w:tcPr>
-            <w:tcW w:type="dxa" w:w="2062"/>
+            <w:tcW w:type="dxa" w:w="2064"/>
           </w:tcPr>
           <w:p>
             <w:r>
-              <w:t>-0.19%</w:t>
+              <w:t>-0.61%</w:t>
             </w:r>
           </w:p>
         </w:tc>
         <w:tc>
           <w:tcPr>
-            <w:tcW w:type="dxa" w:w="2062"/>
+            <w:tcW w:type="dxa" w:w="2064"/>
           </w:tcPr>
           <w:p>
             <w:r>
@@ -1514,11 +1502,11 @@
         </w:tc>
         <w:tc>
           <w:tcPr>
-            <w:tcW w:type="dxa" w:w="2062"/>
+            <w:tcW w:type="dxa" w:w="2064"/>
           </w:tcPr>
           <w:p>
             <w:r>
-              <w:t>8.25%</w:t>
+              <w:t>23.22%</w:t>
             </w:r>
           </w:p>
         </w:tc>
@@ -1526,7 +1514,7 @@
       <w:tr>
         <w:tc>
           <w:tcPr>
-            <w:tcW w:type="dxa" w:w="2062"/>
+            <w:tcW w:type="dxa" w:w="2064"/>
           </w:tcPr>
           <w:p>
             <w:r>
@@ -1536,7 +1524,7 @@
         </w:tc>
         <w:tc>
           <w:tcPr>
-            <w:tcW w:type="dxa" w:w="2062"/>
+            <w:tcW w:type="dxa" w:w="2064"/>
           </w:tcPr>
           <w:p>
             <w:r>
@@ -1546,17 +1534,17 @@
         </w:tc>
         <w:tc>
           <w:tcPr>
-            <w:tcW w:type="dxa" w:w="2062"/>
+            <w:tcW w:type="dxa" w:w="2064"/>
           </w:tcPr>
           <w:p>
             <w:r>
-              <w:t>6.85%</w:t>
+              <w:t>22.35%</w:t>
             </w:r>
           </w:p>
         </w:tc>
         <w:tc>
           <w:tcPr>
-            <w:tcW w:type="dxa" w:w="2062"/>
+            <w:tcW w:type="dxa" w:w="2064"/>
           </w:tcPr>
           <w:p>
             <w:r>
@@ -1566,11 +1554,11 @@
         </w:tc>
         <w:tc>
           <w:tcPr>
-            <w:tcW w:type="dxa" w:w="2062"/>
+            <w:tcW w:type="dxa" w:w="2064"/>
           </w:tcPr>
           <w:p>
             <w:r>
-              <w:t>9.68%</w:t>
+              <w:t>23.92%</w:t>
             </w:r>
           </w:p>
         </w:tc>
@@ -1578,7 +1566,7 @@
       <w:tr>
         <w:tc>
           <w:tcPr>
-            <w:tcW w:type="dxa" w:w="2062"/>
+            <w:tcW w:type="dxa" w:w="2064"/>
           </w:tcPr>
           <w:p>
             <w:r>
@@ -1588,7 +1576,7 @@
         </w:tc>
         <w:tc>
           <w:tcPr>
-            <w:tcW w:type="dxa" w:w="2062"/>
+            <w:tcW w:type="dxa" w:w="2064"/>
           </w:tcPr>
           <w:p>
             <w:r>
@@ -1598,17 +1586,17 @@
         </w:tc>
         <w:tc>
           <w:tcPr>
-            <w:tcW w:type="dxa" w:w="2062"/>
+            <w:tcW w:type="dxa" w:w="2064"/>
           </w:tcPr>
           <w:p>
             <w:r>
-              <w:t>10.41%</w:t>
+              <w:t>29.67%</w:t>
             </w:r>
           </w:p>
         </w:tc>
         <w:tc>
           <w:tcPr>
-            <w:tcW w:type="dxa" w:w="2062"/>
+            <w:tcW w:type="dxa" w:w="2064"/>
           </w:tcPr>
           <w:p>
             <w:r>
@@ -1618,11 +1606,11 @@
         </w:tc>
         <w:tc>
           <w:tcPr>
-            <w:tcW w:type="dxa" w:w="2062"/>
+            <w:tcW w:type="dxa" w:w="2064"/>
           </w:tcPr>
           <w:p>
             <w:r>
-              <w:t>27.09%</w:t>
+              <w:t>59.27%</w:t>
             </w:r>
           </w:p>
         </w:tc>
@@ -1634,13 +1622,9 @@
       </w:r>
     </w:p>
     <w:p>
-      <w:r>
-        <w:br w:type="page"/>
-      </w:r>
-    </w:p>
-    <w:p>
       <w:pPr>
         <w:pStyle w:val="Heading1"/>
+        <w:pageBreakBefore/>
       </w:pPr>
       <w:r>
         <w:t>5　資金曲線、回撤與風險配平診斷</w:t>
@@ -1652,13 +1636,13 @@
         <w:tblLook w:firstColumn="1" w:firstRow="1" w:lastColumn="0" w:lastRow="0" w:noHBand="0" w:noVBand="1" w:val="04A0"/>
       </w:tblPr>
       <w:tblGrid>
-        <w:gridCol w:w="5156"/>
-        <w:gridCol w:w="5156"/>
+        <w:gridCol w:w="5159"/>
+        <w:gridCol w:w="5159"/>
       </w:tblGrid>
       <w:tr>
         <w:tc>
           <w:tcPr>
-            <w:tcW w:type="dxa" w:w="5156"/>
+            <w:tcW w:type="dxa" w:w="5159"/>
           </w:tcPr>
           <w:p>
             <w:r>
@@ -1699,7 +1683,7 @@
         </w:tc>
         <w:tc>
           <w:tcPr>
-            <w:tcW w:type="dxa" w:w="5156"/>
+            <w:tcW w:type="dxa" w:w="5159"/>
           </w:tcPr>
           <w:p>
             <w:r>
@@ -1742,7 +1726,7 @@
     </w:tbl>
     <w:p>
       <w:r>
-        <w:t>圖一：左為線性Y軸、右為對數Y軸。兩者皆自1,000萬元起始並扣除所有成交與轉倉成本；log-y版本只改變視覺尺度，不改變任何報酬或風險計算。</w:t>
+        <w:t>圖一：左為線性Y軸、右為對數Y軸。三條權益曲線皆以2,195,000.00元為起點，逐日累加含全部交易成本的淨損益；對數軸只改變顯示尺度。</w:t>
       </w:r>
     </w:p>
     <w:p>
@@ -1783,12 +1767,12 @@
     </w:p>
     <w:p>
       <w:r>
-        <w:t>圖二：日末權益相對含初始本金的歷史高點回撤。策略MDD 3.93%，基準11.12%；策略回撤較淺，但固定一口比較同時含有不同市場曝險。</w:t>
+        <w:t>圖二：MDD從各條權益曲線的歷史高點計算。V04策略為12.72%，固定一口基準為28.64%；兩者持倉時間不同。</w:t>
       </w:r>
     </w:p>
     <w:p>
       <w:r>
-        <w:t>波動配平診斷（事後分析）</w:t>
+        <w:t>一口等曝險風險診斷</w:t>
       </w:r>
     </w:p>
     <w:tbl>
@@ -1798,14 +1782,15 @@
         <w:tblLook w:firstColumn="1" w:firstRow="1" w:lastColumn="0" w:lastRow="0" w:noHBand="0" w:noVBand="1" w:val="04A0"/>
       </w:tblPr>
       <w:tblGrid>
-        <w:gridCol w:w="3437"/>
-        <w:gridCol w:w="3437"/>
-        <w:gridCol w:w="3437"/>
+        <w:gridCol w:w="2579"/>
+        <w:gridCol w:w="2579"/>
+        <w:gridCol w:w="2579"/>
+        <w:gridCol w:w="2579"/>
       </w:tblGrid>
       <w:tr>
         <w:tc>
           <w:tcPr>
-            <w:tcW w:type="dxa" w:w="3437"/>
+            <w:tcW w:type="dxa" w:w="2579"/>
           </w:tcPr>
           <w:p>
             <w:r>
@@ -1815,7 +1800,7 @@
         </w:tc>
         <w:tc>
           <w:tcPr>
-            <w:tcW w:type="dxa" w:w="3437"/>
+            <w:tcW w:type="dxa" w:w="2579"/>
           </w:tcPr>
           <w:p>
             <w:r>
@@ -1825,11 +1810,21 @@
         </w:tc>
         <w:tc>
           <w:tcPr>
-            <w:tcW w:type="dxa" w:w="3437"/>
+            <w:tcW w:type="dxa" w:w="2579"/>
           </w:tcPr>
           <w:p>
             <w:r>
-              <w:t>波動配平診斷</w:t>
+              <w:t>等曝險代表路徑</w:t>
+            </w:r>
+          </w:p>
+        </w:tc>
+        <w:tc>
+          <w:tcPr>
+            <w:tcW w:type="dxa" w:w="2579"/>
+          </w:tcPr>
+          <w:p>
+            <w:r>
+              <w:t>V04策略</w:t>
             </w:r>
           </w:p>
         </w:tc>
@@ -1837,31 +1832,41 @@
       <w:tr>
         <w:tc>
           <w:tcPr>
-            <w:tcW w:type="dxa" w:w="3437"/>
+            <w:tcW w:type="dxa" w:w="2579"/>
           </w:tcPr>
           <w:p>
             <w:r>
-              <w:t>TX-equivalent</w:t>
+              <w:t>口數</w:t>
             </w:r>
           </w:p>
         </w:tc>
         <w:tc>
           <w:tcPr>
-            <w:tcW w:type="dxa" w:w="3437"/>
+            <w:tcW w:type="dxa" w:w="2579"/>
           </w:tcPr>
           <w:p>
             <w:r>
-              <w:t>1.000</w:t>
+              <w:t>1</w:t>
             </w:r>
           </w:p>
         </w:tc>
         <w:tc>
           <w:tcPr>
-            <w:tcW w:type="dxa" w:w="3437"/>
+            <w:tcW w:type="dxa" w:w="2579"/>
           </w:tcPr>
           <w:p>
             <w:r>
-              <w:t>0.315</w:t>
+              <w:t>1</w:t>
+            </w:r>
+          </w:p>
+        </w:tc>
+        <w:tc>
+          <w:tcPr>
+            <w:tcW w:type="dxa" w:w="2579"/>
+          </w:tcPr>
+          <w:p>
+            <w:r>
+              <w:t>持倉時1口</w:t>
             </w:r>
           </w:p>
         </w:tc>
@@ -1869,7 +1874,49 @@
       <w:tr>
         <w:tc>
           <w:tcPr>
-            <w:tcW w:type="dxa" w:w="3437"/>
+            <w:tcW w:type="dxa" w:w="2579"/>
+          </w:tcPr>
+          <w:p>
+            <w:r>
+              <w:t>日末持倉日</w:t>
+            </w:r>
+          </w:p>
+        </w:tc>
+        <w:tc>
+          <w:tcPr>
+            <w:tcW w:type="dxa" w:w="2579"/>
+          </w:tcPr>
+          <w:p>
+            <w:r>
+              <w:t>1968</w:t>
+            </w:r>
+          </w:p>
+        </w:tc>
+        <w:tc>
+          <w:tcPr>
+            <w:tcW w:type="dxa" w:w="2579"/>
+          </w:tcPr>
+          <w:p>
+            <w:r>
+              <w:t>658</w:t>
+            </w:r>
+          </w:p>
+        </w:tc>
+        <w:tc>
+          <w:tcPr>
+            <w:tcW w:type="dxa" w:w="2579"/>
+          </w:tcPr>
+          <w:p>
+            <w:r>
+              <w:t>658</w:t>
+            </w:r>
+          </w:p>
+        </w:tc>
+      </w:tr>
+      <w:tr>
+        <w:tc>
+          <w:tcPr>
+            <w:tcW w:type="dxa" w:w="2579"/>
           </w:tcPr>
           <w:p>
             <w:r>
@@ -1879,21 +1926,31 @@
         </w:tc>
         <w:tc>
           <w:tcPr>
-            <w:tcW w:type="dxa" w:w="3437"/>
+            <w:tcW w:type="dxa" w:w="2579"/>
           </w:tcPr>
           <w:p>
             <w:r>
-              <w:t>7.20%</w:t>
+              <w:t>19.03%</w:t>
             </w:r>
           </w:p>
         </w:tc>
         <w:tc>
           <w:tcPr>
-            <w:tcW w:type="dxa" w:w="3437"/>
+            <w:tcW w:type="dxa" w:w="2579"/>
           </w:tcPr>
           <w:p>
             <w:r>
-              <w:t>2.82%</w:t>
+              <w:t>11.05%</w:t>
+            </w:r>
+          </w:p>
+        </w:tc>
+        <w:tc>
+          <w:tcPr>
+            <w:tcW w:type="dxa" w:w="2579"/>
+          </w:tcPr>
+          <w:p>
+            <w:r>
+              <w:t>8.84%</w:t>
             </w:r>
           </w:p>
         </w:tc>
@@ -1901,7 +1958,7 @@
       <w:tr>
         <w:tc>
           <w:tcPr>
-            <w:tcW w:type="dxa" w:w="3437"/>
+            <w:tcW w:type="dxa" w:w="2579"/>
           </w:tcPr>
           <w:p>
             <w:r>
@@ -1911,21 +1968,31 @@
         </w:tc>
         <w:tc>
           <w:tcPr>
-            <w:tcW w:type="dxa" w:w="3437"/>
+            <w:tcW w:type="dxa" w:w="2579"/>
           </w:tcPr>
           <w:p>
             <w:r>
-              <w:t>7.72%</w:t>
+              <w:t>21.27%</w:t>
             </w:r>
           </w:p>
         </w:tc>
         <w:tc>
           <w:tcPr>
-            <w:tcW w:type="dxa" w:w="3437"/>
+            <w:tcW w:type="dxa" w:w="2579"/>
           </w:tcPr>
           <w:p>
             <w:r>
-              <w:t>2.90%</w:t>
+              <w:t>14.12%</w:t>
+            </w:r>
+          </w:p>
+        </w:tc>
+        <w:tc>
+          <w:tcPr>
+            <w:tcW w:type="dxa" w:w="2579"/>
+          </w:tcPr>
+          <w:p>
+            <w:r>
+              <w:t>11.94%</w:t>
             </w:r>
           </w:p>
         </w:tc>
@@ -1933,7 +2000,7 @@
       <w:tr>
         <w:tc>
           <w:tcPr>
-            <w:tcW w:type="dxa" w:w="3437"/>
+            <w:tcW w:type="dxa" w:w="2579"/>
           </w:tcPr>
           <w:p>
             <w:r>
@@ -1943,21 +2010,31 @@
         </w:tc>
         <w:tc>
           <w:tcPr>
-            <w:tcW w:type="dxa" w:w="3437"/>
+            <w:tcW w:type="dxa" w:w="2579"/>
           </w:tcPr>
           <w:p>
             <w:r>
-              <w:t>1.108</w:t>
+              <w:t>1.147</w:t>
             </w:r>
           </w:p>
         </w:tc>
         <w:tc>
           <w:tcPr>
-            <w:tcW w:type="dxa" w:w="3437"/>
+            <w:tcW w:type="dxa" w:w="2579"/>
           </w:tcPr>
           <w:p>
             <w:r>
-              <w:t>1.066</w:t>
+              <w:t>1.295</w:t>
+            </w:r>
+          </w:p>
+        </w:tc>
+        <w:tc>
+          <w:tcPr>
+            <w:tcW w:type="dxa" w:w="2579"/>
+          </w:tcPr>
+          <w:p>
+            <w:r>
+              <w:t>1.367</w:t>
             </w:r>
           </w:p>
         </w:tc>
@@ -1965,7 +2042,7 @@
       <w:tr>
         <w:tc>
           <w:tcPr>
-            <w:tcW w:type="dxa" w:w="3437"/>
+            <w:tcW w:type="dxa" w:w="2579"/>
           </w:tcPr>
           <w:p>
             <w:r>
@@ -1975,21 +2052,31 @@
         </w:tc>
         <w:tc>
           <w:tcPr>
-            <w:tcW w:type="dxa" w:w="3437"/>
+            <w:tcW w:type="dxa" w:w="2579"/>
           </w:tcPr>
           <w:p>
             <w:r>
-              <w:t>11.12%</w:t>
+              <w:t>28.64%</w:t>
             </w:r>
           </w:p>
         </w:tc>
         <w:tc>
           <w:tcPr>
-            <w:tcW w:type="dxa" w:w="3437"/>
+            <w:tcW w:type="dxa" w:w="2579"/>
           </w:tcPr>
           <w:p>
             <w:r>
-              <w:t>4.25%</w:t>
+              <w:t>13.40%</w:t>
+            </w:r>
+          </w:p>
+        </w:tc>
+        <w:tc>
+          <w:tcPr>
+            <w:tcW w:type="dxa" w:w="2579"/>
+          </w:tcPr>
+          <w:p>
+            <w:r>
+              <w:t>12.72%</w:t>
             </w:r>
           </w:p>
         </w:tc>
@@ -1997,7 +2084,7 @@
       <w:tr>
         <w:tc>
           <w:tcPr>
-            <w:tcW w:type="dxa" w:w="3437"/>
+            <w:tcW w:type="dxa" w:w="2579"/>
           </w:tcPr>
           <w:p>
             <w:r>
@@ -2007,21 +2094,31 @@
         </w:tc>
         <w:tc>
           <w:tcPr>
-            <w:tcW w:type="dxa" w:w="3437"/>
+            <w:tcW w:type="dxa" w:w="2579"/>
           </w:tcPr>
           <w:p>
             <w:r>
-              <w:t>0.694</w:t>
+              <w:t>0.743</w:t>
             </w:r>
           </w:p>
         </w:tc>
         <w:tc>
           <w:tcPr>
-            <w:tcW w:type="dxa" w:w="3437"/>
+            <w:tcW w:type="dxa" w:w="2579"/>
           </w:tcPr>
           <w:p>
             <w:r>
-              <w:t>0.682</w:t>
+              <w:t>1.054</w:t>
+            </w:r>
+          </w:p>
+        </w:tc>
+        <w:tc>
+          <w:tcPr>
+            <w:tcW w:type="dxa" w:w="2579"/>
+          </w:tcPr>
+          <w:p>
+            <w:r>
+              <w:t>0.939</w:t>
             </w:r>
           </w:p>
         </w:tc>
@@ -2029,22 +2126,18 @@
     </w:tbl>
     <w:p>
       <w:r>
-        <w:t>配平係數以完整樣本事後估計，使基準年化波動由7.20%調整至策略的2.82%；所得曝險約為0.315口TX-equivalent。基準毛損益、手續費、稅與滑價成本均按相同比例縮放，因此此結果僅用於同風險尺度比較，不代表可直接執行的整口TX交易策略。</w:t>
+        <w:t>診斷以257個事先等距設定的循環位移為候選，排除距離不足63日或與原持倉重疊超過50%的路徑後，共167條符合「固定一口、658個持倉日、147段持有」；每條均重新計算實際費稅、滑價與轉倉。代表路徑只按年化波動最接近策略挑選，未使用報酬作選擇。受整口限制，其最低可得波動仍為11.05%，高於策略8.84%，所以它是最接近的整口風險對照，不是假裝完全配平。</w:t>
       </w:r>
     </w:p>
     <w:p>
       <w:r>
-        <w:t>固定一口仍是主結果，因為它可直接對應實際合約；波動配平只用來避免把策略較低MDD完全誤解為訊號本身的優勢。圖表也沒有盤中及夜盤評價，不能代表最壞瞬時損失或精確保證金風險。</w:t>
-      </w:r>
-    </w:p>
-    <w:p>
-      <w:r>
-        <w:br w:type="page"/>
+        <w:t>167條對照的中位數為CAGR 10.64%、Sharpe 0.682、MDD 28.71%。策略Sharpe高於全部合格位移，MDD低於98.80%的位移；但此診斷仍使用同一完整樣本，不是可交易規則或樣本外證據。</w:t>
       </w:r>
     </w:p>
     <w:p>
       <w:pPr>
         <w:pStyle w:val="Heading1"/>
+        <w:pageBreakBefore/>
       </w:pPr>
       <w:r>
         <w:t>6　成本敏感度與條件診斷</w:t>
@@ -2062,16 +2155,16 @@
         <w:tblLook w:firstColumn="1" w:firstRow="1" w:lastColumn="0" w:lastRow="0" w:noHBand="0" w:noVBand="1" w:val="04A0"/>
       </w:tblPr>
       <w:tblGrid>
-        <w:gridCol w:w="2062"/>
-        <w:gridCol w:w="2062"/>
-        <w:gridCol w:w="2062"/>
-        <w:gridCol w:w="2062"/>
-        <w:gridCol w:w="2062"/>
+        <w:gridCol w:w="2064"/>
+        <w:gridCol w:w="2064"/>
+        <w:gridCol w:w="2064"/>
+        <w:gridCol w:w="2064"/>
+        <w:gridCol w:w="2064"/>
       </w:tblGrid>
       <w:tr>
         <w:tc>
           <w:tcPr>
-            <w:tcW w:type="dxa" w:w="2062"/>
+            <w:tcW w:type="dxa" w:w="2064"/>
           </w:tcPr>
           <w:p>
             <w:r>
@@ -2081,7 +2174,7 @@
         </w:tc>
         <w:tc>
           <w:tcPr>
-            <w:tcW w:type="dxa" w:w="2062"/>
+            <w:tcW w:type="dxa" w:w="2064"/>
           </w:tcPr>
           <w:p>
             <w:r>
@@ -2091,7 +2184,7 @@
         </w:tc>
         <w:tc>
           <w:tcPr>
-            <w:tcW w:type="dxa" w:w="2062"/>
+            <w:tcW w:type="dxa" w:w="2064"/>
           </w:tcPr>
           <w:p>
             <w:r>
@@ -2101,7 +2194,7 @@
         </w:tc>
         <w:tc>
           <w:tcPr>
-            <w:tcW w:type="dxa" w:w="2062"/>
+            <w:tcW w:type="dxa" w:w="2064"/>
           </w:tcPr>
           <w:p>
             <w:r>
@@ -2111,7 +2204,7 @@
         </w:tc>
         <w:tc>
           <w:tcPr>
-            <w:tcW w:type="dxa" w:w="2062"/>
+            <w:tcW w:type="dxa" w:w="2064"/>
           </w:tcPr>
           <w:p>
             <w:r>
@@ -2123,7 +2216,7 @@
       <w:tr>
         <w:tc>
           <w:tcPr>
-            <w:tcW w:type="dxa" w:w="2062"/>
+            <w:tcW w:type="dxa" w:w="2064"/>
           </w:tcPr>
           <w:p>
             <w:r>
@@ -2133,41 +2226,41 @@
         </w:tc>
         <w:tc>
           <w:tcPr>
-            <w:tcW w:type="dxa" w:w="2062"/>
+            <w:tcW w:type="dxa" w:w="2064"/>
           </w:tcPr>
           <w:p>
             <w:r>
-              <w:t>33.51%</w:t>
+              <w:t>152.67%</w:t>
             </w:r>
           </w:p>
         </w:tc>
         <w:tc>
           <w:tcPr>
-            <w:tcW w:type="dxa" w:w="2062"/>
+            <w:tcW w:type="dxa" w:w="2064"/>
           </w:tcPr>
           <w:p>
             <w:r>
-              <w:t>1.333</w:t>
+              <w:t>1.402</w:t>
             </w:r>
           </w:p>
         </w:tc>
         <w:tc>
           <w:tcPr>
-            <w:tcW w:type="dxa" w:w="2062"/>
+            <w:tcW w:type="dxa" w:w="2064"/>
           </w:tcPr>
           <w:p>
             <w:r>
-              <w:t>83.08%</w:t>
+              <w:t>378.48%</w:t>
             </w:r>
           </w:p>
         </w:tc>
         <w:tc>
           <w:tcPr>
-            <w:tcW w:type="dxa" w:w="2062"/>
+            <w:tcW w:type="dxa" w:w="2064"/>
           </w:tcPr>
           <w:p>
             <w:r>
-              <w:t>1.114</w:t>
+              <w:t>1.154</w:t>
             </w:r>
           </w:p>
         </w:tc>
@@ -2175,7 +2268,7 @@
       <w:tr>
         <w:tc>
           <w:tcPr>
-            <w:tcW w:type="dxa" w:w="2062"/>
+            <w:tcW w:type="dxa" w:w="2064"/>
           </w:tcPr>
           <w:p>
             <w:r>
@@ -2185,41 +2278,41 @@
         </w:tc>
         <w:tc>
           <w:tcPr>
-            <w:tcW w:type="dxa" w:w="2062"/>
+            <w:tcW w:type="dxa" w:w="2064"/>
           </w:tcPr>
           <w:p>
             <w:r>
-              <w:t>32.78%</w:t>
+              <w:t>149.32%</w:t>
             </w:r>
           </w:p>
         </w:tc>
         <w:tc>
           <w:tcPr>
-            <w:tcW w:type="dxa" w:w="2062"/>
+            <w:tcW w:type="dxa" w:w="2064"/>
           </w:tcPr>
           <w:p>
             <w:r>
-              <w:t>1.302</w:t>
+              <w:t>1.367</w:t>
             </w:r>
           </w:p>
         </w:tc>
         <w:tc>
           <w:tcPr>
-            <w:tcW w:type="dxa" w:w="2062"/>
+            <w:tcW w:type="dxa" w:w="2064"/>
           </w:tcPr>
           <w:p>
             <w:r>
-              <w:t>82.68%</w:t>
+              <w:t>376.69%</w:t>
             </w:r>
           </w:p>
         </w:tc>
         <w:tc>
           <w:tcPr>
-            <w:tcW w:type="dxa" w:w="2062"/>
+            <w:tcW w:type="dxa" w:w="2064"/>
           </w:tcPr>
           <w:p>
             <w:r>
-              <w:t>1.108</w:t>
+              <w:t>1.147</w:t>
             </w:r>
           </w:p>
         </w:tc>
@@ -2227,7 +2320,7 @@
       <w:tr>
         <w:tc>
           <w:tcPr>
-            <w:tcW w:type="dxa" w:w="2062"/>
+            <w:tcW w:type="dxa" w:w="2064"/>
           </w:tcPr>
           <w:p>
             <w:r>
@@ -2237,41 +2330,41 @@
         </w:tc>
         <w:tc>
           <w:tcPr>
-            <w:tcW w:type="dxa" w:w="2062"/>
+            <w:tcW w:type="dxa" w:w="2064"/>
           </w:tcPr>
           <w:p>
             <w:r>
-              <w:t>31.30%</w:t>
+              <w:t>142.61%</w:t>
             </w:r>
           </w:p>
         </w:tc>
         <w:tc>
           <w:tcPr>
-            <w:tcW w:type="dxa" w:w="2062"/>
+            <w:tcW w:type="dxa" w:w="2064"/>
           </w:tcPr>
           <w:p>
             <w:r>
-              <w:t>1.241</w:t>
+              <w:t>1.299</w:t>
             </w:r>
           </w:p>
         </w:tc>
         <w:tc>
           <w:tcPr>
-            <w:tcW w:type="dxa" w:w="2062"/>
+            <w:tcW w:type="dxa" w:w="2064"/>
           </w:tcPr>
           <w:p>
             <w:r>
-              <w:t>81.90%</w:t>
+              <w:t>373.12%</w:t>
             </w:r>
           </w:p>
         </w:tc>
         <w:tc>
           <w:tcPr>
-            <w:tcW w:type="dxa" w:w="2062"/>
+            <w:tcW w:type="dxa" w:w="2064"/>
           </w:tcPr>
           <w:p>
             <w:r>
-              <w:t>1.096</w:t>
+              <w:t>1.133</w:t>
             </w:r>
           </w:p>
         </w:tc>
@@ -2279,7 +2372,7 @@
     </w:tbl>
     <w:p>
       <w:r>
-        <w:t>基準2點設定下，策略毛損益3,469,600.00元，成本192,063.42元，占毛獲利5.54%。其中手續費18,400元、期交稅26,463.42元、滑價147,200元。4點滑價時Sharpe仍為1.241，但固定滑價不能完整模擬極端行情的成交失敗與流動性惡化。</w:t>
+        <w:t>基準2點設定下，策略毛損益3,469,600.00元，成本192,063.42元，占毛獲利5.54%。其中手續費18,400元、期交稅26,463.42元、滑價147,200元。4點滑價時Sharpe仍為1.299，但固定滑價不能完整模擬極端行情的成交失敗與流動性惡化。</w:t>
       </w:r>
     </w:p>
     <w:p>
@@ -2294,15 +2387,15 @@
         <w:tblLook w:firstColumn="1" w:firstRow="1" w:lastColumn="0" w:lastRow="0" w:noHBand="0" w:noVBand="1" w:val="04A0"/>
       </w:tblPr>
       <w:tblGrid>
-        <w:gridCol w:w="2578"/>
-        <w:gridCol w:w="2578"/>
-        <w:gridCol w:w="2578"/>
-        <w:gridCol w:w="2578"/>
+        <w:gridCol w:w="2579"/>
+        <w:gridCol w:w="2579"/>
+        <w:gridCol w:w="2579"/>
+        <w:gridCol w:w="2579"/>
       </w:tblGrid>
       <w:tr>
         <w:tc>
           <w:tcPr>
-            <w:tcW w:type="dxa" w:w="2578"/>
+            <w:tcW w:type="dxa" w:w="2579"/>
           </w:tcPr>
           <w:p>
             <w:r>
@@ -2312,7 +2405,7 @@
         </w:tc>
         <w:tc>
           <w:tcPr>
-            <w:tcW w:type="dxa" w:w="2578"/>
+            <w:tcW w:type="dxa" w:w="2579"/>
           </w:tcPr>
           <w:p>
             <w:r>
@@ -2322,7 +2415,7 @@
         </w:tc>
         <w:tc>
           <w:tcPr>
-            <w:tcW w:type="dxa" w:w="2578"/>
+            <w:tcW w:type="dxa" w:w="2579"/>
           </w:tcPr>
           <w:p>
             <w:r>
@@ -2332,7 +2425,7 @@
         </w:tc>
         <w:tc>
           <w:tcPr>
-            <w:tcW w:type="dxa" w:w="2578"/>
+            <w:tcW w:type="dxa" w:w="2579"/>
           </w:tcPr>
           <w:p>
             <w:r>
@@ -2344,7 +2437,7 @@
       <w:tr>
         <w:tc>
           <w:tcPr>
-            <w:tcW w:type="dxa" w:w="2578"/>
+            <w:tcW w:type="dxa" w:w="2579"/>
           </w:tcPr>
           <w:p>
             <w:r>
@@ -2354,31 +2447,31 @@
         </w:tc>
         <w:tc>
           <w:tcPr>
-            <w:tcW w:type="dxa" w:w="2578"/>
+            <w:tcW w:type="dxa" w:w="2579"/>
           </w:tcPr>
           <w:p>
             <w:r>
-              <w:t>32.78%</w:t>
+              <w:t>149.32%</w:t>
             </w:r>
           </w:p>
         </w:tc>
         <w:tc>
           <w:tcPr>
-            <w:tcW w:type="dxa" w:w="2578"/>
+            <w:tcW w:type="dxa" w:w="2579"/>
           </w:tcPr>
           <w:p>
             <w:r>
-              <w:t>1.302</w:t>
+              <w:t>1.367</w:t>
             </w:r>
           </w:p>
         </w:tc>
         <w:tc>
           <w:tcPr>
-            <w:tcW w:type="dxa" w:w="2578"/>
+            <w:tcW w:type="dxa" w:w="2579"/>
           </w:tcPr>
           <w:p>
             <w:r>
-              <w:t>3.93%</w:t>
+              <w:t>12.72%</w:t>
             </w:r>
           </w:p>
         </w:tc>
@@ -2386,7 +2479,7 @@
       <w:tr>
         <w:tc>
           <w:tcPr>
-            <w:tcW w:type="dxa" w:w="2578"/>
+            <w:tcW w:type="dxa" w:w="2579"/>
           </w:tcPr>
           <w:p>
             <w:r>
@@ -2396,31 +2489,31 @@
         </w:tc>
         <w:tc>
           <w:tcPr>
-            <w:tcW w:type="dxa" w:w="2578"/>
+            <w:tcW w:type="dxa" w:w="2579"/>
           </w:tcPr>
           <w:p>
             <w:r>
-              <w:t>42.24%</w:t>
+              <w:t>192.42%</w:t>
             </w:r>
           </w:p>
         </w:tc>
         <w:tc>
           <w:tcPr>
-            <w:tcW w:type="dxa" w:w="2578"/>
+            <w:tcW w:type="dxa" w:w="2579"/>
           </w:tcPr>
           <w:p>
             <w:r>
-              <w:t>0.868</w:t>
+              <w:t>0.956</w:t>
             </w:r>
           </w:p>
         </w:tc>
         <w:tc>
           <w:tcPr>
-            <w:tcW w:type="dxa" w:w="2578"/>
+            <w:tcW w:type="dxa" w:w="2579"/>
           </w:tcPr>
           <w:p>
             <w:r>
-              <w:t>9.48%</w:t>
+              <w:t>27.72%</w:t>
             </w:r>
           </w:p>
         </w:tc>
@@ -2428,7 +2521,7 @@
       <w:tr>
         <w:tc>
           <w:tcPr>
-            <w:tcW w:type="dxa" w:w="2578"/>
+            <w:tcW w:type="dxa" w:w="2579"/>
           </w:tcPr>
           <w:p>
             <w:r>
@@ -2438,31 +2531,31 @@
         </w:tc>
         <w:tc>
           <w:tcPr>
-            <w:tcW w:type="dxa" w:w="2578"/>
+            <w:tcW w:type="dxa" w:w="2579"/>
           </w:tcPr>
           <w:p>
             <w:r>
-              <w:t>48.26%</w:t>
+              <w:t>219.87%</w:t>
             </w:r>
           </w:p>
         </w:tc>
         <w:tc>
           <w:tcPr>
-            <w:tcW w:type="dxa" w:w="2578"/>
+            <w:tcW w:type="dxa" w:w="2579"/>
           </w:tcPr>
           <w:p>
             <w:r>
-              <w:t>0.956</w:t>
+              <w:t>1.118</w:t>
             </w:r>
           </w:p>
         </w:tc>
         <w:tc>
           <w:tcPr>
-            <w:tcW w:type="dxa" w:w="2578"/>
+            <w:tcW w:type="dxa" w:w="2579"/>
           </w:tcPr>
           <w:p>
             <w:r>
-              <w:t>9.55%</w:t>
+              <w:t>23.86%</w:t>
             </w:r>
           </w:p>
         </w:tc>
@@ -2485,17 +2578,13 @@
     </w:p>
     <w:p>
       <w:r>
-        <w:t>較早2018～2022淨利108.30萬元、描述性Sharpe 1.140；2023～2026淨利219.46萬元、Sharpe 1.481。兩段均為正，但2018、2022、2024年度為負。2024基準上漲而策略虧損，顯示趨勢過濾仍可能漏接行情或反覆進出。</w:t>
-      </w:r>
-    </w:p>
-    <w:p>
-      <w:r>
-        <w:br w:type="page"/>
+        <w:t>較早2018～2022淨利108.30萬元、描述性Sharpe 1.224；2023～2026淨利219.46萬元、Sharpe 1.518。兩段均為正，但2018、2022、2024年度為負。2024基準上漲而策略虧損，顯示趨勢過濾仍可能漏接行情或反覆進出。</w:t>
       </w:r>
     </w:p>
     <w:p>
       <w:pPr>
         <w:pStyle w:val="Heading1"/>
+        <w:pageBreakBefore/>
       </w:pPr>
       <w:r>
         <w:t>7　風險來源與策略限制</w:t>
@@ -2514,6 +2603,11 @@
     <w:p>
       <w:r>
         <w:t>20日平均用於降低單日成交流量雜訊，再以價格高於20日均線作為趨勢確認。回測中較高的Sharpe僅代表此規則在目前樣本中的歷史風險調整績效；由於策略採多單／空手架構，績效同時受到長期多頭趨勢與隔夜報酬影響，不能將全部成果歸因於法人資訊優勢。</w:t>
+      </w:r>
+    </w:p>
+    <w:p>
+      <w:r>
+        <w:t>固定一口Buy-and-Hold的MDD為28.64%，高於策略的12.72%，主要原因之一是基準幾乎全期持有，而策略只有658個日末持倉日。改用相同一口、相同持倉日與相同147段持有的位移對照後，代表路徑MDD為13.40%，全部位移的中位數MDD為28.71%。這表示「一口」只相同化單次口數，沒有自動相同化時間曝險或實現波動。</w:t>
       </w:r>
     </w:p>
     <w:p>
@@ -2543,17 +2637,13 @@
     </w:p>
     <w:p>
       <w:r>
-        <w:t>因此3.93%的日末MDD不應解讀為單筆交易或盤中可能遭受的最大損失。完整名目價值資金限制降低了槓桿造成的風險，但無法消除跳空與流動性風險；若進一步評估實際交易可行性，仍需納入夜盤價格、盤中極端波動與開盤成交品質。</w:t>
-      </w:r>
-    </w:p>
-    <w:p>
-      <w:r>
-        <w:br w:type="page"/>
+        <w:t>因此12.72%的日末MDD不應解讀為單筆交易或盤中可能遭受的最大損失。共同起始資金取首日一口TX的開盤名目價值，並未重建歷史保證金與追繳；若進一步評估實際交易可行性，仍需納入夜盤價格、盤中極端波動、開盤成交品質與逐日保證金需求。</w:t>
       </w:r>
     </w:p>
     <w:p>
       <w:pPr>
         <w:pStyle w:val="Heading1"/>
+        <w:pageBreakBefore/>
       </w:pPr>
       <w:r>
         <w:t>8　結論與後續驗證</w:t>
@@ -2566,7 +2656,12 @@
     </w:p>
     <w:p>
       <w:r>
-        <w:t>策略Sharpe為1.302、Calmar為0.906，高於固定一口Buy-and-Hold基準的1.108與0.694，MDD亦由11.12%降至3.93%；但策略累積報酬32.78%，低於基準82.68%。因此主要優勢體現在歷史風險效率與回撤控制，而非絕對收益。較低市場曝險同時降低下跌風險，也犧牲部分多頭行情的收益。</w:t>
+        <w:t>以2,195,000.00元建立兩條權益曲線，逐日累加淨損益後，策略Sharpe為1.367、Calmar為0.939，固定一口Buy-and-Hold為1.147與0.743；策略MDD為12.72%，基準為28.64%。策略累積報酬149.32%低於基準376.69%。固定一口比較仍有持倉時間差異：策略持倉日約為基準三分之一。</w:t>
+      </w:r>
+    </w:p>
+    <w:p>
+      <w:r>
+        <w:t>一口等曝險位移對照的中位數Sharpe為0.682、MDD為28.71%；最接近策略波動的代表路徑Sharpe為1.295、MDD為13.40%。策略在本樣本仍顯示較佳風險效率，但位移診斷是事後統計控制，不是可部署的交易基準，也不能取代獨立樣本外驗證。</w:t>
       </w:r>
     </w:p>
     <w:p>
@@ -2614,12 +2709,12 @@
     </w:p>
     <w:p>
       <w:r>
-        <w:t>Sharpe＝日報酬平均／日報酬樣本標準差×√252；Calmar＝CAGR／最大回撤比例。所有績效指標均依相同初始資金、交易期間與成本假設計算；波動配平結果僅作風險尺度診斷，不列為主要可執行基準。</w:t>
+        <w:t>Sharpe＝日報酬平均／日報酬樣本標準差×√252；Calmar＝CAGR／最大回撤比例。全部權益曲線以首日一口TX開盤名目價值起算，MDD取曲線相對歷史高點的最大跌幅；一口等曝險位移作風險尺度診斷。</w:t>
       </w:r>
     </w:p>
     <w:sectPr>
-      <w:pgSz w:w="12240" w:h="15840"/>
-      <w:pgMar w:top="964" w:right="964" w:bottom="964" w:left="964" w:header="720" w:footer="720" w:gutter="0"/>
+      <w:pgSz w:w="11906" w:h="16838"/>
+      <w:pgMar w:top="680" w:right="794" w:bottom="680" w:left="794" w:header="720" w:footer="720" w:gutter="0"/>
       <w:cols w:space="720"/>
       <w:docGrid w:linePitch="360"/>
     </w:sectPr>
@@ -2990,9 +3085,12 @@
     <w:name w:val="Normal"/>
     <w:qFormat/>
     <w:rsid w:val="00FC693F"/>
+    <w:pPr>
+      <w:spacing w:after="40" w:line="240" w:lineRule="auto"/>
+    </w:pPr>
     <w:rPr>
       <w:rFonts w:ascii="Noto Sans TC" w:hAnsi="Noto Sans TC" w:eastAsia="Noto Sans TC"/>
-      <w:sz w:val="21"/>
+      <w:sz w:val="18"/>
     </w:rPr>
   </w:style>
   <w:style w:type="paragraph" w:styleId="Header">

</xml_diff>

<commit_message>
report: align sections with assignment spec, add data dictionary, indicator chart and event windows
- Rename report sections to 壹 資料介紹 / 貳 策略假設與訊號建構 / 參 回測設定與摩擦成本 / 肆 績效分析與圖表 / 伍 策略極限與檢討 / 陸 結論
- Add TAIFEX institutional column dictionary with publication time and T+1 open execution rule
- Add indicator_timeseries.png (Q, Q20, near-month close, holding periods)
- Add event_windows.py: eight crash/gap windows (post-hoc descriptive), new workbook sheet 特殊期間_事後描述
- Clarify leverage (capital = one-contract notional, ~1x) and warm-up vs common start date
- ci_verify: 21 sheets, required headings, PDF 6-8 pages, event window reconciliation
- Backtest metrics unchanged
</commit_message>
<xml_diff>
--- a/TX_flow_trend_report.docx
+++ b/TX_flow_trend_report.docx
@@ -4,15 +4,18 @@
   <w:body>
     <w:p>
       <w:pPr>
+        <w:pStyle w:val="Title"/>
+      </w:pPr>
+      <w:r>
+        <w:t>臺灣期交所盤後籌碼量化分析與交易策略回測：三大法人交易強度20日＋價格趨勢（TX近月一口多單／空手）</w:t>
+      </w:r>
+    </w:p>
+    <w:p>
+      <w:pPr>
         <w:pStyle w:val="Heading1"/>
       </w:pPr>
       <w:r>
-        <w:t>1　研究目的與資料完整性</w:t>
-      </w:r>
-    </w:p>
-    <w:p>
-      <w:r>
-        <w:t>法人交易強度＋價格趨勢：跨日持倉策略</w:t>
+        <w:t>壹、資料介紹：來源、欄位定義與經濟意涵</w:t>
       </w:r>
     </w:p>
     <w:p>
@@ -69,7 +72,7 @@
           </w:tcPr>
           <w:p>
             <w:r>
-              <w:t>TAIFEX年度ZIP及月檔；2016/10/05～2026/10/05，2,438日、14,202筆實際月契約、126個契約。僅保留一般交易時段、六碼月契約。</w:t>
+              <w:t>TAIFEX「期貨每日交易行情」年度ZIP及月檔；2016/10/05～2026/10/05，2,438日、14,202筆實際月契約、126個契約。僅保留一般交易時段、六碼月契約。</w:t>
             </w:r>
           </w:p>
         </w:tc>
@@ -91,7 +94,7 @@
           </w:tcPr>
           <w:p>
             <w:r>
-              <w:t>FinMind TX歷史資料與TAIFEX格式原始資料；2018/06/05～2026/10/05，2,030日、6,090筆三類法人資料。</w:t>
+              <w:t>TAIFEX「三大法人－區分各期貨契約」格式原始資料，並以FinMind TX歷史資料逐筆比對；2018/06/05～2026/10/05，2,030日、6,090筆三類法人資料。</w:t>
             </w:r>
           </w:p>
         </w:tc>
@@ -113,7 +116,7 @@
           </w:tcPr>
           <w:p>
             <w:r>
-              <w:t>2018-08-31～2026-10-05，共1,968日；本策略需要20日暖身。</w:t>
+              <w:t>2018-08-31～2026-10-05，共1,968日。起始日沿用先前候選比較的共同期間（最長需60日暖身）；本策略只需20日，Q20自2018/07/03起即可計算。</w:t>
             </w:r>
           </w:p>
         </w:tc>
@@ -146,6 +149,176 @@
         <w:t>較新期間以TAIFEX格式原始資料優先，以降低不同資料來源歷史值差異造成的影響；三類法人日期均與行情交易日曆一致。資料未混入MTX、週契約、夜盤或價差交易。原始月契約共有179筆OHLC缺值紀錄，但策略及基準實際使用的進出、轉倉與評價價格均完整。</w:t>
       </w:r>
     </w:p>
+    <w:p>
+      <w:r>
+        <w:t>期交所三大法人期貨交易資訊：原始欄位字典與公布時點</w:t>
+      </w:r>
+    </w:p>
+    <w:tbl>
+      <w:tblPr>
+        <w:tblStyle w:val="TableGrid"/>
+        <w:tblW w:type="auto" w:w="0"/>
+        <w:tblLook w:firstColumn="1" w:firstRow="1" w:lastColumn="0" w:lastRow="0" w:noHBand="0" w:noVBand="1" w:val="04A0"/>
+      </w:tblPr>
+      <w:tblGrid>
+        <w:gridCol w:w="5159"/>
+        <w:gridCol w:w="5159"/>
+      </w:tblGrid>
+      <w:tr>
+        <w:tc>
+          <w:tcPr>
+            <w:tcW w:type="dxa" w:w="5159"/>
+          </w:tcPr>
+          <w:p>
+            <w:r>
+              <w:t>原始欄位</w:t>
+            </w:r>
+          </w:p>
+        </w:tc>
+        <w:tc>
+          <w:tcPr>
+            <w:tcW w:type="dxa" w:w="5159"/>
+          </w:tcPr>
+          <w:p>
+            <w:r>
+              <w:t>定義、單位與市場意涵</w:t>
+            </w:r>
+          </w:p>
+        </w:tc>
+      </w:tr>
+      <w:tr>
+        <w:tc>
+          <w:tcPr>
+            <w:tcW w:type="dxa" w:w="5159"/>
+          </w:tcPr>
+          <w:p>
+            <w:r>
+              <w:t>日期／商品名稱／身份別</w:t>
+            </w:r>
+          </w:p>
+        </w:tc>
+        <w:tc>
+          <w:tcPr>
+            <w:tcW w:type="dxa" w:w="5159"/>
+          </w:tcPr>
+          <w:p>
+            <w:r>
+              <w:t>交易日；臺股期貨；外資及陸資、投信、自營商。三類均為眾多機構的合計，淨額只是互抵結果，不代表單一機構或整類法人一致看多或看空。[2]</w:t>
+            </w:r>
+          </w:p>
+        </w:tc>
+      </w:tr>
+      <w:tr>
+        <w:tc>
+          <w:tcPr>
+            <w:tcW w:type="dxa" w:w="5159"/>
+          </w:tcPr>
+          <w:p>
+            <w:r>
+              <w:t>多方交易口數／空方交易口數</w:t>
+            </w:r>
+          </w:p>
+        </w:tc>
+        <w:tc>
+          <w:tcPr>
+            <w:tcW w:type="dxa" w:w="5159"/>
+          </w:tcPr>
+          <w:p>
+            <w:r>
+              <w:t>當日買進成交口數／賣出成交口數（口），屬成交「流量」。本研究核心欄位，用以計算淨交易口數B與總交易口數V。</w:t>
+            </w:r>
+          </w:p>
+        </w:tc>
+      </w:tr>
+      <w:tr>
+        <w:tc>
+          <w:tcPr>
+            <w:tcW w:type="dxa" w:w="5159"/>
+          </w:tcPr>
+          <w:p>
+            <w:r>
+              <w:t>多空交易口數淨額</w:t>
+            </w:r>
+          </w:p>
+        </w:tc>
+        <w:tc>
+          <w:tcPr>
+            <w:tcW w:type="dxa" w:w="5159"/>
+          </w:tcPr>
+          <w:p>
+            <w:r>
+              <w:t>多方減空方交易口數（口）；正值為當日淨買進。已核對全數等於兩欄相減。</w:t>
+            </w:r>
+          </w:p>
+        </w:tc>
+      </w:tr>
+      <w:tr>
+        <w:tc>
+          <w:tcPr>
+            <w:tcW w:type="dxa" w:w="5159"/>
+          </w:tcPr>
+          <w:p>
+            <w:r>
+              <w:t>多方／空方／淨額交易契約金額（千元）</w:t>
+            </w:r>
+          </w:p>
+        </w:tc>
+        <w:tc>
+          <w:tcPr>
+            <w:tcW w:type="dxa" w:w="5159"/>
+          </w:tcPr>
+          <w:p>
+            <w:r>
+              <w:t>成交口數×成交價×乘數；早期官方淨額欄位空白，本研究未使用金額欄位。</w:t>
+            </w:r>
+          </w:p>
+        </w:tc>
+      </w:tr>
+      <w:tr>
+        <w:tc>
+          <w:tcPr>
+            <w:tcW w:type="dxa" w:w="5159"/>
+          </w:tcPr>
+          <w:p>
+            <w:r>
+              <w:t>多方／空方未平倉口數、多空未平倉口數淨額</w:t>
+            </w:r>
+          </w:p>
+        </w:tc>
+        <w:tc>
+          <w:tcPr>
+            <w:tcW w:type="dxa" w:w="5159"/>
+          </w:tcPr>
+          <w:p>
+            <w:r>
+              <w:t>收盤後仍未沖銷的留倉口數（口），屬部位「存量」，常被解讀為法人方向性曝險。本研究保留於原始資料供對照，訊號只用當日成交流量，以避免存量受避險與套利部位長期累積影響。</w:t>
+            </w:r>
+          </w:p>
+        </w:tc>
+      </w:tr>
+      <w:tr>
+        <w:tc>
+          <w:tcPr>
+            <w:tcW w:type="dxa" w:w="5159"/>
+          </w:tcPr>
+          <w:p>
+            <w:r>
+              <w:t>公布時點／最早可用時點</w:t>
+            </w:r>
+          </w:p>
+        </w:tc>
+        <w:tc>
+          <w:tcPr>
+            <w:tcW w:type="dxa" w:w="5159"/>
+          </w:tcPr>
+          <w:p>
+            <w:r>
+              <w:t>期交所於交易日收盤後（約下午3時）公布T日資料；本研究保守採T+1日日盤08:45開盤為最早執行時點，不假設可於T日夜盤成交。</w:t>
+            </w:r>
+          </w:p>
+        </w:tc>
+      </w:tr>
+    </w:tbl>
     <w:p>
       <w:r>
         <w:t>本策略由18個候選規則中篩選後固定參數重新回測，因此結果屬探索性全樣本分析，尚未以完全未參與策略選擇的資料進行獨立樣本外驗證。此限制在後續結論中另行討論。</w:t>
@@ -162,7 +335,7 @@
         <w:pageBreakBefore/>
       </w:pPr>
       <w:r>
-        <w:t>2　指標定義、經濟意涵與訊號</w:t>
+        <w:t>壹（續）指標定義、經濟意涵與資料時間序列</w:t>
       </w:r>
     </w:p>
     <w:tbl>
@@ -302,7 +475,7 @@
           </w:tcPr>
           <w:p>
             <w:r>
-              <w:t>以口數標準化淨買進活動；B可為負，V為正。各類法人的成交流量可能含方向、避險與套利。</w:t>
+              <w:t>以口數標準化淨買進活動；B可為負，V為正，Q介於−1與1之間。各類法人的成交流量可能含方向、避險與套利。</w:t>
             </w:r>
           </w:p>
         </w:tc>
@@ -342,12 +515,57 @@
     </w:p>
     <w:p>
       <w:r>
-        <w:t>明確數學規則與資訊時序</w:t>
+        <w:drawing>
+          <wp:inline xmlns:a="http://schemas.openxmlformats.org/drawingml/2006/main" xmlns:pic="http://schemas.openxmlformats.org/drawingml/2006/picture">
+            <wp:extent cx="6120000" cy="2441489"/>
+            <wp:docPr id="1" name="Picture 1"/>
+            <wp:cNvGraphicFramePr>
+              <a:graphicFrameLocks noChangeAspect="1"/>
+            </wp:cNvGraphicFramePr>
+            <a:graphic>
+              <a:graphicData uri="http://schemas.openxmlformats.org/drawingml/2006/picture">
+                <pic:pic>
+                  <pic:nvPicPr>
+                    <pic:cNvPr id="0" name="indicator_timeseries.png"/>
+                    <pic:cNvPicPr/>
+                  </pic:nvPicPr>
+                  <pic:blipFill>
+                    <a:blip r:embed="rId9"/>
+                    <a:stretch>
+                      <a:fillRect/>
+                    </a:stretch>
+                  </pic:blipFill>
+                  <pic:spPr>
+                    <a:xfrm>
+                      <a:off x="0" y="0"/>
+                      <a:ext cx="6120000" cy="2441489"/>
+                    </a:xfrm>
+                    <a:prstGeom prst="rect"/>
+                  </pic:spPr>
+                </pic:pic>
+              </a:graphicData>
+            </a:graphic>
+          </wp:inline>
+        </w:drawing>
       </w:r>
     </w:p>
     <w:p>
       <w:r>
-        <w:t>第t日盤後：若Q20_t&gt;0且收盤C_t&gt;MA20_t，則目標多一口；其他情況目標空手。Q20=0或C=MA20均不持有。訊號只在t+1交易日08:45開盤執行，不使用t+1收盤決定t+1開盤交易。</w:t>
+        <w:t>圖一：上圖為TX近月收盤（未調整）與MA20，下圖為每日交易強度Q（長條）與Q20（實線）；陰影為策略日末持有多單的交易日（共658日，占33.43%）。Q的單日雜訊大（中位絕對值0.95%），Q20全期介於-0.99%與+0.88%之間、49.34%的交易日為正，因此零門檻實際上是「近期法人成交偏向淨買方」的方向判斷，而非強度分級。</w:t>
+      </w:r>
+    </w:p>
+    <w:p>
+      <w:pPr>
+        <w:pStyle w:val="Heading1"/>
+        <w:pageBreakBefore/>
+      </w:pPr>
+      <w:r>
+        <w:t>貳、策略假設與訊號建構</w:t>
+      </w:r>
+    </w:p>
+    <w:p>
+      <w:r>
+        <w:t>第t日盤後：若Q20_t&gt;0且收盤C_t&gt;MA20_t，則目標多一口；其他情況目標空手。Q20=0或C=MA20均不持有。訊號只在t+1交易日08:45開盤執行，不使用t+1收盤決定t+1開盤交易；T日盤後資料不假設可於T日夜盤成交。</w:t>
       </w:r>
     </w:p>
     <w:p>
@@ -357,16 +575,15 @@
     </w:p>
     <w:p>
       <w:r>
-        <w:t>交易日配對按官方行情日曆，不以自然日加一天。條件產生、成交、持倉及轉倉均可在逐日底稿追溯。</w:t>
+        <w:t>交易日配對按官方行情日曆，不以自然日加一天。條件產生、成交、持倉及轉倉均可在逐日底稿追溯；可能失效情境：盤整反覆穿越均線、急跌後V形反彈，以及法人成交流量由避險或套利主導的期間（見伍）。</w:t>
       </w:r>
     </w:p>
     <w:p>
       <w:pPr>
         <w:pStyle w:val="Heading1"/>
-        <w:pageBreakBefore/>
       </w:pPr>
       <w:r>
-        <w:t>3　交易執行、轉倉與完整成本</w:t>
+        <w:t>參、回測設定與摩擦成本</w:t>
       </w:r>
     </w:p>
     <w:p>
@@ -516,7 +733,7 @@
           </w:tcPr>
           <w:p>
             <w:r>
-              <w:t>共同起始資金不代表歷史保證金要求；未重建逐日保證金與追繳。全期策略與固定一口基準權益均維持正值。</w:t>
+              <w:t>起始資金等於一口名目價值，名目槓桿約1倍；若改以保證金為分母，報酬與回撤比例會同比例放大。起始資金不代表歷史保證金要求，未重建逐日保證金與追繳；全期策略與基準權益均維持正值。</w:t>
             </w:r>
           </w:p>
         </w:tc>
@@ -582,7 +799,7 @@
         <w:pageBreakBefore/>
       </w:pPr>
       <w:r>
-        <w:t>4　績效指標與年度比較</w:t>
+        <w:t>肆、績效分析：量化指標與年度比較</w:t>
       </w:r>
     </w:p>
     <w:tbl>
@@ -1627,7 +1844,7 @@
         <w:pageBreakBefore/>
       </w:pPr>
       <w:r>
-        <w:t>5　資金曲線、回撤與風險配平診斷</w:t>
+        <w:t>肆（續）資產淨值累積曲線、回撤水下圖與風險配平診斷</w:t>
       </w:r>
     </w:p>
     <w:tbl>
@@ -1649,7 +1866,7 @@
               <w:drawing>
                 <wp:inline xmlns:a="http://schemas.openxmlformats.org/drawingml/2006/main" xmlns:pic="http://schemas.openxmlformats.org/drawingml/2006/picture">
                   <wp:extent cx="2916000" cy="1163298"/>
-                  <wp:docPr id="1" name="Picture 1"/>
+                  <wp:docPr id="2" name="Picture 2"/>
                   <wp:cNvGraphicFramePr>
                     <a:graphicFrameLocks noChangeAspect="1"/>
                   </wp:cNvGraphicFramePr>
@@ -1658,47 +1875,6 @@
                       <pic:pic>
                         <pic:nvPicPr>
                           <pic:cNvPr id="0" name="equity_comparison.png"/>
-                          <pic:cNvPicPr/>
-                        </pic:nvPicPr>
-                        <pic:blipFill>
-                          <a:blip r:embed="rId9"/>
-                          <a:stretch>
-                            <a:fillRect/>
-                          </a:stretch>
-                        </pic:blipFill>
-                        <pic:spPr>
-                          <a:xfrm>
-                            <a:off x="0" y="0"/>
-                            <a:ext cx="2916000" cy="1163298"/>
-                          </a:xfrm>
-                          <a:prstGeom prst="rect"/>
-                        </pic:spPr>
-                      </pic:pic>
-                    </a:graphicData>
-                  </a:graphic>
-                </wp:inline>
-              </w:drawing>
-            </w:r>
-          </w:p>
-        </w:tc>
-        <w:tc>
-          <w:tcPr>
-            <w:tcW w:type="dxa" w:w="5159"/>
-          </w:tcPr>
-          <w:p>
-            <w:r>
-              <w:drawing>
-                <wp:inline xmlns:a="http://schemas.openxmlformats.org/drawingml/2006/main" xmlns:pic="http://schemas.openxmlformats.org/drawingml/2006/picture">
-                  <wp:extent cx="2916000" cy="1163298"/>
-                  <wp:docPr id="2" name="Picture 2"/>
-                  <wp:cNvGraphicFramePr>
-                    <a:graphicFrameLocks noChangeAspect="1"/>
-                  </wp:cNvGraphicFramePr>
-                  <a:graphic>
-                    <a:graphicData uri="http://schemas.openxmlformats.org/drawingml/2006/picture">
-                      <pic:pic>
-                        <pic:nvPicPr>
-                          <pic:cNvPr id="0" name="equity_comparison_log.png"/>
                           <pic:cNvPicPr/>
                         </pic:nvPicPr>
                         <pic:blipFill>
@@ -1722,11 +1898,52 @@
             </w:r>
           </w:p>
         </w:tc>
+        <w:tc>
+          <w:tcPr>
+            <w:tcW w:type="dxa" w:w="5159"/>
+          </w:tcPr>
+          <w:p>
+            <w:r>
+              <w:drawing>
+                <wp:inline xmlns:a="http://schemas.openxmlformats.org/drawingml/2006/main" xmlns:pic="http://schemas.openxmlformats.org/drawingml/2006/picture">
+                  <wp:extent cx="2916000" cy="1163298"/>
+                  <wp:docPr id="3" name="Picture 3"/>
+                  <wp:cNvGraphicFramePr>
+                    <a:graphicFrameLocks noChangeAspect="1"/>
+                  </wp:cNvGraphicFramePr>
+                  <a:graphic>
+                    <a:graphicData uri="http://schemas.openxmlformats.org/drawingml/2006/picture">
+                      <pic:pic>
+                        <pic:nvPicPr>
+                          <pic:cNvPr id="0" name="equity_comparison_log.png"/>
+                          <pic:cNvPicPr/>
+                        </pic:nvPicPr>
+                        <pic:blipFill>
+                          <a:blip r:embed="rId11"/>
+                          <a:stretch>
+                            <a:fillRect/>
+                          </a:stretch>
+                        </pic:blipFill>
+                        <pic:spPr>
+                          <a:xfrm>
+                            <a:off x="0" y="0"/>
+                            <a:ext cx="2916000" cy="1163298"/>
+                          </a:xfrm>
+                          <a:prstGeom prst="rect"/>
+                        </pic:spPr>
+                      </pic:pic>
+                    </a:graphicData>
+                  </a:graphic>
+                </wp:inline>
+              </w:drawing>
+            </w:r>
+          </w:p>
+        </w:tc>
       </w:tr>
     </w:tbl>
     <w:p>
       <w:r>
-        <w:t>圖一：左為線性Y軸、右為對數Y軸。三條權益曲線皆以2,195,000.00元為起點，逐日累加含全部交易成本的淨損益；對數軸只改變顯示尺度。</w:t>
+        <w:t>圖二（Equity Curve）：上方兩圖只比較策略與固定一口 Buy-and-Hold；左為線性Y軸、右為對數Y軸。風險配平 benchmark 不加入圖表，避免與可直接交易的固定一口路徑混淆。</w:t>
       </w:r>
     </w:p>
     <w:p>
@@ -1734,7 +1951,7 @@
         <w:drawing>
           <wp:inline xmlns:a="http://schemas.openxmlformats.org/drawingml/2006/main" xmlns:pic="http://schemas.openxmlformats.org/drawingml/2006/picture">
             <wp:extent cx="6120000" cy="2441489"/>
-            <wp:docPr id="3" name="Picture 3"/>
+            <wp:docPr id="4" name="Picture 4"/>
             <wp:cNvGraphicFramePr>
               <a:graphicFrameLocks noChangeAspect="1"/>
             </wp:cNvGraphicFramePr>
@@ -1746,7 +1963,7 @@
                     <pic:cNvPicPr/>
                   </pic:nvPicPr>
                   <pic:blipFill>
-                    <a:blip r:embed="rId11"/>
+                    <a:blip r:embed="rId12"/>
                     <a:stretch>
                       <a:fillRect/>
                     </a:stretch>
@@ -1767,12 +1984,12 @@
     </w:p>
     <w:p>
       <w:r>
-        <w:t>圖二：MDD從各條權益曲線的歷史高點計算。V04策略為12.72%，固定一口基準為28.64%；兩者持倉時間不同。</w:t>
+        <w:t>圖三（Underwater Chart）：回撤仍只比較策略與固定一口基準。策略MDD為12.72%，固定一口基準為28.64%。</w:t>
       </w:r>
     </w:p>
     <w:p>
       <w:r>
-        <w:t>一口等曝險風險診斷</w:t>
+        <w:t>風險配平比較（僅列於表格）</w:t>
       </w:r>
     </w:p>
     <w:tbl>
@@ -1814,7 +2031,7 @@
           </w:tcPr>
           <w:p>
             <w:r>
-              <w:t>等曝險代表路徑</w:t>
+              <w:t>風險配平基準</w:t>
             </w:r>
           </w:p>
         </w:tc>
@@ -1836,7 +2053,7 @@
           </w:tcPr>
           <w:p>
             <w:r>
-              <w:t>口數</w:t>
+              <w:t>部位</w:t>
             </w:r>
           </w:p>
         </w:tc>
@@ -1846,7 +2063,7 @@
           </w:tcPr>
           <w:p>
             <w:r>
-              <w:t>1</w:t>
+              <w:t>1.000口</w:t>
             </w:r>
           </w:p>
         </w:tc>
@@ -1856,7 +2073,7 @@
           </w:tcPr>
           <w:p>
             <w:r>
-              <w:t>1</w:t>
+              <w:t>0.293口</w:t>
             </w:r>
           </w:p>
         </w:tc>
@@ -1878,7 +2095,7 @@
           </w:tcPr>
           <w:p>
             <w:r>
-              <w:t>日末持倉日</w:t>
+              <w:t>年化波動</w:t>
             </w:r>
           </w:p>
         </w:tc>
@@ -1888,7 +2105,7 @@
           </w:tcPr>
           <w:p>
             <w:r>
-              <w:t>1968</w:t>
+              <w:t>19.03%</w:t>
             </w:r>
           </w:p>
         </w:tc>
@@ -1898,7 +2115,7 @@
           </w:tcPr>
           <w:p>
             <w:r>
-              <w:t>658</w:t>
+              <w:t>8.84%</w:t>
             </w:r>
           </w:p>
         </w:tc>
@@ -1908,7 +2125,7 @@
           </w:tcPr>
           <w:p>
             <w:r>
-              <w:t>658</w:t>
+              <w:t>8.84%</w:t>
             </w:r>
           </w:p>
         </w:tc>
@@ -1920,7 +2137,7 @@
           </w:tcPr>
           <w:p>
             <w:r>
-              <w:t>年化波動</w:t>
+              <w:t>CAGR</w:t>
             </w:r>
           </w:p>
         </w:tc>
@@ -1930,7 +2147,7 @@
           </w:tcPr>
           <w:p>
             <w:r>
-              <w:t>19.03%</w:t>
+              <w:t>21.27%</w:t>
             </w:r>
           </w:p>
         </w:tc>
@@ -1940,7 +2157,7 @@
           </w:tcPr>
           <w:p>
             <w:r>
-              <w:t>11.05%</w:t>
+              <w:t>9.61%</w:t>
             </w:r>
           </w:p>
         </w:tc>
@@ -1950,7 +2167,7 @@
           </w:tcPr>
           <w:p>
             <w:r>
-              <w:t>8.84%</w:t>
+              <w:t>11.94%</w:t>
             </w:r>
           </w:p>
         </w:tc>
@@ -1962,7 +2179,7 @@
           </w:tcPr>
           <w:p>
             <w:r>
-              <w:t>CAGR</w:t>
+              <w:t>Sharpe</w:t>
             </w:r>
           </w:p>
         </w:tc>
@@ -1972,7 +2189,7 @@
           </w:tcPr>
           <w:p>
             <w:r>
-              <w:t>21.27%</w:t>
+              <w:t>1.147</w:t>
             </w:r>
           </w:p>
         </w:tc>
@@ -1982,7 +2199,7 @@
           </w:tcPr>
           <w:p>
             <w:r>
-              <w:t>14.12%</w:t>
+              <w:t>1.120</w:t>
             </w:r>
           </w:p>
         </w:tc>
@@ -1992,7 +2209,7 @@
           </w:tcPr>
           <w:p>
             <w:r>
-              <w:t>11.94%</w:t>
+              <w:t>1.367</w:t>
             </w:r>
           </w:p>
         </w:tc>
@@ -2004,7 +2221,7 @@
           </w:tcPr>
           <w:p>
             <w:r>
-              <w:t>Sharpe</w:t>
+              <w:t>MDD</w:t>
             </w:r>
           </w:p>
         </w:tc>
@@ -2014,7 +2231,7 @@
           </w:tcPr>
           <w:p>
             <w:r>
-              <w:t>1.147</w:t>
+              <w:t>28.64%</w:t>
             </w:r>
           </w:p>
         </w:tc>
@@ -2024,7 +2241,7 @@
           </w:tcPr>
           <w:p>
             <w:r>
-              <w:t>1.295</w:t>
+              <w:t>13.67%</w:t>
             </w:r>
           </w:p>
         </w:tc>
@@ -2034,7 +2251,7 @@
           </w:tcPr>
           <w:p>
             <w:r>
-              <w:t>1.367</w:t>
+              <w:t>12.72%</w:t>
             </w:r>
           </w:p>
         </w:tc>
@@ -2046,7 +2263,7 @@
           </w:tcPr>
           <w:p>
             <w:r>
-              <w:t>MDD</w:t>
+              <w:t>Calmar</w:t>
             </w:r>
           </w:p>
         </w:tc>
@@ -2056,7 +2273,7 @@
           </w:tcPr>
           <w:p>
             <w:r>
-              <w:t>28.64%</w:t>
+              <w:t>0.743</w:t>
             </w:r>
           </w:p>
         </w:tc>
@@ -2066,49 +2283,7 @@
           </w:tcPr>
           <w:p>
             <w:r>
-              <w:t>13.40%</w:t>
-            </w:r>
-          </w:p>
-        </w:tc>
-        <w:tc>
-          <w:tcPr>
-            <w:tcW w:type="dxa" w:w="2579"/>
-          </w:tcPr>
-          <w:p>
-            <w:r>
-              <w:t>12.72%</w:t>
-            </w:r>
-          </w:p>
-        </w:tc>
-      </w:tr>
-      <w:tr>
-        <w:tc>
-          <w:tcPr>
-            <w:tcW w:type="dxa" w:w="2579"/>
-          </w:tcPr>
-          <w:p>
-            <w:r>
-              <w:t>Calmar</w:t>
-            </w:r>
-          </w:p>
-        </w:tc>
-        <w:tc>
-          <w:tcPr>
-            <w:tcW w:type="dxa" w:w="2579"/>
-          </w:tcPr>
-          <w:p>
-            <w:r>
-              <w:t>0.743</w:t>
-            </w:r>
-          </w:p>
-        </w:tc>
-        <w:tc>
-          <w:tcPr>
-            <w:tcW w:type="dxa" w:w="2579"/>
-          </w:tcPr>
-          <w:p>
-            <w:r>
-              <w:t>1.054</w:t>
+              <w:t>0.703</w:t>
             </w:r>
           </w:p>
         </w:tc>
@@ -2126,12 +2301,7 @@
     </w:tbl>
     <w:p>
       <w:r>
-        <w:t>診斷以257個事先等距設定的循環位移為候選，排除距離不足63日或與原持倉重疊超過50%的路徑後，共167條符合「固定一口、658個持倉日、147段持有」；每條均重新計算實際費稅、滑價與轉倉。代表路徑只按年化波動最接近策略挑選，未使用報酬作選擇。受整口限制，其最低可得波動仍為11.05%，高於策略8.84%，所以它是最接近的整口風險對照，不是假裝完全配平。</w:t>
-      </w:r>
-    </w:p>
-    <w:p>
-      <w:r>
-        <w:t>167條對照的中位數為CAGR 10.64%、Sharpe 0.682、MDD 28.71%。策略Sharpe高於全部合格位移，MDD低於98.80%的位移；但此診斷仍使用同一完整樣本，不是可交易規則或樣本外證據。</w:t>
+        <w:t>風險配平基準將固定一口 benchmark 的每日毛損益與全部成本同比例縮放至約0.293口，使年化波動與策略同為8.84%。配平後 Sharpe 為1.120，策略為1.367。此係數由完整樣本事後估計，且TX不能交易小數口，因此只用於同風險尺度比較。</w:t>
       </w:r>
     </w:p>
     <w:p>
@@ -2140,7 +2310,7 @@
         <w:pageBreakBefore/>
       </w:pPr>
       <w:r>
-        <w:t>6　成本敏感度與條件診斷</w:t>
+        <w:t>肆（續）成本敏感度、條件診斷與特殊期間</w:t>
       </w:r>
     </w:p>
     <w:p>
@@ -2573,12 +2743,772 @@
     </w:p>
     <w:p>
       <w:r>
-        <w:t>147筆交易勝率51.70%、PF 2.197；持有日曆日平均6.90日、中位數3日，最長84日。前五筆獲利合計占總淨利55.46%；最近兩個曆年（2025、2026）合計占總淨利61.73%，仍需注意少數交易及近期年份的影響。</w:t>
+        <w:t>147筆交易勝率51.70%、PF 2.197；持有日曆日平均6.90日、中位數3日，最長84日。前五筆獲利合計占總淨利55.46%；最近兩個曆年（2025、2026）合計占總淨利61.73%，仍需注意少數交易及近期年份的影響。2018–2022淨利1,082,967.22元、描述性Sharpe 1.224；2023–2026淨利2,194,569.35元、描述性Sharpe 1.518。年度虧損年份：2018、2022、2024。</w:t>
       </w:r>
     </w:p>
     <w:p>
       <w:r>
-        <w:t>2018–2022淨利1,082,967.22元、描述性Sharpe 1.224；2023–2026淨利2,194,569.35元、描述性Sharpe 1.518。年度虧損年份：2018、2022、2024。</w:t>
+        <w:t>特殊期間：急跌與跳空事件下的訊號狀態（事後描述，不用於調整規則）</w:t>
+      </w:r>
+    </w:p>
+    <w:tbl>
+      <w:tblPr>
+        <w:tblStyle w:val="TableGrid"/>
+        <w:tblW w:type="auto" w:w="0"/>
+        <w:tblLook w:firstColumn="1" w:firstRow="1" w:lastColumn="0" w:lastRow="0" w:noHBand="0" w:noVBand="1" w:val="04A0"/>
+      </w:tblPr>
+      <w:tblGrid>
+        <w:gridCol w:w="1290"/>
+        <w:gridCol w:w="1290"/>
+        <w:gridCol w:w="1290"/>
+        <w:gridCol w:w="1290"/>
+        <w:gridCol w:w="1290"/>
+        <w:gridCol w:w="1290"/>
+        <w:gridCol w:w="1290"/>
+        <w:gridCol w:w="1290"/>
+      </w:tblGrid>
+      <w:tr>
+        <w:tc>
+          <w:tcPr>
+            <w:tcW w:type="dxa" w:w="1290"/>
+          </w:tcPr>
+          <w:p>
+            <w:r>
+              <w:t>事件視窗</w:t>
+            </w:r>
+          </w:p>
+        </w:tc>
+        <w:tc>
+          <w:tcPr>
+            <w:tcW w:type="dxa" w:w="1290"/>
+          </w:tcPr>
+          <w:p>
+            <w:r>
+              <w:t>交易日</w:t>
+            </w:r>
+          </w:p>
+        </w:tc>
+        <w:tc>
+          <w:tcPr>
+            <w:tcW w:type="dxa" w:w="1290"/>
+          </w:tcPr>
+          <w:p>
+            <w:r>
+              <w:t>起點部位</w:t>
+            </w:r>
+          </w:p>
+        </w:tc>
+        <w:tc>
+          <w:tcPr>
+            <w:tcW w:type="dxa" w:w="1290"/>
+          </w:tcPr>
+          <w:p>
+            <w:r>
+              <w:t>持倉日</w:t>
+            </w:r>
+          </w:p>
+        </w:tc>
+        <w:tc>
+          <w:tcPr>
+            <w:tcW w:type="dxa" w:w="1290"/>
+          </w:tcPr>
+          <w:p>
+            <w:r>
+              <w:t>策略損益（元）</w:t>
+            </w:r>
+          </w:p>
+        </w:tc>
+        <w:tc>
+          <w:tcPr>
+            <w:tcW w:type="dxa" w:w="1290"/>
+          </w:tcPr>
+          <w:p>
+            <w:r>
+              <w:t>基準損益（元）</w:t>
+            </w:r>
+          </w:p>
+        </w:tc>
+        <w:tc>
+          <w:tcPr>
+            <w:tcW w:type="dxa" w:w="1290"/>
+          </w:tcPr>
+          <w:p>
+            <w:r>
+              <w:t>最深開盤跳空（日期）</w:t>
+            </w:r>
+          </w:p>
+        </w:tc>
+        <w:tc>
+          <w:tcPr>
+            <w:tcW w:type="dxa" w:w="1290"/>
+          </w:tcPr>
+          <w:p>
+            <w:r>
+              <w:t>跳空日持倉</w:t>
+            </w:r>
+          </w:p>
+        </w:tc>
+      </w:tr>
+      <w:tr>
+        <w:tc>
+          <w:tcPr>
+            <w:tcW w:type="dxa" w:w="1290"/>
+          </w:tcPr>
+          <w:p>
+            <w:r>
+              <w:t>2018Q4 美股修正急跌</w:t>
+            </w:r>
+          </w:p>
+        </w:tc>
+        <w:tc>
+          <w:tcPr>
+            <w:tcW w:type="dxa" w:w="1290"/>
+          </w:tcPr>
+          <w:p>
+            <w:r>
+              <w:t>65</w:t>
+            </w:r>
+          </w:p>
+        </w:tc>
+        <w:tc>
+          <w:tcPr>
+            <w:tcW w:type="dxa" w:w="1290"/>
+          </w:tcPr>
+          <w:p>
+            <w:r>
+              <w:t>多單</w:t>
+            </w:r>
+          </w:p>
+        </w:tc>
+        <w:tc>
+          <w:tcPr>
+            <w:tcW w:type="dxa" w:w="1290"/>
+          </w:tcPr>
+          <w:p>
+            <w:r>
+              <w:t>15</w:t>
+            </w:r>
+          </w:p>
+        </w:tc>
+        <w:tc>
+          <w:tcPr>
+            <w:tcW w:type="dxa" w:w="1290"/>
+          </w:tcPr>
+          <w:p>
+            <w:r>
+              <w:t>-92,732</w:t>
+            </w:r>
+          </w:p>
+        </w:tc>
+        <w:tc>
+          <w:tcPr>
+            <w:tcW w:type="dxa" w:w="1290"/>
+          </w:tcPr>
+          <w:p>
+            <w:r>
+              <w:t>-241,935</w:t>
+            </w:r>
+          </w:p>
+        </w:tc>
+        <w:tc>
+          <w:tcPr>
+            <w:tcW w:type="dxa" w:w="1290"/>
+          </w:tcPr>
+          <w:p>
+            <w:r>
+              <w:t>-4.1%（10-11）</w:t>
+            </w:r>
+          </w:p>
+        </w:tc>
+        <w:tc>
+          <w:tcPr>
+            <w:tcW w:type="dxa" w:w="1290"/>
+          </w:tcPr>
+          <w:p>
+            <w:r>
+              <w:t>否</w:t>
+            </w:r>
+          </w:p>
+        </w:tc>
+      </w:tr>
+      <w:tr>
+        <w:tc>
+          <w:tcPr>
+            <w:tcW w:type="dxa" w:w="1290"/>
+          </w:tcPr>
+          <w:p>
+            <w:r>
+              <w:t>2020Q1 COVID-19股災</w:t>
+            </w:r>
+          </w:p>
+        </w:tc>
+        <w:tc>
+          <w:tcPr>
+            <w:tcW w:type="dxa" w:w="1290"/>
+          </w:tcPr>
+          <w:p>
+            <w:r>
+              <w:t>28</w:t>
+            </w:r>
+          </w:p>
+        </w:tc>
+        <w:tc>
+          <w:tcPr>
+            <w:tcW w:type="dxa" w:w="1290"/>
+          </w:tcPr>
+          <w:p>
+            <w:r>
+              <w:t>空手</w:t>
+            </w:r>
+          </w:p>
+        </w:tc>
+        <w:tc>
+          <w:tcPr>
+            <w:tcW w:type="dxa" w:w="1290"/>
+          </w:tcPr>
+          <w:p>
+            <w:r>
+              <w:t>1</w:t>
+            </w:r>
+          </w:p>
+        </w:tc>
+        <w:tc>
+          <w:tcPr>
+            <w:tcW w:type="dxa" w:w="1290"/>
+          </w:tcPr>
+          <w:p>
+            <w:r>
+              <w:t>-31,994</w:t>
+            </w:r>
+          </w:p>
+        </w:tc>
+        <w:tc>
+          <w:tcPr>
+            <w:tcW w:type="dxa" w:w="1290"/>
+          </w:tcPr>
+          <w:p>
+            <w:r>
+              <w:t>-399,574</w:t>
+            </w:r>
+          </w:p>
+        </w:tc>
+        <w:tc>
+          <w:tcPr>
+            <w:tcW w:type="dxa" w:w="1290"/>
+          </w:tcPr>
+          <w:p>
+            <w:r>
+              <w:t>-6.0%（03-13）</w:t>
+            </w:r>
+          </w:p>
+        </w:tc>
+        <w:tc>
+          <w:tcPr>
+            <w:tcW w:type="dxa" w:w="1290"/>
+          </w:tcPr>
+          <w:p>
+            <w:r>
+              <w:t>否</w:t>
+            </w:r>
+          </w:p>
+        </w:tc>
+      </w:tr>
+      <w:tr>
+        <w:tc>
+          <w:tcPr>
+            <w:tcW w:type="dxa" w:w="1290"/>
+          </w:tcPr>
+          <w:p>
+            <w:r>
+              <w:t>2021-05 本土疫情修正</w:t>
+            </w:r>
+          </w:p>
+        </w:tc>
+        <w:tc>
+          <w:tcPr>
+            <w:tcW w:type="dxa" w:w="1290"/>
+          </w:tcPr>
+          <w:p>
+            <w:r>
+              <w:t>16</w:t>
+            </w:r>
+          </w:p>
+        </w:tc>
+        <w:tc>
+          <w:tcPr>
+            <w:tcW w:type="dxa" w:w="1290"/>
+          </w:tcPr>
+          <w:p>
+            <w:r>
+              <w:t>空手</w:t>
+            </w:r>
+          </w:p>
+        </w:tc>
+        <w:tc>
+          <w:tcPr>
+            <w:tcW w:type="dxa" w:w="1290"/>
+          </w:tcPr>
+          <w:p>
+            <w:r>
+              <w:t>2</w:t>
+            </w:r>
+          </w:p>
+        </w:tc>
+        <w:tc>
+          <w:tcPr>
+            <w:tcW w:type="dxa" w:w="1290"/>
+          </w:tcPr>
+          <w:p>
+            <w:r>
+              <w:t>58,566</w:t>
+            </w:r>
+          </w:p>
+        </w:tc>
+        <w:tc>
+          <w:tcPr>
+            <w:tcW w:type="dxa" w:w="1290"/>
+          </w:tcPr>
+          <w:p>
+            <w:r>
+              <w:t>-42,829</w:t>
+            </w:r>
+          </w:p>
+        </w:tc>
+        <w:tc>
+          <w:tcPr>
+            <w:tcW w:type="dxa" w:w="1290"/>
+          </w:tcPr>
+          <w:p>
+            <w:r>
+              <w:t>-3.7%（05-17）</w:t>
+            </w:r>
+          </w:p>
+        </w:tc>
+        <w:tc>
+          <w:tcPr>
+            <w:tcW w:type="dxa" w:w="1290"/>
+          </w:tcPr>
+          <w:p>
+            <w:r>
+              <w:t>否</w:t>
+            </w:r>
+          </w:p>
+        </w:tc>
+      </w:tr>
+      <w:tr>
+        <w:tc>
+          <w:tcPr>
+            <w:tcW w:type="dxa" w:w="1290"/>
+          </w:tcPr>
+          <w:p>
+            <w:r>
+              <w:t>2022 升息空頭（全年）</w:t>
+            </w:r>
+          </w:p>
+        </w:tc>
+        <w:tc>
+          <w:tcPr>
+            <w:tcW w:type="dxa" w:w="1290"/>
+          </w:tcPr>
+          <w:p>
+            <w:r>
+              <w:t>246</w:t>
+            </w:r>
+          </w:p>
+        </w:tc>
+        <w:tc>
+          <w:tcPr>
+            <w:tcW w:type="dxa" w:w="1290"/>
+          </w:tcPr>
+          <w:p>
+            <w:r>
+              <w:t>多單</w:t>
+            </w:r>
+          </w:p>
+        </w:tc>
+        <w:tc>
+          <w:tcPr>
+            <w:tcW w:type="dxa" w:w="1290"/>
+          </w:tcPr>
+          <w:p>
+            <w:r>
+              <w:t>69</w:t>
+            </w:r>
+          </w:p>
+        </w:tc>
+        <w:tc>
+          <w:tcPr>
+            <w:tcW w:type="dxa" w:w="1290"/>
+          </w:tcPr>
+          <w:p>
+            <w:r>
+              <w:t>-46,253</w:t>
+            </w:r>
+          </w:p>
+        </w:tc>
+        <w:tc>
+          <w:tcPr>
+            <w:tcW w:type="dxa" w:w="1290"/>
+          </w:tcPr>
+          <w:p>
+            <w:r>
+              <w:t>-624,106</w:t>
+            </w:r>
+          </w:p>
+        </w:tc>
+        <w:tc>
+          <w:tcPr>
+            <w:tcW w:type="dxa" w:w="1290"/>
+          </w:tcPr>
+          <w:p>
+            <w:r>
+              <w:t>-3.2%（10-11）</w:t>
+            </w:r>
+          </w:p>
+        </w:tc>
+        <w:tc>
+          <w:tcPr>
+            <w:tcW w:type="dxa" w:w="1290"/>
+          </w:tcPr>
+          <w:p>
+            <w:r>
+              <w:t>否</w:t>
+            </w:r>
+          </w:p>
+        </w:tc>
+      </w:tr>
+      <w:tr>
+        <w:tc>
+          <w:tcPr>
+            <w:tcW w:type="dxa" w:w="1290"/>
+          </w:tcPr>
+          <w:p>
+            <w:r>
+              <w:t>2024-08 全球急跌</w:t>
+            </w:r>
+          </w:p>
+        </w:tc>
+        <w:tc>
+          <w:tcPr>
+            <w:tcW w:type="dxa" w:w="1290"/>
+          </w:tcPr>
+          <w:p>
+            <w:r>
+              <w:t>7</w:t>
+            </w:r>
+          </w:p>
+        </w:tc>
+        <w:tc>
+          <w:tcPr>
+            <w:tcW w:type="dxa" w:w="1290"/>
+          </w:tcPr>
+          <w:p>
+            <w:r>
+              <w:t>空手</w:t>
+            </w:r>
+          </w:p>
+        </w:tc>
+        <w:tc>
+          <w:tcPr>
+            <w:tcW w:type="dxa" w:w="1290"/>
+          </w:tcPr>
+          <w:p>
+            <w:r>
+              <w:t>0</w:t>
+            </w:r>
+          </w:p>
+        </w:tc>
+        <w:tc>
+          <w:tcPr>
+            <w:tcW w:type="dxa" w:w="1290"/>
+          </w:tcPr>
+          <w:p>
+            <w:r>
+              <w:t>0</w:t>
+            </w:r>
+          </w:p>
+        </w:tc>
+        <w:tc>
+          <w:tcPr>
+            <w:tcW w:type="dxa" w:w="1290"/>
+          </w:tcPr>
+          <w:p>
+            <w:r>
+              <w:t>-161,800</w:t>
+            </w:r>
+          </w:p>
+        </w:tc>
+        <w:tc>
+          <w:tcPr>
+            <w:tcW w:type="dxa" w:w="1290"/>
+          </w:tcPr>
+          <w:p>
+            <w:r>
+              <w:t>-3.8%（08-05）</w:t>
+            </w:r>
+          </w:p>
+        </w:tc>
+        <w:tc>
+          <w:tcPr>
+            <w:tcW w:type="dxa" w:w="1290"/>
+          </w:tcPr>
+          <w:p>
+            <w:r>
+              <w:t>否</w:t>
+            </w:r>
+          </w:p>
+        </w:tc>
+      </w:tr>
+      <w:tr>
+        <w:tc>
+          <w:tcPr>
+            <w:tcW w:type="dxa" w:w="1290"/>
+          </w:tcPr>
+          <w:p>
+            <w:r>
+              <w:t>2025-04 美國關稅衝擊</w:t>
+            </w:r>
+          </w:p>
+        </w:tc>
+        <w:tc>
+          <w:tcPr>
+            <w:tcW w:type="dxa" w:w="1290"/>
+          </w:tcPr>
+          <w:p>
+            <w:r>
+              <w:t>20</w:t>
+            </w:r>
+          </w:p>
+        </w:tc>
+        <w:tc>
+          <w:tcPr>
+            <w:tcW w:type="dxa" w:w="1290"/>
+          </w:tcPr>
+          <w:p>
+            <w:r>
+              <w:t>空手</w:t>
+            </w:r>
+          </w:p>
+        </w:tc>
+        <w:tc>
+          <w:tcPr>
+            <w:tcW w:type="dxa" w:w="1290"/>
+          </w:tcPr>
+          <w:p>
+            <w:r>
+              <w:t>3</w:t>
+            </w:r>
+          </w:p>
+        </w:tc>
+        <w:tc>
+          <w:tcPr>
+            <w:tcW w:type="dxa" w:w="1290"/>
+          </w:tcPr>
+          <w:p>
+            <w:r>
+              <w:t>36,270</w:t>
+            </w:r>
+          </w:p>
+        </w:tc>
+        <w:tc>
+          <w:tcPr>
+            <w:tcW w:type="dxa" w:w="1290"/>
+          </w:tcPr>
+          <w:p>
+            <w:r>
+              <w:t>-121,258</w:t>
+            </w:r>
+          </w:p>
+        </w:tc>
+        <w:tc>
+          <w:tcPr>
+            <w:tcW w:type="dxa" w:w="1290"/>
+          </w:tcPr>
+          <w:p>
+            <w:r>
+              <w:t>-10.0%（04-07）</w:t>
+            </w:r>
+          </w:p>
+        </w:tc>
+        <w:tc>
+          <w:tcPr>
+            <w:tcW w:type="dxa" w:w="1290"/>
+          </w:tcPr>
+          <w:p>
+            <w:r>
+              <w:t>否</w:t>
+            </w:r>
+          </w:p>
+        </w:tc>
+      </w:tr>
+      <w:tr>
+        <w:tc>
+          <w:tcPr>
+            <w:tcW w:type="dxa" w:w="1290"/>
+          </w:tcPr>
+          <w:p>
+            <w:r>
+              <w:t>2026-03 跳空（資料辨識）</w:t>
+            </w:r>
+          </w:p>
+        </w:tc>
+        <w:tc>
+          <w:tcPr>
+            <w:tcW w:type="dxa" w:w="1290"/>
+          </w:tcPr>
+          <w:p>
+            <w:r>
+              <w:t>22</w:t>
+            </w:r>
+          </w:p>
+        </w:tc>
+        <w:tc>
+          <w:tcPr>
+            <w:tcW w:type="dxa" w:w="1290"/>
+          </w:tcPr>
+          <w:p>
+            <w:r>
+              <w:t>空手</w:t>
+            </w:r>
+          </w:p>
+        </w:tc>
+        <w:tc>
+          <w:tcPr>
+            <w:tcW w:type="dxa" w:w="1290"/>
+          </w:tcPr>
+          <w:p>
+            <w:r>
+              <w:t>0</w:t>
+            </w:r>
+          </w:p>
+        </w:tc>
+        <w:tc>
+          <w:tcPr>
+            <w:tcW w:type="dxa" w:w="1290"/>
+          </w:tcPr>
+          <w:p>
+            <w:r>
+              <w:t>0</w:t>
+            </w:r>
+          </w:p>
+        </w:tc>
+        <w:tc>
+          <w:tcPr>
+            <w:tcW w:type="dxa" w:w="1290"/>
+          </w:tcPr>
+          <w:p>
+            <w:r>
+              <w:t>-749,171</w:t>
+            </w:r>
+          </w:p>
+        </w:tc>
+        <w:tc>
+          <w:tcPr>
+            <w:tcW w:type="dxa" w:w="1290"/>
+          </w:tcPr>
+          <w:p>
+            <w:r>
+              <w:t>-5.9%（03-09）</w:t>
+            </w:r>
+          </w:p>
+        </w:tc>
+        <w:tc>
+          <w:tcPr>
+            <w:tcW w:type="dxa" w:w="1290"/>
+          </w:tcPr>
+          <w:p>
+            <w:r>
+              <w:t>否</w:t>
+            </w:r>
+          </w:p>
+        </w:tc>
+      </w:tr>
+      <w:tr>
+        <w:tc>
+          <w:tcPr>
+            <w:tcW w:type="dxa" w:w="1290"/>
+          </w:tcPr>
+          <w:p>
+            <w:r>
+              <w:t>2026-06 跳空（資料辨識）</w:t>
+            </w:r>
+          </w:p>
+        </w:tc>
+        <w:tc>
+          <w:tcPr>
+            <w:tcW w:type="dxa" w:w="1290"/>
+          </w:tcPr>
+          <w:p>
+            <w:r>
+              <w:t>21</w:t>
+            </w:r>
+          </w:p>
+        </w:tc>
+        <w:tc>
+          <w:tcPr>
+            <w:tcW w:type="dxa" w:w="1290"/>
+          </w:tcPr>
+          <w:p>
+            <w:r>
+              <w:t>空手</w:t>
+            </w:r>
+          </w:p>
+        </w:tc>
+        <w:tc>
+          <w:tcPr>
+            <w:tcW w:type="dxa" w:w="1290"/>
+          </w:tcPr>
+          <w:p>
+            <w:r>
+              <w:t>0</w:t>
+            </w:r>
+          </w:p>
+        </w:tc>
+        <w:tc>
+          <w:tcPr>
+            <w:tcW w:type="dxa" w:w="1290"/>
+          </w:tcPr>
+          <w:p>
+            <w:r>
+              <w:t>0</w:t>
+            </w:r>
+          </w:p>
+        </w:tc>
+        <w:tc>
+          <w:tcPr>
+            <w:tcW w:type="dxa" w:w="1290"/>
+          </w:tcPr>
+          <w:p>
+            <w:r>
+              <w:t>272,334</w:t>
+            </w:r>
+          </w:p>
+        </w:tc>
+        <w:tc>
+          <w:tcPr>
+            <w:tcW w:type="dxa" w:w="1290"/>
+          </w:tcPr>
+          <w:p>
+            <w:r>
+              <w:t>-6.3%（06-08）</w:t>
+            </w:r>
+          </w:p>
+        </w:tc>
+        <w:tc>
+          <w:tcPr>
+            <w:tcW w:type="dxa" w:w="1290"/>
+          </w:tcPr>
+          <w:p>
+            <w:r>
+              <w:t>否</w:t>
+            </w:r>
+          </w:p>
+        </w:tc>
+      </w:tr>
+    </w:tbl>
+    <w:p>
+      <w:r>
+        <w:t>事件日期以公開重大事件為起點、由行情日曆截取；末兩段以樣本內最深單日跳空由資料辨識，均未回饋到規則。8個視窗中8個在最深跳空日為空手：急跌前價格多已跌破MA20或Q20轉負而退出，策略是「不在場」而非預知事件，同一機制也使其在反彈初期缺席（錯過幅度與最差單日見伍）。</w:t>
       </w:r>
     </w:p>
     <w:p>
@@ -2587,7 +3517,7 @@
         <w:pageBreakBefore/>
       </w:pPr>
       <w:r>
-        <w:t>7　風險來源與策略限制</w:t>
+        <w:t>伍、策略極限與檢討</w:t>
       </w:r>
     </w:p>
     <w:p>
@@ -2607,7 +3537,7 @@
     </w:p>
     <w:p>
       <w:r>
-        <w:t>固定一口Buy-and-Hold的MDD為28.64%，高於策略的12.72%，主要原因之一是基準幾乎全期持有，而策略只有658個日末持倉日。改用相同一口、相同持倉日與相同147段持有的位移對照後，代表路徑MDD為13.40%，全部位移的中位數MDD為28.71%。這表示「一口」只相同化單次口數，沒有自動相同化時間曝險或實現波動。</w:t>
+        <w:t>固定一口Buy-and-Hold的MDD 28.64%高於策略的12.72%，但其年化波動19.03%亦遠高於策略的8.84%；縮放至約0.293口的配平基準Sharpe為1.120、MDD為13.67%（見肆續表），這只控制風險尺度，小數口並非可直接交易的部位。</w:t>
       </w:r>
     </w:p>
     <w:p>
@@ -2617,12 +3547,12 @@
     </w:p>
     <w:p>
       <w:r>
-        <w:t>近月未調整價格均線有換月價差敏感度：以前一日兩契約收盤重疊價差調整訊號後，14天訊號不同，診斷版淨利3,028,972.77元、Sharpe 1.245；原版為3,277,536.58元、1.367。此比較只變更訊號，實際成交仍按原契約，不取代正式V04。</w:t>
+        <w:t>近月未調整價格均線有換月價差敏感度：以前一日兩契約收盤重疊價差調整訊號後，14天訊號不同，淨利3,028,972.77元、Sharpe 1.245；正式策略為3,277,536.58元、1.367。此項診斷只變更訊號，實際成交仍按原契約。</w:t>
       </w:r>
     </w:p>
     <w:p>
       <w:r>
-        <w:t>價格單獨策略按完整樣本事後配平至相同年波動的TX-equivalent為0.437，淨利2,108,818.45元、Sharpe 1.020；V04為3,277,536.58元、1.367。這是風險尺度與曝險差異的描述，配平小數口不能直接交易，亦非樣本外證據。</w:t>
+        <w:t>價格單獨策略按完整樣本事後配平至相同年波動的TX-equivalent為0.437，淨利2,108,818.45元、Sharpe 1.020；策略為3,277,536.58元、1.367。這是風險尺度與曝險差異的描述，配平小數口不能直接交易，亦非樣本外證據。</w:t>
       </w:r>
     </w:p>
     <w:p>
@@ -2637,7 +3567,7 @@
     </w:p>
     <w:p>
       <w:r>
-        <w:t>本回測未加入事後最佳化的固定點數停損。現有資料僅含日盤OHLC，缺乏完整夜盤價格路徑、委託排隊及極端行情成交資訊，因此若加入盤中觸價停損，將引入無法可靠驗證的成交假設。基準版本僅依訊號消退、轉倉與期末清算執行出場。</w:t>
+        <w:t>本回測未加入事後最佳化的固定點數停損。現有資料僅含日盤OHLC，缺乏完整夜盤價格路徑、委託排隊及極端行情成交資訊，因此若加入盤中觸價停損，將引入無法可靠驗證的成交假設。策略僅依訊號消退、轉倉與期末清算執行出場。</w:t>
       </w:r>
     </w:p>
     <w:p>
@@ -2652,7 +3582,7 @@
     </w:p>
     <w:p>
       <w:r>
-        <w:t>因此12.72%的日末MDD不應解讀為單筆交易或盤中可能遭受的最大損失。共同起始資金取首日一口TX的開盤名目價值，並未重建歷史保證金與追繳；若進一步評估實際交易可行性，仍需納入夜盤價格、盤中極端波動、開盤成交品質與逐日保證金需求。</w:t>
+        <w:t>特殊期間表顯示策略在8個急跌視窗中有8個於最深跳空日為空手，這來自雙條件在下跌初期即退出，而非對事件的預測；代價是反彈初期缺席：從最深跳空日到重新進場，中位數需16個交易日，期間近月平均已回升5.5%，2024-08 全球急跌更達16.4%。樣本內三個最差單日為2026/04/02（進場日，-238,385元）、2026/07/07（持倉日，-222,200元）、2026/05/19（進場日，-130,236元），均發生在快速反轉時的進場或持倉日，跳空風險集中於重新進場後而非持倉中段。因此12.72%的日末MDD不應解讀為單筆交易或盤中可能遭受的最大損失；共同起始資金並未重建歷史保證金與追繳，評估實際可行性仍需納入夜盤價格、盤中極端波動、開盤成交品質與逐日保證金需求。</w:t>
       </w:r>
     </w:p>
     <w:p>
@@ -2661,7 +3591,7 @@
         <w:pageBreakBefore/>
       </w:pPr>
       <w:r>
-        <w:t>8　結論與後續驗證</w:t>
+        <w:t>陸、結論與後續驗證</w:t>
       </w:r>
     </w:p>
     <w:p>
@@ -2676,7 +3606,7 @@
     </w:p>
     <w:p>
       <w:r>
-        <w:t>一口等曝險位移對照的中位數Sharpe為0.682、MDD為28.71%；最接近策略波動的代表路徑Sharpe為1.295、MDD為13.40%。策略在本樣本仍顯示較佳風險效率，但位移診斷是事後統計控制，不是可部署的交易基準，也不能取代獨立樣本外驗證。</w:t>
+        <w:t>將 benchmark 事後縮放至與策略相同的8.84%年化波動後，配平 benchmark 的Sharpe為1.120、MDD為13.67%、Calmar為0.703；策略分別為1.367、12.72%與0.939。策略在同風險尺度下仍較佳，但配平係數使用完整樣本且為小數口，只是診斷，不是可部署的交易基準。</w:t>
       </w:r>
     </w:p>
     <w:p>
@@ -2706,7 +3636,7 @@
     </w:p>
     <w:p>
       <w:r>
-        <w:t>綜合而言，策略規則可追溯且歷史成本後報酬為正，但同期大盤與TX買進持有累積報酬均較高；V04主要呈現較少持倉及較低回撤，未能據此認定法人訊號創造穩定超額報酬。仍須完成獨立樣本外驗證、夜盤與盤中風險及資料發布時點檢查。</w:t>
+        <w:t>綜合而言，策略規則可追溯且歷史成本後報酬為正，但同期大盤與TX買進持有累積報酬均較高；策略持倉較少且回撤較低，未能據此認定法人訊號創造穩定超額報酬。仍須完成獨立樣本外驗證、夜盤與盤中風險及資料發布時點檢查。</w:t>
       </w:r>
     </w:p>
     <w:p>
@@ -2731,7 +3661,7 @@
     </w:p>
     <w:p>
       <w:r>
-        <w:t>Sharpe＝日報酬平均／日報酬樣本標準差×√252；Calmar＝CAGR／最大回撤比例。權益曲線以首日一口TX開盤名目價值起算，逐日累加淨損益，MDD取曲線相對歷史高點的最大跌幅；一口等曝險位移作風險尺度診斷。</w:t>
+        <w:t>Sharpe＝日報酬平均／日報酬樣本標準差×√252；Calmar＝CAGR／最大回撤比例。權益曲線以首日一口TX開盤名目價值起算，逐日累加淨損益，MDD取曲線相對歷史高點的最大跌幅；風險配平 benchmark 僅作同風險尺度診斷。</w:t>
       </w:r>
     </w:p>
     <w:sectPr>

</xml_diff>

<commit_message>
research: add parameter grid, alternative-execution scenarios, bootstrap inference and signal-return tests
- robustness.py: Sortino, historical daily VaR/ES, 20-day circular block bootstrap (5,000 draws) for Sharpe CIs, Q20 quintile and trend x flow next-day return table (Welch t), monthly returns, grid summary
- backtest.py: 36-point window grid (10..60 x 10..60) with first/second-half Sharpe, one-day execution delay, roll two days before expiry, all costs x1.5 and x2; same accounting engine; new workbook sheets (26 total)
- make_report.py: new page 肆(續) with grid heatmap + first/second-half scatter, scenario table, signal table and bootstrap text; Sortino/VaR/ES rows; 伍 and 陸 condensed to one page; report stays 8 pages
- ci_verify.py: new outputs, sheet count 26, grid/scenario/bootstrap consistency with main metrics
- Core strategy metrics unchanged
</commit_message>
<xml_diff>
--- a/TX_flow_trend_report.docx
+++ b/TX_flow_trend_report.docx
@@ -1204,7 +1204,7 @@
           </w:tcPr>
           <w:p>
             <w:r>
-              <w:t>Calmar</w:t>
+              <w:t>Sortino（rf=0）</w:t>
             </w:r>
           </w:p>
         </w:tc>
@@ -1214,7 +1214,7 @@
           </w:tcPr>
           <w:p>
             <w:r>
-              <w:t>0.939</w:t>
+              <w:t>2.224</w:t>
             </w:r>
           </w:p>
         </w:tc>
@@ -1224,7 +1224,7 @@
           </w:tcPr>
           <w:p>
             <w:r>
-              <w:t>0.743</w:t>
+              <w:t>1.636</w:t>
             </w:r>
           </w:p>
         </w:tc>
@@ -1236,6 +1236,38 @@
           </w:tcPr>
           <w:p>
             <w:r>
+              <w:t>Calmar</w:t>
+            </w:r>
+          </w:p>
+        </w:tc>
+        <w:tc>
+          <w:tcPr>
+            <w:tcW w:type="dxa" w:w="3439"/>
+          </w:tcPr>
+          <w:p>
+            <w:r>
+              <w:t>0.939</w:t>
+            </w:r>
+          </w:p>
+        </w:tc>
+        <w:tc>
+          <w:tcPr>
+            <w:tcW w:type="dxa" w:w="3439"/>
+          </w:tcPr>
+          <w:p>
+            <w:r>
+              <w:t>0.743</w:t>
+            </w:r>
+          </w:p>
+        </w:tc>
+      </w:tr>
+      <w:tr>
+        <w:tc>
+          <w:tcPr>
+            <w:tcW w:type="dxa" w:w="3439"/>
+          </w:tcPr>
+          <w:p>
+            <w:r>
               <w:t>年化波動</w:t>
             </w:r>
           </w:p>
@@ -1257,6 +1289,38 @@
           <w:p>
             <w:r>
               <w:t>19.03%</w:t>
+            </w:r>
+          </w:p>
+        </w:tc>
+      </w:tr>
+      <w:tr>
+        <w:tc>
+          <w:tcPr>
+            <w:tcW w:type="dxa" w:w="3439"/>
+          </w:tcPr>
+          <w:p>
+            <w:r>
+              <w:t>日VaR 95%／ES 95%（歷史法）</w:t>
+            </w:r>
+          </w:p>
+        </w:tc>
+        <w:tc>
+          <w:tcPr>
+            <w:tcW w:type="dxa" w:w="3439"/>
+          </w:tcPr>
+          <w:p>
+            <w:r>
+              <w:t>0.68%／1.24%</w:t>
+            </w:r>
+          </w:p>
+        </w:tc>
+        <w:tc>
+          <w:tcPr>
+            <w:tcW w:type="dxa" w:w="3439"/>
+          </w:tcPr>
+          <w:p>
+            <w:r>
+              <w:t>1.71%／2.84%</w:t>
             </w:r>
           </w:p>
         </w:tc>
@@ -1296,7 +1360,7 @@
     </w:tbl>
     <w:p>
       <w:r>
-        <w:t>同期間、同一口、同起始資金。固定一口Buy-and-Hold是可直接執行的曝險比較；策略有658個日末持倉日，基準幾乎全期持有，兩者承擔市場風險的時間不同。MDD金額及比例各自取全期最大值，可能發生於不同日期。</w:t>
+        <w:t>同期間、同一口、同起始資金。固定一口Buy-and-Hold是可直接執行的曝險比較；策略有658個日末持倉日，基準幾乎全期持有，兩者承擔市場風險的時間不同。MDD金額及比例各自取全期最大值，可能發生於不同日期。VaR／ES為日淨報酬的歷史分位損失，含空手日；Sortino以下方半變異年化。</w:t>
       </w:r>
     </w:p>
     <w:tbl>
@@ -3517,6 +3581,1298 @@
         <w:pageBreakBefore/>
       </w:pPr>
       <w:r>
+        <w:t>肆（續）參數穩健性、替代設定與統計推論</w:t>
+      </w:r>
+    </w:p>
+    <w:p>
+      <w:r>
+        <w:drawing>
+          <wp:inline xmlns:a="http://schemas.openxmlformats.org/drawingml/2006/main" xmlns:pic="http://schemas.openxmlformats.org/drawingml/2006/picture">
+            <wp:extent cx="6120000" cy="2181064"/>
+            <wp:docPr id="5" name="Picture 5"/>
+            <wp:cNvGraphicFramePr>
+              <a:graphicFrameLocks noChangeAspect="1"/>
+            </wp:cNvGraphicFramePr>
+            <a:graphic>
+              <a:graphicData uri="http://schemas.openxmlformats.org/drawingml/2006/picture">
+                <pic:pic>
+                  <pic:nvPicPr>
+                    <pic:cNvPr id="0" name="parameter_grid.png"/>
+                    <pic:cNvPicPr/>
+                  </pic:nvPicPr>
+                  <pic:blipFill>
+                    <a:blip r:embed="rId13"/>
+                    <a:stretch>
+                      <a:fillRect/>
+                    </a:stretch>
+                  </pic:blipFill>
+                  <pic:spPr>
+                    <a:xfrm>
+                      <a:off x="0" y="0"/>
+                      <a:ext cx="6120000" cy="2181064"/>
+                    </a:xfrm>
+                    <a:prstGeom prst="rect"/>
+                  </pic:spPr>
+                </pic:pic>
+              </a:graphicData>
+            </a:graphic>
+          </wp:inline>
+        </w:drawing>
+      </w:r>
+    </w:p>
+    <w:p>
+      <w:r>
+        <w:t>圖四：左為交易強度視窗×價格均線視窗36組參數的全樣本成本後Sharpe（橘框為20/20），右為各組在2018–2022與2023–2026的Sharpe。36組中位數1.19、最低0.87、86.11%高於1、全部淨利為正；20/20排第8，前後期1.22／1.52；若只用前期挑選會選60/20，其後期Sharpe 1.67。格點不能消除18候選挑選偏誤，但顯示結果不依賴單一參數峰值。</w:t>
+      </w:r>
+    </w:p>
+    <w:p>
+      <w:r>
+        <w:t>替代執行與成本設定（同一帳務與轉倉引擎）</w:t>
+      </w:r>
+    </w:p>
+    <w:tbl>
+      <w:tblPr>
+        <w:tblStyle w:val="TableGrid"/>
+        <w:tblW w:type="auto" w:w="0"/>
+        <w:tblLook w:firstColumn="1" w:firstRow="1" w:lastColumn="0" w:lastRow="0" w:noHBand="0" w:noVBand="1" w:val="04A0"/>
+      </w:tblPr>
+      <w:tblGrid>
+        <w:gridCol w:w="1474"/>
+        <w:gridCol w:w="1474"/>
+        <w:gridCol w:w="1474"/>
+        <w:gridCol w:w="1474"/>
+        <w:gridCol w:w="1474"/>
+        <w:gridCol w:w="1474"/>
+        <w:gridCol w:w="1474"/>
+      </w:tblGrid>
+      <w:tr>
+        <w:tc>
+          <w:tcPr>
+            <w:tcW w:type="dxa" w:w="1474"/>
+          </w:tcPr>
+          <w:p>
+            <w:r>
+              <w:t>情境</w:t>
+            </w:r>
+          </w:p>
+        </w:tc>
+        <w:tc>
+          <w:tcPr>
+            <w:tcW w:type="dxa" w:w="1474"/>
+          </w:tcPr>
+          <w:p>
+            <w:r>
+              <w:t>交易次數</w:t>
+            </w:r>
+          </w:p>
+        </w:tc>
+        <w:tc>
+          <w:tcPr>
+            <w:tcW w:type="dxa" w:w="1474"/>
+          </w:tcPr>
+          <w:p>
+            <w:r>
+              <w:t>持倉日</w:t>
+            </w:r>
+          </w:p>
+        </w:tc>
+        <w:tc>
+          <w:tcPr>
+            <w:tcW w:type="dxa" w:w="1474"/>
+          </w:tcPr>
+          <w:p>
+            <w:r>
+              <w:t>累積報酬</w:t>
+            </w:r>
+          </w:p>
+        </w:tc>
+        <w:tc>
+          <w:tcPr>
+            <w:tcW w:type="dxa" w:w="1474"/>
+          </w:tcPr>
+          <w:p>
+            <w:r>
+              <w:t>Sharpe</w:t>
+            </w:r>
+          </w:p>
+        </w:tc>
+        <w:tc>
+          <w:tcPr>
+            <w:tcW w:type="dxa" w:w="1474"/>
+          </w:tcPr>
+          <w:p>
+            <w:r>
+              <w:t>MDD</w:t>
+            </w:r>
+          </w:p>
+        </w:tc>
+        <w:tc>
+          <w:tcPr>
+            <w:tcW w:type="dxa" w:w="1474"/>
+          </w:tcPr>
+          <w:p>
+            <w:r>
+              <w:t>最長回撤（交易日）</w:t>
+            </w:r>
+          </w:p>
+        </w:tc>
+      </w:tr>
+      <w:tr>
+        <w:tc>
+          <w:tcPr>
+            <w:tcW w:type="dxa" w:w="1474"/>
+          </w:tcPr>
+          <w:p>
+            <w:r>
+              <w:t>基準設定（滑價2點、每邊50元）</w:t>
+            </w:r>
+          </w:p>
+        </w:tc>
+        <w:tc>
+          <w:tcPr>
+            <w:tcW w:type="dxa" w:w="1474"/>
+          </w:tcPr>
+          <w:p>
+            <w:r>
+              <w:t>147</w:t>
+            </w:r>
+          </w:p>
+        </w:tc>
+        <w:tc>
+          <w:tcPr>
+            <w:tcW w:type="dxa" w:w="1474"/>
+          </w:tcPr>
+          <w:p>
+            <w:r>
+              <w:t>658</w:t>
+            </w:r>
+          </w:p>
+        </w:tc>
+        <w:tc>
+          <w:tcPr>
+            <w:tcW w:type="dxa" w:w="1474"/>
+          </w:tcPr>
+          <w:p>
+            <w:r>
+              <w:t>149.32%</w:t>
+            </w:r>
+          </w:p>
+        </w:tc>
+        <w:tc>
+          <w:tcPr>
+            <w:tcW w:type="dxa" w:w="1474"/>
+          </w:tcPr>
+          <w:p>
+            <w:r>
+              <w:t>1.367</w:t>
+            </w:r>
+          </w:p>
+        </w:tc>
+        <w:tc>
+          <w:tcPr>
+            <w:tcW w:type="dxa" w:w="1474"/>
+          </w:tcPr>
+          <w:p>
+            <w:r>
+              <w:t>12.72%</w:t>
+            </w:r>
+          </w:p>
+        </w:tc>
+        <w:tc>
+          <w:tcPr>
+            <w:tcW w:type="dxa" w:w="1474"/>
+          </w:tcPr>
+          <w:p>
+            <w:r>
+              <w:t>482</w:t>
+            </w:r>
+          </w:p>
+        </w:tc>
+      </w:tr>
+      <w:tr>
+        <w:tc>
+          <w:tcPr>
+            <w:tcW w:type="dxa" w:w="1474"/>
+          </w:tcPr>
+          <w:p>
+            <w:r>
+              <w:t>延遲一日執行（t+2日開盤）</w:t>
+            </w:r>
+          </w:p>
+        </w:tc>
+        <w:tc>
+          <w:tcPr>
+            <w:tcW w:type="dxa" w:w="1474"/>
+          </w:tcPr>
+          <w:p>
+            <w:r>
+              <w:t>147</w:t>
+            </w:r>
+          </w:p>
+        </w:tc>
+        <w:tc>
+          <w:tcPr>
+            <w:tcW w:type="dxa" w:w="1474"/>
+          </w:tcPr>
+          <w:p>
+            <w:r>
+              <w:t>659</w:t>
+            </w:r>
+          </w:p>
+        </w:tc>
+        <w:tc>
+          <w:tcPr>
+            <w:tcW w:type="dxa" w:w="1474"/>
+          </w:tcPr>
+          <w:p>
+            <w:r>
+              <w:t>166.04%</w:t>
+            </w:r>
+          </w:p>
+        </w:tc>
+        <w:tc>
+          <w:tcPr>
+            <w:tcW w:type="dxa" w:w="1474"/>
+          </w:tcPr>
+          <w:p>
+            <w:r>
+              <w:t>1.437</w:t>
+            </w:r>
+          </w:p>
+        </w:tc>
+        <w:tc>
+          <w:tcPr>
+            <w:tcW w:type="dxa" w:w="1474"/>
+          </w:tcPr>
+          <w:p>
+            <w:r>
+              <w:t>10.14%</w:t>
+            </w:r>
+          </w:p>
+        </w:tc>
+        <w:tc>
+          <w:tcPr>
+            <w:tcW w:type="dxa" w:w="1474"/>
+          </w:tcPr>
+          <w:p>
+            <w:r>
+              <w:t>277</w:t>
+            </w:r>
+          </w:p>
+        </w:tc>
+      </w:tr>
+      <w:tr>
+        <w:tc>
+          <w:tcPr>
+            <w:tcW w:type="dxa" w:w="1474"/>
+          </w:tcPr>
+          <w:p>
+            <w:r>
+              <w:t>提前兩日換倉（策略與基準同步）</w:t>
+            </w:r>
+          </w:p>
+        </w:tc>
+        <w:tc>
+          <w:tcPr>
+            <w:tcW w:type="dxa" w:w="1474"/>
+          </w:tcPr>
+          <w:p>
+            <w:r>
+              <w:t>147</w:t>
+            </w:r>
+          </w:p>
+        </w:tc>
+        <w:tc>
+          <w:tcPr>
+            <w:tcW w:type="dxa" w:w="1474"/>
+          </w:tcPr>
+          <w:p>
+            <w:r>
+              <w:t>658</w:t>
+            </w:r>
+          </w:p>
+        </w:tc>
+        <w:tc>
+          <w:tcPr>
+            <w:tcW w:type="dxa" w:w="1474"/>
+          </w:tcPr>
+          <w:p>
+            <w:r>
+              <w:t>151.88%</w:t>
+            </w:r>
+          </w:p>
+        </w:tc>
+        <w:tc>
+          <w:tcPr>
+            <w:tcW w:type="dxa" w:w="1474"/>
+          </w:tcPr>
+          <w:p>
+            <w:r>
+              <w:t>1.385</w:t>
+            </w:r>
+          </w:p>
+        </w:tc>
+        <w:tc>
+          <w:tcPr>
+            <w:tcW w:type="dxa" w:w="1474"/>
+          </w:tcPr>
+          <w:p>
+            <w:r>
+              <w:t>12.75%</w:t>
+            </w:r>
+          </w:p>
+        </w:tc>
+        <w:tc>
+          <w:tcPr>
+            <w:tcW w:type="dxa" w:w="1474"/>
+          </w:tcPr>
+          <w:p>
+            <w:r>
+              <w:t>482</w:t>
+            </w:r>
+          </w:p>
+        </w:tc>
+      </w:tr>
+      <w:tr>
+        <w:tc>
+          <w:tcPr>
+            <w:tcW w:type="dxa" w:w="1474"/>
+          </w:tcPr>
+          <w:p>
+            <w:r>
+              <w:t>全部成本×1.5（75元、3點、稅×1.5）</w:t>
+            </w:r>
+          </w:p>
+        </w:tc>
+        <w:tc>
+          <w:tcPr>
+            <w:tcW w:type="dxa" w:w="1474"/>
+          </w:tcPr>
+          <w:p>
+            <w:r>
+              <w:t>147</w:t>
+            </w:r>
+          </w:p>
+        </w:tc>
+        <w:tc>
+          <w:tcPr>
+            <w:tcW w:type="dxa" w:w="1474"/>
+          </w:tcPr>
+          <w:p>
+            <w:r>
+              <w:t>658</w:t>
+            </w:r>
+          </w:p>
+        </w:tc>
+        <w:tc>
+          <w:tcPr>
+            <w:tcW w:type="dxa" w:w="1474"/>
+          </w:tcPr>
+          <w:p>
+            <w:r>
+              <w:t>144.94%</w:t>
+            </w:r>
+          </w:p>
+        </w:tc>
+        <w:tc>
+          <w:tcPr>
+            <w:tcW w:type="dxa" w:w="1474"/>
+          </w:tcPr>
+          <w:p>
+            <w:r>
+              <w:t>1.323</w:t>
+            </w:r>
+          </w:p>
+        </w:tc>
+        <w:tc>
+          <w:tcPr>
+            <w:tcW w:type="dxa" w:w="1474"/>
+          </w:tcPr>
+          <w:p>
+            <w:r>
+              <w:t>13.10%</w:t>
+            </w:r>
+          </w:p>
+        </w:tc>
+        <w:tc>
+          <w:tcPr>
+            <w:tcW w:type="dxa" w:w="1474"/>
+          </w:tcPr>
+          <w:p>
+            <w:r>
+              <w:t>482</w:t>
+            </w:r>
+          </w:p>
+        </w:tc>
+      </w:tr>
+      <w:tr>
+        <w:tc>
+          <w:tcPr>
+            <w:tcW w:type="dxa" w:w="1474"/>
+          </w:tcPr>
+          <w:p>
+            <w:r>
+              <w:t>全部成本×2（100元、4點、稅×2）</w:t>
+            </w:r>
+          </w:p>
+        </w:tc>
+        <w:tc>
+          <w:tcPr>
+            <w:tcW w:type="dxa" w:w="1474"/>
+          </w:tcPr>
+          <w:p>
+            <w:r>
+              <w:t>147</w:t>
+            </w:r>
+          </w:p>
+        </w:tc>
+        <w:tc>
+          <w:tcPr>
+            <w:tcW w:type="dxa" w:w="1474"/>
+          </w:tcPr>
+          <w:p>
+            <w:r>
+              <w:t>658</w:t>
+            </w:r>
+          </w:p>
+        </w:tc>
+        <w:tc>
+          <w:tcPr>
+            <w:tcW w:type="dxa" w:w="1474"/>
+          </w:tcPr>
+          <w:p>
+            <w:r>
+              <w:t>140.57%</w:t>
+            </w:r>
+          </w:p>
+        </w:tc>
+        <w:tc>
+          <w:tcPr>
+            <w:tcW w:type="dxa" w:w="1474"/>
+          </w:tcPr>
+          <w:p>
+            <w:r>
+              <w:t>1.279</w:t>
+            </w:r>
+          </w:p>
+        </w:tc>
+        <w:tc>
+          <w:tcPr>
+            <w:tcW w:type="dxa" w:w="1474"/>
+          </w:tcPr>
+          <w:p>
+            <w:r>
+              <w:t>13.49%</w:t>
+            </w:r>
+          </w:p>
+        </w:tc>
+        <w:tc>
+          <w:tcPr>
+            <w:tcW w:type="dxa" w:w="1474"/>
+          </w:tcPr>
+          <w:p>
+            <w:r>
+              <w:t>524</w:t>
+            </w:r>
+          </w:p>
+        </w:tc>
+      </w:tr>
+      <w:tr>
+        <w:tc>
+          <w:tcPr>
+            <w:tcW w:type="dxa" w:w="1474"/>
+          </w:tcPr>
+          <w:p>
+            <w:r>
+              <w:t>換月價差調整訊號（14天不同）</w:t>
+            </w:r>
+          </w:p>
+        </w:tc>
+        <w:tc>
+          <w:tcPr>
+            <w:tcW w:type="dxa" w:w="1474"/>
+          </w:tcPr>
+          <w:p>
+            <w:r>
+              <w:t>151</w:t>
+            </w:r>
+          </w:p>
+        </w:tc>
+        <w:tc>
+          <w:tcPr>
+            <w:tcW w:type="dxa" w:w="1474"/>
+          </w:tcPr>
+          <w:p>
+            <w:r>
+              <w:t>668</w:t>
+            </w:r>
+          </w:p>
+        </w:tc>
+        <w:tc>
+          <w:tcPr>
+            <w:tcW w:type="dxa" w:w="1474"/>
+          </w:tcPr>
+          <w:p>
+            <w:r>
+              <w:t>137.99%</w:t>
+            </w:r>
+          </w:p>
+        </w:tc>
+        <w:tc>
+          <w:tcPr>
+            <w:tcW w:type="dxa" w:w="1474"/>
+          </w:tcPr>
+          <w:p>
+            <w:r>
+              <w:t>1.245</w:t>
+            </w:r>
+          </w:p>
+        </w:tc>
+        <w:tc>
+          <w:tcPr>
+            <w:tcW w:type="dxa" w:w="1474"/>
+          </w:tcPr>
+          <w:p>
+            <w:r>
+              <w:t>15.35%</w:t>
+            </w:r>
+          </w:p>
+        </w:tc>
+        <w:tc>
+          <w:tcPr>
+            <w:tcW w:type="dxa" w:w="1474"/>
+          </w:tcPr>
+          <w:p>
+            <w:r>
+              <w:t>692</w:t>
+            </w:r>
+          </w:p>
+        </w:tc>
+      </w:tr>
+      <w:tr>
+        <w:tc>
+          <w:tcPr>
+            <w:tcW w:type="dxa" w:w="1474"/>
+          </w:tcPr>
+          <w:p>
+            <w:r>
+              <w:t>替代法人來源FinMind（0天不同）</w:t>
+            </w:r>
+          </w:p>
+        </w:tc>
+        <w:tc>
+          <w:tcPr>
+            <w:tcW w:type="dxa" w:w="1474"/>
+          </w:tcPr>
+          <w:p>
+            <w:r>
+              <w:t>147</w:t>
+            </w:r>
+          </w:p>
+        </w:tc>
+        <w:tc>
+          <w:tcPr>
+            <w:tcW w:type="dxa" w:w="1474"/>
+          </w:tcPr>
+          <w:p>
+            <w:r>
+              <w:t>658</w:t>
+            </w:r>
+          </w:p>
+        </w:tc>
+        <w:tc>
+          <w:tcPr>
+            <w:tcW w:type="dxa" w:w="1474"/>
+          </w:tcPr>
+          <w:p>
+            <w:r>
+              <w:t>149.32%</w:t>
+            </w:r>
+          </w:p>
+        </w:tc>
+        <w:tc>
+          <w:tcPr>
+            <w:tcW w:type="dxa" w:w="1474"/>
+          </w:tcPr>
+          <w:p>
+            <w:r>
+              <w:t>1.367</w:t>
+            </w:r>
+          </w:p>
+        </w:tc>
+        <w:tc>
+          <w:tcPr>
+            <w:tcW w:type="dxa" w:w="1474"/>
+          </w:tcPr>
+          <w:p>
+            <w:r>
+              <w:t>12.72%</w:t>
+            </w:r>
+          </w:p>
+        </w:tc>
+        <w:tc>
+          <w:tcPr>
+            <w:tcW w:type="dxa" w:w="1474"/>
+          </w:tcPr>
+          <w:p>
+            <w:r>
+              <w:t>482</w:t>
+            </w:r>
+          </w:p>
+        </w:tc>
+      </w:tr>
+    </w:tbl>
+    <w:p>
+      <w:r>
+        <w:t>訊號與次日報酬：Q20分位與「趨勢×法人」條件（同契約收盤至次日收盤）</w:t>
+      </w:r>
+    </w:p>
+    <w:tbl>
+      <w:tblPr>
+        <w:tblStyle w:val="TableGrid"/>
+        <w:tblW w:type="auto" w:w="0"/>
+        <w:tblLook w:firstColumn="1" w:firstRow="1" w:lastColumn="0" w:lastRow="0" w:noHBand="0" w:noVBand="1" w:val="04A0"/>
+      </w:tblPr>
+      <w:tblGrid>
+        <w:gridCol w:w="1720"/>
+        <w:gridCol w:w="1720"/>
+        <w:gridCol w:w="1720"/>
+        <w:gridCol w:w="1720"/>
+        <w:gridCol w:w="1720"/>
+        <w:gridCol w:w="1720"/>
+      </w:tblGrid>
+      <w:tr>
+        <w:tc>
+          <w:tcPr>
+            <w:tcW w:type="dxa" w:w="1720"/>
+          </w:tcPr>
+          <w:p>
+            <w:r>
+              <w:t>訊號日分組</w:t>
+            </w:r>
+          </w:p>
+        </w:tc>
+        <w:tc>
+          <w:tcPr>
+            <w:tcW w:type="dxa" w:w="1720"/>
+          </w:tcPr>
+          <w:p>
+            <w:r>
+              <w:t>天數</w:t>
+            </w:r>
+          </w:p>
+        </w:tc>
+        <w:tc>
+          <w:tcPr>
+            <w:tcW w:type="dxa" w:w="1720"/>
+          </w:tcPr>
+          <w:p>
+            <w:r>
+              <w:t>次日平均報酬（bp）</w:t>
+            </w:r>
+          </w:p>
+        </w:tc>
+        <w:tc>
+          <w:tcPr>
+            <w:tcW w:type="dxa" w:w="1720"/>
+          </w:tcPr>
+          <w:p>
+            <w:r>
+              <w:t>中位數（bp）</w:t>
+            </w:r>
+          </w:p>
+        </w:tc>
+        <w:tc>
+          <w:tcPr>
+            <w:tcW w:type="dxa" w:w="1720"/>
+          </w:tcPr>
+          <w:p>
+            <w:r>
+              <w:t>勝率</w:t>
+            </w:r>
+          </w:p>
+        </w:tc>
+        <w:tc>
+          <w:tcPr>
+            <w:tcW w:type="dxa" w:w="1720"/>
+          </w:tcPr>
+          <w:p>
+            <w:r>
+              <w:t>t值</w:t>
+            </w:r>
+          </w:p>
+        </w:tc>
+      </w:tr>
+      <w:tr>
+        <w:tc>
+          <w:tcPr>
+            <w:tcW w:type="dxa" w:w="1720"/>
+          </w:tcPr>
+          <w:p>
+            <w:r>
+              <w:t>Q20 第1分位（最低）</w:t>
+            </w:r>
+          </w:p>
+        </w:tc>
+        <w:tc>
+          <w:tcPr>
+            <w:tcW w:type="dxa" w:w="1720"/>
+          </w:tcPr>
+          <w:p>
+            <w:r>
+              <w:t>375</w:t>
+            </w:r>
+          </w:p>
+        </w:tc>
+        <w:tc>
+          <w:tcPr>
+            <w:tcW w:type="dxa" w:w="1720"/>
+          </w:tcPr>
+          <w:p>
+            <w:r>
+              <w:t>-8.3</w:t>
+            </w:r>
+          </w:p>
+        </w:tc>
+        <w:tc>
+          <w:tcPr>
+            <w:tcW w:type="dxa" w:w="1720"/>
+          </w:tcPr>
+          <w:p>
+            <w:r>
+              <w:t>3.6</w:t>
+            </w:r>
+          </w:p>
+        </w:tc>
+        <w:tc>
+          <w:tcPr>
+            <w:tcW w:type="dxa" w:w="1720"/>
+          </w:tcPr>
+          <w:p>
+            <w:r>
+              <w:t>50.67%</w:t>
+            </w:r>
+          </w:p>
+        </w:tc>
+        <w:tc>
+          <w:tcPr>
+            <w:tcW w:type="dxa" w:w="1720"/>
+          </w:tcPr>
+          <w:p>
+            <w:r>
+              <w:t>-1.04</w:t>
+            </w:r>
+          </w:p>
+        </w:tc>
+      </w:tr>
+      <w:tr>
+        <w:tc>
+          <w:tcPr>
+            <w:tcW w:type="dxa" w:w="1720"/>
+          </w:tcPr>
+          <w:p>
+            <w:r>
+              <w:t>Q20 第2分位（中間）</w:t>
+            </w:r>
+          </w:p>
+        </w:tc>
+        <w:tc>
+          <w:tcPr>
+            <w:tcW w:type="dxa" w:w="1720"/>
+          </w:tcPr>
+          <w:p>
+            <w:r>
+              <w:t>374</w:t>
+            </w:r>
+          </w:p>
+        </w:tc>
+        <w:tc>
+          <w:tcPr>
+            <w:tcW w:type="dxa" w:w="1720"/>
+          </w:tcPr>
+          <w:p>
+            <w:r>
+              <w:t>7.0</w:t>
+            </w:r>
+          </w:p>
+        </w:tc>
+        <w:tc>
+          <w:tcPr>
+            <w:tcW w:type="dxa" w:w="1720"/>
+          </w:tcPr>
+          <w:p>
+            <w:r>
+              <w:t>17.5</w:t>
+            </w:r>
+          </w:p>
+        </w:tc>
+        <w:tc>
+          <w:tcPr>
+            <w:tcW w:type="dxa" w:w="1720"/>
+          </w:tcPr>
+          <w:p>
+            <w:r>
+              <w:t>56.15%</w:t>
+            </w:r>
+          </w:p>
+        </w:tc>
+        <w:tc>
+          <w:tcPr>
+            <w:tcW w:type="dxa" w:w="1720"/>
+          </w:tcPr>
+          <w:p>
+            <w:r>
+              <w:t>0.99</w:t>
+            </w:r>
+          </w:p>
+        </w:tc>
+      </w:tr>
+      <w:tr>
+        <w:tc>
+          <w:tcPr>
+            <w:tcW w:type="dxa" w:w="1720"/>
+          </w:tcPr>
+          <w:p>
+            <w:r>
+              <w:t>Q20 第3分位（中間）</w:t>
+            </w:r>
+          </w:p>
+        </w:tc>
+        <w:tc>
+          <w:tcPr>
+            <w:tcW w:type="dxa" w:w="1720"/>
+          </w:tcPr>
+          <w:p>
+            <w:r>
+              <w:t>374</w:t>
+            </w:r>
+          </w:p>
+        </w:tc>
+        <w:tc>
+          <w:tcPr>
+            <w:tcW w:type="dxa" w:w="1720"/>
+          </w:tcPr>
+          <w:p>
+            <w:r>
+              <w:t>28.9</w:t>
+            </w:r>
+          </w:p>
+        </w:tc>
+        <w:tc>
+          <w:tcPr>
+            <w:tcW w:type="dxa" w:w="1720"/>
+          </w:tcPr>
+          <w:p>
+            <w:r>
+              <w:t>26.0</w:t>
+            </w:r>
+          </w:p>
+        </w:tc>
+        <w:tc>
+          <w:tcPr>
+            <w:tcW w:type="dxa" w:w="1720"/>
+          </w:tcPr>
+          <w:p>
+            <w:r>
+              <w:t>60.70%</w:t>
+            </w:r>
+          </w:p>
+        </w:tc>
+        <w:tc>
+          <w:tcPr>
+            <w:tcW w:type="dxa" w:w="1720"/>
+          </w:tcPr>
+          <w:p>
+            <w:r>
+              <w:t>4.84</w:t>
+            </w:r>
+          </w:p>
+        </w:tc>
+      </w:tr>
+      <w:tr>
+        <w:tc>
+          <w:tcPr>
+            <w:tcW w:type="dxa" w:w="1720"/>
+          </w:tcPr>
+          <w:p>
+            <w:r>
+              <w:t>Q20 第4分位（中間）</w:t>
+            </w:r>
+          </w:p>
+        </w:tc>
+        <w:tc>
+          <w:tcPr>
+            <w:tcW w:type="dxa" w:w="1720"/>
+          </w:tcPr>
+          <w:p>
+            <w:r>
+              <w:t>374</w:t>
+            </w:r>
+          </w:p>
+        </w:tc>
+        <w:tc>
+          <w:tcPr>
+            <w:tcW w:type="dxa" w:w="1720"/>
+          </w:tcPr>
+          <w:p>
+            <w:r>
+              <w:t>12.5</w:t>
+            </w:r>
+          </w:p>
+        </w:tc>
+        <w:tc>
+          <w:tcPr>
+            <w:tcW w:type="dxa" w:w="1720"/>
+          </w:tcPr>
+          <w:p>
+            <w:r>
+              <w:t>11.3</w:t>
+            </w:r>
+          </w:p>
+        </w:tc>
+        <w:tc>
+          <w:tcPr>
+            <w:tcW w:type="dxa" w:w="1720"/>
+          </w:tcPr>
+          <w:p>
+            <w:r>
+              <w:t>55.61%</w:t>
+            </w:r>
+          </w:p>
+        </w:tc>
+        <w:tc>
+          <w:tcPr>
+            <w:tcW w:type="dxa" w:w="1720"/>
+          </w:tcPr>
+          <w:p>
+            <w:r>
+              <w:t>2.03</w:t>
+            </w:r>
+          </w:p>
+        </w:tc>
+      </w:tr>
+      <w:tr>
+        <w:tc>
+          <w:tcPr>
+            <w:tcW w:type="dxa" w:w="1720"/>
+          </w:tcPr>
+          <w:p>
+            <w:r>
+              <w:t>Q20 第5分位（最高）</w:t>
+            </w:r>
+          </w:p>
+        </w:tc>
+        <w:tc>
+          <w:tcPr>
+            <w:tcW w:type="dxa" w:w="1720"/>
+          </w:tcPr>
+          <w:p>
+            <w:r>
+              <w:t>374</w:t>
+            </w:r>
+          </w:p>
+        </w:tc>
+        <w:tc>
+          <w:tcPr>
+            <w:tcW w:type="dxa" w:w="1720"/>
+          </w:tcPr>
+          <w:p>
+            <w:r>
+              <w:t>8.2</w:t>
+            </w:r>
+          </w:p>
+        </w:tc>
+        <w:tc>
+          <w:tcPr>
+            <w:tcW w:type="dxa" w:w="1720"/>
+          </w:tcPr>
+          <w:p>
+            <w:r>
+              <w:t>7.0</w:t>
+            </w:r>
+          </w:p>
+        </w:tc>
+        <w:tc>
+          <w:tcPr>
+            <w:tcW w:type="dxa" w:w="1720"/>
+          </w:tcPr>
+          <w:p>
+            <w:r>
+              <w:t>55.35%</w:t>
+            </w:r>
+          </w:p>
+        </w:tc>
+        <w:tc>
+          <w:tcPr>
+            <w:tcW w:type="dxa" w:w="1720"/>
+          </w:tcPr>
+          <w:p>
+            <w:r>
+              <w:t>1.17</w:t>
+            </w:r>
+          </w:p>
+        </w:tc>
+      </w:tr>
+      <w:tr>
+        <w:tc>
+          <w:tcPr>
+            <w:tcW w:type="dxa" w:w="1720"/>
+          </w:tcPr>
+          <w:p>
+            <w:r>
+              <w:t>收盤&gt;MA20 且 Q20&gt;0</w:t>
+            </w:r>
+          </w:p>
+        </w:tc>
+        <w:tc>
+          <w:tcPr>
+            <w:tcW w:type="dxa" w:w="1720"/>
+          </w:tcPr>
+          <w:p>
+            <w:r>
+              <w:t>626</w:t>
+            </w:r>
+          </w:p>
+        </w:tc>
+        <w:tc>
+          <w:tcPr>
+            <w:tcW w:type="dxa" w:w="1720"/>
+          </w:tcPr>
+          <w:p>
+            <w:r>
+              <w:t>16.6</w:t>
+            </w:r>
+          </w:p>
+        </w:tc>
+        <w:tc>
+          <w:tcPr>
+            <w:tcW w:type="dxa" w:w="1720"/>
+          </w:tcPr>
+          <w:p>
+            <w:r>
+              <w:t>13.1</w:t>
+            </w:r>
+          </w:p>
+        </w:tc>
+        <w:tc>
+          <w:tcPr>
+            <w:tcW w:type="dxa" w:w="1720"/>
+          </w:tcPr>
+          <w:p>
+            <w:r>
+              <w:t>57.03%</w:t>
+            </w:r>
+          </w:p>
+        </w:tc>
+        <w:tc>
+          <w:tcPr>
+            <w:tcW w:type="dxa" w:w="1720"/>
+          </w:tcPr>
+          <w:p>
+            <w:r>
+              <w:t>4.81</w:t>
+            </w:r>
+          </w:p>
+        </w:tc>
+      </w:tr>
+      <w:tr>
+        <w:tc>
+          <w:tcPr>
+            <w:tcW w:type="dxa" w:w="1720"/>
+          </w:tcPr>
+          <w:p>
+            <w:r>
+              <w:t>收盤&gt;MA20 且 Q20≤0</w:t>
+            </w:r>
+          </w:p>
+        </w:tc>
+        <w:tc>
+          <w:tcPr>
+            <w:tcW w:type="dxa" w:w="1720"/>
+          </w:tcPr>
+          <w:p>
+            <w:r>
+              <w:t>600</w:t>
+            </w:r>
+          </w:p>
+        </w:tc>
+        <w:tc>
+          <w:tcPr>
+            <w:tcW w:type="dxa" w:w="1720"/>
+          </w:tcPr>
+          <w:p>
+            <w:r>
+              <w:t>4.8</w:t>
+            </w:r>
+          </w:p>
+        </w:tc>
+        <w:tc>
+          <w:tcPr>
+            <w:tcW w:type="dxa" w:w="1720"/>
+          </w:tcPr>
+          <w:p>
+            <w:r>
+              <w:t>11.4</w:t>
+            </w:r>
+          </w:p>
+        </w:tc>
+        <w:tc>
+          <w:tcPr>
+            <w:tcW w:type="dxa" w:w="1720"/>
+          </w:tcPr>
+          <w:p>
+            <w:r>
+              <w:t>54.17%</w:t>
+            </w:r>
+          </w:p>
+        </w:tc>
+        <w:tc>
+          <w:tcPr>
+            <w:tcW w:type="dxa" w:w="1720"/>
+          </w:tcPr>
+          <w:p>
+            <w:r>
+              <w:t>0.94</w:t>
+            </w:r>
+          </w:p>
+        </w:tc>
+      </w:tr>
+      <w:tr>
+        <w:tc>
+          <w:tcPr>
+            <w:tcW w:type="dxa" w:w="1720"/>
+          </w:tcPr>
+          <w:p>
+            <w:r>
+              <w:t>收盤≤MA20 且 Q20&gt;0</w:t>
+            </w:r>
+          </w:p>
+        </w:tc>
+        <w:tc>
+          <w:tcPr>
+            <w:tcW w:type="dxa" w:w="1720"/>
+          </w:tcPr>
+          <w:p>
+            <w:r>
+              <w:t>294</w:t>
+            </w:r>
+          </w:p>
+        </w:tc>
+        <w:tc>
+          <w:tcPr>
+            <w:tcW w:type="dxa" w:w="1720"/>
+          </w:tcPr>
+          <w:p>
+            <w:r>
+              <w:t>9.9</w:t>
+            </w:r>
+          </w:p>
+        </w:tc>
+        <w:tc>
+          <w:tcPr>
+            <w:tcW w:type="dxa" w:w="1720"/>
+          </w:tcPr>
+          <w:p>
+            <w:r>
+              <w:t>7.5</w:t>
+            </w:r>
+          </w:p>
+        </w:tc>
+        <w:tc>
+          <w:tcPr>
+            <w:tcW w:type="dxa" w:w="1720"/>
+          </w:tcPr>
+          <w:p>
+            <w:r>
+              <w:t>55.10%</w:t>
+            </w:r>
+          </w:p>
+        </w:tc>
+        <w:tc>
+          <w:tcPr>
+            <w:tcW w:type="dxa" w:w="1720"/>
+          </w:tcPr>
+          <w:p>
+            <w:r>
+              <w:t>0.92</w:t>
+            </w:r>
+          </w:p>
+        </w:tc>
+      </w:tr>
+      <w:tr>
+        <w:tc>
+          <w:tcPr>
+            <w:tcW w:type="dxa" w:w="1720"/>
+          </w:tcPr>
+          <w:p>
+            <w:r>
+              <w:t>收盤≤MA20 且 Q20≤0</w:t>
+            </w:r>
+          </w:p>
+        </w:tc>
+        <w:tc>
+          <w:tcPr>
+            <w:tcW w:type="dxa" w:w="1720"/>
+          </w:tcPr>
+          <w:p>
+            <w:r>
+              <w:t>351</w:t>
+            </w:r>
+          </w:p>
+        </w:tc>
+        <w:tc>
+          <w:tcPr>
+            <w:tcW w:type="dxa" w:w="1720"/>
+          </w:tcPr>
+          <w:p>
+            <w:r>
+              <w:t>5.4</w:t>
+            </w:r>
+          </w:p>
+        </w:tc>
+        <w:tc>
+          <w:tcPr>
+            <w:tcW w:type="dxa" w:w="1720"/>
+          </w:tcPr>
+          <w:p>
+            <w:r>
+              <w:t>21.0</w:t>
+            </w:r>
+          </w:p>
+        </w:tc>
+        <w:tc>
+          <w:tcPr>
+            <w:tcW w:type="dxa" w:w="1720"/>
+          </w:tcPr>
+          <w:p>
+            <w:r>
+              <w:t>56.41%</w:t>
+            </w:r>
+          </w:p>
+        </w:tc>
+        <w:tc>
+          <w:tcPr>
+            <w:tcW w:type="dxa" w:w="1720"/>
+          </w:tcPr>
+          <w:p>
+            <w:r>
+              <w:t>0.62</w:t>
+            </w:r>
+          </w:p>
+        </w:tc>
+      </w:tr>
+    </w:tbl>
+    <w:p>
+      <w:r>
+        <w:t>收盤&gt;MA20的訊號日中，Q20&gt;0相對Q20≤0的次日平均報酬差+11.8 bp（Welch t=1.92），是法人條件在趨勢濾網之上的增量證據；五分位報酬並非單調，零門檻是方向判斷而非強度分級。20日循環區塊bootstrap重抽5,000次：策略Sharpe 95%區間[0.63, 2.09]、P(Sharpe≤0)=0.0002、日均報酬t=3.82；固定一口基準[0.46, 1.91]、價格單獨策略[0.41, 1.88]。三者區間重疊，統計上不能宣稱策略Sharpe高於基準；區間未校正候選挑選。</w:t>
+      </w:r>
+    </w:p>
+    <w:p>
+      <w:pPr>
+        <w:pStyle w:val="Heading1"/>
+        <w:pageBreakBefore/>
+      </w:pPr>
+      <w:r>
         <w:t>伍、策略極限與檢討</w:t>
       </w:r>
     </w:p>
@@ -3527,32 +4883,12 @@
     </w:p>
     <w:p>
       <w:r>
-        <w:t>本研究的交易強度衡量三大法人的當日淨成交流量，而非收盤後仍持有的未平倉部位。以多空交易總口數作為分母，可降低不同交易活躍程度對原始淨口數的影響；然而三類法人交易同時可能包含方向投資、股票與選擇權避險、套利及造市活動，因此公開彙總資料無法識別各機構的實際交易動機。[2]</w:t>
+        <w:t>交易強度衡量三大法人的當日淨成交流量，而非未平倉部位；以多空總口數為分母可降低活躍度差異的影響，但三類法人交易同時含方向投資、避險、套利與造市，公開彙總資料無法識別動機。[2] 策略採多單／空手架構，績效同時受長期多頭趨勢與隔夜報酬影響，bootstrap區間與基準重疊，不能歸因於法人資訊優勢。固定一口基準MDD 28.64%高於策略12.72%，但其年化波動19.03%亦遠高於8.84%；縮放至約0.293口的配平基準Sharpe 1.120、MDD 13.67%，只控制風險尺度，小數口不可直接交易。</w:t>
       </w:r>
     </w:p>
     <w:p>
       <w:r>
-        <w:t>20日平均用於降低單日成交流量雜訊，再以價格高於20日均線作為趨勢確認。回測中較高的Sharpe僅代表此規則在目前樣本中的歷史風險調整績效；由於策略採多單／空手架構，績效同時受到長期多頭趨勢與隔夜報酬影響，不能將全部成果歸因於法人資訊優勢。</w:t>
-      </w:r>
-    </w:p>
-    <w:p>
-      <w:r>
-        <w:t>固定一口Buy-and-Hold的MDD 28.64%高於策略的12.72%，但其年化波動19.03%亦遠高於策略的8.84%；縮放至約0.293口的配平基準Sharpe為1.120、MDD為13.67%（見肆續表），這只控制風險尺度，小數口並非可直接交易的部位。</w:t>
-      </w:r>
-    </w:p>
-    <w:p>
-      <w:r>
-        <w:t>逐筆比對兩份法人來源共6,090筆，其中2筆在2026/07/06不同，造成20個交易日的Q20變化，但本樣本0天訊號改變。歷史逐日初次發布快照與修訂軌跡未留存，故不能聲稱全期資料時點已獨立驗證。</w:t>
-      </w:r>
-    </w:p>
-    <w:p>
-      <w:r>
-        <w:t>近月未調整價格均線有換月價差敏感度：以前一日兩契約收盤重疊價差調整訊號後，14天訊號不同，淨利3,028,972.77元、Sharpe 1.245；正式策略為3,277,536.58元、1.367。此項診斷只變更訊號，實際成交仍按原契約。</w:t>
-      </w:r>
-    </w:p>
-    <w:p>
-      <w:r>
-        <w:t>價格單獨策略按完整樣本事後配平至相同年波動的TX-equivalent為0.437，淨利2,108,818.45元、Sharpe 1.020；策略為3,277,536.58元、1.367。這是風險尺度與曝險差異的描述，配平小數口不能直接交易，亦非樣本外證據。</w:t>
+        <w:t>資料口徑敏感度：兩份法人來源比對6,090筆僅2筆不同（2026/07/06），0天訊號改變，但歷史初次發布快照未留存，資料時點未獨立驗證。近月未調整均線以前一日重疊價差調整後14天訊號不同，Sharpe由1.367降至1.245，是最敏感的口徑；價格單獨策略配平至同波動後Sharpe 1.020低於策略，但屬全樣本事後配平。</w:t>
       </w:r>
     </w:p>
     <w:p>
@@ -3562,12 +4898,7 @@
     </w:p>
     <w:p>
       <w:r>
-        <w:t>在盤整、急漲急跌或V形反轉環境中，20日平均具有滯後性，價格亦可能在MA20附近反覆穿越。當條件短暫失效後退出、再度成立後重新進場，可能造成追價、較低價格退出或錯失快速反彈。雙條件一致仍可能漏接行情或反覆進出。</w:t>
-      </w:r>
-    </w:p>
-    <w:p>
-      <w:r>
-        <w:t>本回測未加入事後最佳化的固定點數停損。現有資料僅含日盤OHLC，缺乏完整夜盤價格路徑、委託排隊及極端行情成交資訊，因此若加入盤中觸價停損，將引入無法可靠驗證的成交假設。策略僅依訊號消退、轉倉與期末清算執行出場。</w:t>
+        <w:t>盤整或V形反轉時20日平均滯後、價格在MA20附近反覆穿越，條件短暫失效後退出再進場，造成追價、較差價格退出或錯失反彈。本回測未加入事後最佳化的固定點數停損：資料僅含日盤OHLC，缺乏夜盤路徑與極端行情成交資訊，盤中觸價停損會引入無法驗證的成交假設；出場只依訊號消退、轉倉與期末清算。</w:t>
       </w:r>
     </w:p>
     <w:p>
@@ -3577,18 +4908,12 @@
     </w:p>
     <w:p>
       <w:r>
-        <w:t>本策略實際持有隔夜部位，因此海外市場、匯率與突發事件可能在臺指期日盤重新開市前改變價格。即使隔日日盤開盤已產生退出需求，仍須承受前一日收盤至下一交易日開盤的跳空風險；若開盤流動性不足，實際成交損失亦可能高於固定2點滑價假設。</w:t>
-      </w:r>
-    </w:p>
-    <w:p>
-      <w:r>
-        <w:t>特殊期間表顯示策略在8個急跌視窗中有8個於最深跳空日為空手，這來自雙條件在下跌初期即退出，而非對事件的預測；代價是反彈初期缺席：從最深跳空日到重新進場，中位數需16個交易日，期間近月平均已回升5.5%，2024-08 全球急跌更達16.4%。樣本內三個最差單日為2026/04/02（進場日，-238,385元）、2026/07/07（持倉日，-222,200元）、2026/05/19（進場日，-130,236元），均發生在快速反轉時的進場或持倉日，跳空風險集中於重新進場後而非持倉中段。因此12.72%的日末MDD不應解讀為單筆交易或盤中可能遭受的最大損失；共同起始資金並未重建歷史保證金與追繳，評估實際可行性仍需納入夜盤價格、盤中極端波動、開盤成交品質與逐日保證金需求。</w:t>
+        <w:t>策略持有隔夜部位，海外市場與突發事件可能在日盤重新開市前改變價格，開盤流動性不足時損失可能高於固定2點滑價。特殊期間表中8個急跌視窗有8個於最深跳空日為空手，這來自雙條件在下跌初期即退出，而非預測；代價是從最深跳空日到重新進場中位數需16個交易日，期間近月平均已回升5.5%、最高16.4%。樣本內三個最差單日為2026/04/02（進場日，-238,385元）、2026/07/07（持倉日，-222,200元）、2026/05/19（進場日，-130,236元），均為快速反轉時的進場或持倉日，跳空風險集中於重新進場後；日末MDD不等於盤中最大損失，且未重建歷史保證金與追繳。</w:t>
       </w:r>
     </w:p>
     <w:p>
       <w:pPr>
         <w:pStyle w:val="Heading1"/>
-        <w:pageBreakBefore/>
       </w:pPr>
       <w:r>
         <w:t>陸、結論與後續驗證</w:t>
@@ -3596,72 +4921,17 @@
     </w:p>
     <w:p>
       <w:r>
-        <w:t>一、績效結論</w:t>
+        <w:t>績效結論：以2,195,000.00元起算，策略Sharpe 1.367、Calmar 0.939、MDD 12.72%，固定一口Buy-and-Hold為1.147、0.743、28.64%；但策略累積報酬149.32%低於基準376.69%與加權指數350.40%，最長回撤482日長於基準366日；配平基準Sharpe 1.120低於策略，但bootstrap 95%區間重疊，統計上無法區分。證據強度：36組參數中86.11%的Sharpe高於1，7個替代執行與成本情境的Sharpe介於1.245至1.437，法人條件在趨勢濾網之上的次日報酬增量+11.8 bp（t=1.92）；但策略由18個候選比較後選出，所有檢驗皆為全樣本事後診斷，Sharpe含選擇偏誤。</w:t>
       </w:r>
     </w:p>
     <w:p>
       <w:r>
-        <w:t>以2,195,000.00元建立兩條權益曲線，逐日累加淨損益後，策略Sharpe為1.367、Calmar為0.939，固定一口Buy-and-Hold為1.147與0.743；策略MDD為12.72%，基準為28.64%。策略累積報酬149.32%低於基準376.69%。固定一口比較仍有持倉時間差異：策略持倉日約為基準三分之一。</w:t>
+        <w:t>最終判斷：規則可追溯、成本後報酬為正且對設定不敏感，但未證明法人訊號創造穩定超額報酬；在完成至少252個未參與設計的新交易日前瞻驗證（規則、參數與成本已於prospective_protocol.json凍結）之前，結論為「有條件通過：僅作研究假說，不建議部署」。</w:t>
       </w:r>
     </w:p>
     <w:p>
       <w:r>
-        <w:t>將 benchmark 事後縮放至與策略相同的8.84%年化波動後，配平 benchmark 的Sharpe為1.120、MDD為13.67%、Calmar為0.703；策略分別為1.367、12.72%與0.939。策略在同風險尺度下仍較佳，但配平係數使用完整樣本且為小數口，只是診斷，不是可部署的交易基準。</w:t>
-      </w:r>
-    </w:p>
-    <w:p>
-      <w:r>
-        <w:t>策略最長回撤期間為482個交易日，高於基準的366日，顯示較低回撤幅度不等同於較短的資金恢復時間。勝率約51.70%、Profit Factor約2.197，績效並非依賴高勝率，而較依賴部分趨勢延續期間的較大獲利；前五筆交易與近兩年績效占比較高，亦顯示成果存在集中性。</w:t>
-      </w:r>
-    </w:p>
-    <w:p>
-      <w:r>
-        <w:t>加權指數價格報酬為350.40%、MDD 31.63%，但未含股息或追蹤成本，僅作市場參考。</w:t>
-      </w:r>
-    </w:p>
-    <w:p>
-      <w:r>
-        <w:t>二、樣本選擇偏誤與驗證要求</w:t>
-      </w:r>
-    </w:p>
-    <w:p>
-      <w:r>
-        <w:t>本策略由18個候選規則比較後選出，並非在完全未觀察資料的情況下事先固定。因此，即使滑價敏感度與時間分組結果仍為正，也不能視為獨立樣本外證據。目前的Sharpe可能包含策略挑選造成的選擇偏誤，應在解讀績效時明確納入。</w:t>
-      </w:r>
-    </w:p>
-    <w:p>
-      <w:r>
-        <w:t>後續驗證應先凍結20日交易強度、20日價格均線、零門檻及成本假設，再以未參與策略設計的新資料進行樣本外檢驗。若進一步測試結算日排除、均線參數或停損規則，應事前限定假說與參數範圍，並完整報告所有結果，以降低多重嘗試造成的偏誤。</w:t>
-      </w:r>
-    </w:p>
-    <w:p>
-      <w:r>
-        <w:t>綜合而言，策略規則可追溯且歷史成本後報酬為正，但同期大盤與TX買進持有累積報酬均較高；策略持倉較少且回撤較低，未能據此認定法人訊號創造穩定超額報酬。仍須完成獨立樣本外驗證、夜盤與盤中風險及資料發布時點檢查。</w:t>
-      </w:r>
-    </w:p>
-    <w:p>
-      <w:r>
-        <w:t>三、資料來源與計算口徑</w:t>
-      </w:r>
-    </w:p>
-    <w:p>
-      <w:r>
-        <w:t>[1] 臺灣期貨交易所，臺股期貨契約規格：https://www.taifex.com.tw/cht/2/tX</w:t>
-        <w:br/>
-        <w:t>[2] 臺灣期貨交易所，三大法人交易資訊：https://www.taifex.com.tw/cht/3/futContractsDateView</w:t>
-        <w:br/>
-        <w:t>[3] 臺灣期貨交易所，費率表：https://www.taifex.com.tw/cht/4/feeSchedules</w:t>
-        <w:br/>
-        <w:t>歷史行情：https://www.taifex.com.tw/cht/3/dlFutDailyMarketView</w:t>
-        <w:br/>
-        <w:t>FinMind：https://finmind.github.io/tutor/TaiwanMarket/Derivative/</w:t>
-        <w:br/>
-        <w:t>加權指數：臺灣證券交易所每日市場成交資訊與發行量加權股價指數歷史資料，來源與雜湊見source_audits/taiex_sources.json。</w:t>
-      </w:r>
-    </w:p>
-    <w:p>
-      <w:r>
-        <w:t>Sharpe＝日報酬平均／日報酬樣本標準差×√252；Calmar＝CAGR／最大回撤比例。權益曲線以首日一口TX開盤名目價值起算，逐日累加淨損益，MDD取曲線相對歷史高點的最大跌幅；風險配平 benchmark 僅作同風險尺度診斷。</w:t>
+        <w:t>資料來源與口徑：期交所 www.taifex.com.tw [1] 契約規格 cht/2/tX、[2] 三大法人 cht/3/futContractsDateView、[3] 費率表 cht/4/feeSchedules、歷史行情 cht/3/dlFutDailyMarketView；FinMind finmind.github.io/tutor/TaiwanMarket/Derivative/；加權指數：證交所每日市場成交資訊，雜湊見source_audits/taiex_sources.json。Sharpe＝日報酬平均／樣本標準差×√252；Sortino以下方半變異；Calmar＝CAGR／MDD；VaR／ES為日淨報酬歷史5%分位與其條件平均；bootstrap為20日循環區塊重抽5,000次。</w:t>
       </w:r>
     </w:p>
     <w:sectPr>

</xml_diff>